<commit_message>
docs(continuation): Rev 17 — wave-1 streams (M/P/R/K) all landed; wave-2 (S/T/U) in flight
HEAD 7c95b763 -> 95d8328e (24 commits). Record the 5 wave-1 stream landings
(d463ec3e M shadcn-audit, f553104f K challenges-fix pointer, df2784ec R host-render
5->9 screens, 34f7dcf6 P 118->85 type errors, 95d8328e K brick-audit) — each
independently conductor-re-verified before commit (§11.4.142). §4 now: wave-1 landed,
wave-2 (S apply ota-manager shadcn fixes / T fix llms_verifier RED / U dashboard
screen-STATE) in flight, partitioned by buildable-project owner (§11.4.119). §5
follow-ups A2/B/F/H/I updated to their landed/in-flight status. Standing resumption
doc kept moment-valid (§12.10/§11.4.131); HTML+PDF+DOCX siblings.

Co-Authored-By: Claude Opus 4.8 (1M context) <noreply@anthropic.com>

Co-Authored-By: Claude Opus 4.8 (1M context) <noreply@anthropic.com>
</commit_message>
<xml_diff>
--- a/docs/CONTINUATION.docx
+++ b/docs/CONTINUATION.docx
@@ -26,7 +26,7 @@
         <w:t xml:space="preserve"> </w:t>
       </w:r>
       <w:r>
-        <w:t xml:space="preserve">16</w:t>
+        <w:t xml:space="preserve">17</w:t>
       </w:r>
       <w:r>
         <w:t xml:space="preserve"> </w:t>
@@ -42,7 +42,7 @@
         <w:t xml:space="preserve"> </w:t>
       </w:r>
       <w:r>
-        <w:t xml:space="preserve">2026-07-09T18:50:13Z</w:t>
+        <w:t xml:space="preserve">2026-07-09T19:09:33Z</w:t>
       </w:r>
     </w:p>
     <w:p>
@@ -125,13 +125,13 @@
               <w:rPr>
                 <w:rStyle w:val="VerbatimChar"/>
               </w:rPr>
-              <w:t xml:space="preserve">7c95b763</w:t>
+              <w:t xml:space="preserve">95d8328e</w:t>
             </w:r>
             <w:r>
               <w:t xml:space="preserve"> </w:t>
             </w:r>
             <w:r>
-              <w:t xml:space="preserve">— 18 commits this session, all pushed 4/4 FF §11.4.113. Through</w:t>
+              <w:t xml:space="preserve">— 24 commits this session, all pushed 4/4 FF §11.4.113. Through</w:t>
             </w:r>
             <w:r>
               <w:t xml:space="preserve"> </w:t>
@@ -421,7 +421,97 @@
               <w:t xml:space="preserve"> </w:t>
             </w:r>
             <w:r>
-              <w:t xml:space="preserve">readiness ledger Rev 2. Prior constitution-adoption HEAD</w:t>
+              <w:t xml:space="preserve">readiness ledger Rev 2 ·</w:t>
+            </w:r>
+            <w:r>
+              <w:t xml:space="preserve"> </w:t>
+            </w:r>
+            <w:r>
+              <w:rPr>
+                <w:rStyle w:val="VerbatimChar"/>
+              </w:rPr>
+              <w:t xml:space="preserve">d463ec3e</w:t>
+            </w:r>
+            <w:r>
+              <w:t xml:space="preserve"> </w:t>
+            </w:r>
+            <w:r>
+              <w:t xml:space="preserve">ota-manager shadcn WCAG audit (M) ·</w:t>
+            </w:r>
+            <w:r>
+              <w:t xml:space="preserve"> </w:t>
+            </w:r>
+            <w:r>
+              <w:rPr>
+                <w:rStyle w:val="VerbatimChar"/>
+              </w:rPr>
+              <w:t xml:space="preserve">f553104f</w:t>
+            </w:r>
+            <w:r>
+              <w:t xml:space="preserve"> </w:t>
+            </w:r>
+            <w:r>
+              <w:t xml:space="preserve">challenges pointer bump (K:</w:t>
+            </w:r>
+            <w:r>
+              <w:t xml:space="preserve"> </w:t>
+            </w:r>
+            <w:r>
+              <w:rPr>
+                <w:rStyle w:val="VerbatimChar"/>
+              </w:rPr>
+              <w:t xml:space="preserve">Result.RecordAction</w:t>
+            </w:r>
+            <w:r>
+              <w:t xml:space="preserve"> </w:t>
+            </w:r>
+            <w:r>
+              <w:t xml:space="preserve">race + chaos FAIL-bluff fixed, FF to brick remotes) ·</w:t>
+            </w:r>
+            <w:r>
+              <w:t xml:space="preserve"> </w:t>
+            </w:r>
+            <w:r>
+              <w:rPr>
+                <w:rStyle w:val="VerbatimChar"/>
+              </w:rPr>
+              <w:t xml:space="preserve">df2784ec</w:t>
+            </w:r>
+            <w:r>
+              <w:t xml:space="preserve"> </w:t>
+            </w:r>
+            <w:r>
+              <w:t xml:space="preserve">dashboard host-render 5→9 screens (R) ·</w:t>
+            </w:r>
+            <w:r>
+              <w:t xml:space="preserve"> </w:t>
+            </w:r>
+            <w:r>
+              <w:rPr>
+                <w:rStyle w:val="VerbatimChar"/>
+              </w:rPr>
+              <w:t xml:space="preserve">34f7dcf6</w:t>
+            </w:r>
+            <w:r>
+              <w:t xml:space="preserve"> </w:t>
+            </w:r>
+            <w:r>
+              <w:t xml:space="preserve">ota-manager 118→85 type errors, 33 router-independent fixed (P) ·</w:t>
+            </w:r>
+            <w:r>
+              <w:t xml:space="preserve"> </w:t>
+            </w:r>
+            <w:r>
+              <w:rPr>
+                <w:rStyle w:val="VerbatimChar"/>
+              </w:rPr>
+              <w:t xml:space="preserve">95d8328e</w:t>
+            </w:r>
+            <w:r>
+              <w:t xml:space="preserve"> </w:t>
+            </w:r>
+            <w:r>
+              <w:t xml:space="preserve">submodule-brick health audit (K). Prior constitution-adoption HEAD</w:t>
             </w:r>
             <w:r>
               <w:t xml:space="preserve"> </w:t>
@@ -8891,147 +8981,73 @@
           <w:b/>
           <w:bCs/>
         </w:rPr>
-        <w:t xml:space="preserve">Background agents (4 in flight at Rev 16):</w:t>
-      </w:r>
-      <w:r>
-        <w:t xml:space="preserve"> </w:t>
-      </w:r>
-      <w:r>
-        <w:rPr>
-          <w:b/>
-          <w:bCs/>
-        </w:rPr>
-        <w:t xml:space="preserve">M</w:t>
-      </w:r>
-      <w:r>
-        <w:t xml:space="preserve"> </w:t>
-      </w:r>
-      <w:r>
-        <w:t xml:space="preserve">ota-manager shadcn-</w:t>
-      </w:r>
-      <w:r>
-        <w:rPr>
-          <w:rStyle w:val="VerbatimChar"/>
-        </w:rPr>
-        <w:t xml:space="preserve">:root</w:t>
-      </w:r>
-      <w:r>
-        <w:t xml:space="preserve">-palette WCAG audit (read-only →</w:t>
-      </w:r>
-      <w:r>
-        <w:t xml:space="preserve"> </w:t>
-      </w:r>
-      <w:r>
-        <w:rPr>
-          <w:rStyle w:val="VerbatimChar"/>
-        </w:rPr>
-        <w:t xml:space="preserve">docs/research/ota_manager_shadcn_contrast_audit_20260709/</w:t>
-      </w:r>
-      <w:r>
-        <w:t xml:space="preserve">);</w:t>
-      </w:r>
-      <w:r>
-        <w:t xml:space="preserve"> </w:t>
-      </w:r>
-      <w:r>
-        <w:rPr>
-          <w:b/>
-          <w:bCs/>
-        </w:rPr>
-        <w:t xml:space="preserve">P</w:t>
-      </w:r>
-      <w:r>
-        <w:t xml:space="preserve"> </w:t>
-      </w:r>
-      <w:r>
-        <w:t xml:space="preserve">ota-manager 118-type-error triage + fix router-independent subset (owns ota-manager build);</w:t>
-      </w:r>
-      <w:r>
-        <w:t xml:space="preserve"> </w:t>
-      </w:r>
-      <w:r>
-        <w:rPr>
-          <w:b/>
-          <w:bCs/>
-        </w:rPr>
-        <w:t xml:space="preserve">R</w:t>
-      </w:r>
-      <w:r>
-        <w:t xml:space="preserve"> </w:t>
-      </w:r>
-      <w:r>
-        <w:t xml:space="preserve">dashboard host-render matrix expand to Deployments/Fleet/Groups/Overview (owns dashboard build);</w:t>
-      </w:r>
-      <w:r>
-        <w:t xml:space="preserve"> </w:t>
-      </w:r>
-      <w:r>
-        <w:rPr>
-          <w:b/>
-          <w:bCs/>
-        </w:rPr>
-        <w:t xml:space="preserve">K</w:t>
-      </w:r>
-      <w:r>
-        <w:t xml:space="preserve"> </w:t>
-      </w:r>
-      <w:r>
-        <w:t xml:space="preserve">submodule-brick health audit —</w:t>
-      </w:r>
-      <w:r>
-        <w:t xml:space="preserve"> </w:t>
-      </w:r>
-      <w:r>
-        <w:rPr>
-          <w:b/>
-          <w:bCs/>
-        </w:rPr>
-        <w:t xml:space="preserve">DONE</w:t>
-      </w:r>
-      <w:r>
-        <w:t xml:space="preserve">, awaiting conductor review+commit of its</w:t>
-      </w:r>
-      <w:r>
-        <w:t xml:space="preserve"> </w:t>
-      </w:r>
-      <w:r>
-        <w:rPr>
-          <w:rStyle w:val="VerbatimChar"/>
-        </w:rPr>
-        <w:t xml:space="preserve">challenges</w:t>
-      </w:r>
-      <w:r>
-        <w:t xml:space="preserve"> </w:t>
-      </w:r>
-      <w:r>
-        <w:t xml:space="preserve">fix (real</w:t>
-      </w:r>
-      <w:r>
-        <w:t xml:space="preserve"> </w:t>
-      </w:r>
-      <w:r>
-        <w:rPr>
-          <w:rStyle w:val="VerbatimChar"/>
-        </w:rPr>
-        <w:t xml:space="preserve">Result.RecordAction</w:t>
-      </w:r>
-      <w:r>
-        <w:t xml:space="preserve"> </w:t>
-      </w:r>
-      <w:r>
-        <w:t xml:space="preserve">race + chaos-test FAIL-bluff;</w:t>
-      </w:r>
-      <w:r>
-        <w:t xml:space="preserve"> </w:t>
-      </w:r>
-      <w:r>
-        <w:rPr>
-          <w:rStyle w:val="VerbatimChar"/>
-        </w:rPr>
-        <w:t xml:space="preserve">docs/research/submodules_health_audit_20260709/AUDIT.md</w:t>
-      </w:r>
-      <w:r>
-        <w:t xml:space="preserve">). Each produces evidence only; conductor reviews + commits (subagent-driven §11.4.70; no subagent git ops §11.4.84).</w:t>
+        <w:t xml:space="preserve">Wave-1 streams (M/P/R/K) — ALL LANDED + reviewed + committed</w:t>
+      </w:r>
+      <w:r>
+        <w:t xml:space="preserve"> </w:t>
+      </w:r>
+      <w:r>
+        <w:t xml:space="preserve">(</w:t>
+      </w:r>
+      <w:r>
+        <w:rPr>
+          <w:rStyle w:val="VerbatimChar"/>
+        </w:rPr>
+        <w:t xml:space="preserve">d463ec3e</w:t>
+      </w:r>
+      <w:r>
+        <w:t xml:space="preserve">/</w:t>
+      </w:r>
+      <w:r>
+        <w:rPr>
+          <w:rStyle w:val="VerbatimChar"/>
+        </w:rPr>
+        <w:t xml:space="preserve">34f7dcf6</w:t>
+      </w:r>
+      <w:r>
+        <w:t xml:space="preserve">/</w:t>
+      </w:r>
+      <w:r>
+        <w:rPr>
+          <w:rStyle w:val="VerbatimChar"/>
+        </w:rPr>
+        <w:t xml:space="preserve">df2784ec</w:t>
+      </w:r>
+      <w:r>
+        <w:t xml:space="preserve">/</w:t>
+      </w:r>
+      <w:r>
+        <w:rPr>
+          <w:rStyle w:val="VerbatimChar"/>
+        </w:rPr>
+        <w:t xml:space="preserve">f553104f</w:t>
+      </w:r>
+      <w:r>
+        <w:t xml:space="preserve">+</w:t>
+      </w:r>
+      <w:r>
+        <w:rPr>
+          <w:rStyle w:val="VerbatimChar"/>
+        </w:rPr>
+        <w:t xml:space="preserve">95d8328e</w:t>
+      </w:r>
+      <w:r>
+        <w:t xml:space="preserve">), each independently re-verified by the conductor before commit (§11.4.142): M’s ratios genuine, P’s 85-count re-run, R’s 81/81 re-run + oracle-broadening reviewed sound, K’s challenges fix green under</w:t>
+      </w:r>
+      <w:r>
+        <w:t xml:space="preserve"> </w:t>
+      </w:r>
+      <w:r>
+        <w:rPr>
+          <w:rStyle w:val="VerbatimChar"/>
+        </w:rPr>
+        <w:t xml:space="preserve">-race -count=5</w:t>
+      </w:r>
+      <w:r>
+        <w:t xml:space="preserve"> </w:t>
+      </w:r>
+      <w:r>
+        <w:t xml:space="preserve">+ FF-pushed to the brick’s remotes.</w:t>
       </w:r>
     </w:p>
     <w:p>
@@ -9047,6 +9063,85 @@
           <w:b/>
           <w:bCs/>
         </w:rPr>
+        <w:t xml:space="preserve">Wave-2 streams (3 in flight at Rev 17, partitioned by buildable-project owner §11.4.119):</w:t>
+      </w:r>
+      <w:r>
+        <w:t xml:space="preserve"> </w:t>
+      </w:r>
+      <w:r>
+        <w:rPr>
+          <w:b/>
+          <w:bCs/>
+        </w:rPr>
+        <w:t xml:space="preserve">S</w:t>
+      </w:r>
+      <w:r>
+        <w:t xml:space="preserve"> </w:t>
+      </w:r>
+      <w:r>
+        <w:t xml:space="preserve">apply M’s ota-manager shadcn AA contrast fixes → re-prove via ota-manager host-render (owns ota-manager build);</w:t>
+      </w:r>
+      <w:r>
+        <w:t xml:space="preserve"> </w:t>
+      </w:r>
+      <w:r>
+        <w:rPr>
+          <w:b/>
+          <w:bCs/>
+        </w:rPr>
+        <w:t xml:space="preserve">T</w:t>
+      </w:r>
+      <w:r>
+        <w:t xml:space="preserve"> </w:t>
+      </w:r>
+      <w:r>
+        <w:t xml:space="preserve">root-cause + fix the</w:t>
+      </w:r>
+      <w:r>
+        <w:t xml:space="preserve"> </w:t>
+      </w:r>
+      <w:r>
+        <w:rPr>
+          <w:rStyle w:val="VerbatimChar"/>
+        </w:rPr>
+        <w:t xml:space="preserve">llms_verifier/llm-verifier</w:t>
+      </w:r>
+      <w:r>
+        <w:t xml:space="preserve"> </w:t>
+      </w:r>
+      <w:r>
+        <w:t xml:space="preserve">2 RED CLI tests (submodule; conductor commits per §11.4.113);</w:t>
+      </w:r>
+      <w:r>
+        <w:t xml:space="preserve"> </w:t>
+      </w:r>
+      <w:r>
+        <w:rPr>
+          <w:b/>
+          <w:bCs/>
+        </w:rPr>
+        <w:t xml:space="preserve">U</w:t>
+      </w:r>
+      <w:r>
+        <w:t xml:space="preserve"> </w:t>
+      </w:r>
+      <w:r>
+        <w:t xml:space="preserve">dashboard screen×STATE host-render — prove empty + error states for 2 core screens ×{light,dark} (owns dashboard build). Evidence only; conductor reviews + commits (no subagent git ops §11.4.84).</w:t>
+      </w:r>
+    </w:p>
+    <w:p>
+      <w:pPr>
+        <w:pStyle w:val="Compact"/>
+        <w:numPr>
+          <w:ilvl w:val="0"/>
+          <w:numId w:val="1008"/>
+        </w:numPr>
+      </w:pPr>
+      <w:r>
+        <w:rPr>
+          <w:b/>
+          <w:bCs/>
+        </w:rPr>
         <w:t xml:space="preserve">Recording directory:</w:t>
       </w:r>
       <w:r>
@@ -9356,7 +9451,47 @@
         <w:t xml:space="preserve"> </w:t>
       </w:r>
       <w:r>
-        <w:t xml:space="preserve">is auditing this now (compute real ratios → propose AA tones → re-prove via ota-manager host-render). Residual: light</w:t>
+        <w:t xml:space="preserve">audit DONE (</w:t>
+      </w:r>
+      <w:r>
+        <w:rPr>
+          <w:rStyle w:val="VerbatimChar"/>
+        </w:rPr>
+        <w:t xml:space="preserve">d463ec3e</w:t>
+      </w:r>
+      <w:r>
+        <w:t xml:space="preserve">): 38 pairs checked, 10 UI-boundary (SC 1.4.11) fails, 0 text fails, same-hue fixes proposed. Stream</w:t>
+      </w:r>
+      <w:r>
+        <w:t xml:space="preserve"> </w:t>
+      </w:r>
+      <w:r>
+        <w:rPr>
+          <w:b/>
+          <w:bCs/>
+        </w:rPr>
+        <w:t xml:space="preserve">S</w:t>
+      </w:r>
+      <w:r>
+        <w:t xml:space="preserve"> </w:t>
+      </w:r>
+      <w:r>
+        <w:t xml:space="preserve">in flight APPLYING those fixes to</w:t>
+      </w:r>
+      <w:r>
+        <w:t xml:space="preserve"> </w:t>
+      </w:r>
+      <w:r>
+        <w:rPr>
+          <w:rStyle w:val="VerbatimChar"/>
+        </w:rPr>
+        <w:t xml:space="preserve">clients/ota-manager/src/index.css</w:t>
+      </w:r>
+      <w:r>
+        <w:t xml:space="preserve"> </w:t>
+      </w:r>
+      <w:r>
+        <w:t xml:space="preserve">+ re-proving via ota-manager host-render. Residual: light</w:t>
       </w:r>
       <w:r>
         <w:t xml:space="preserve"> </w:t>
@@ -9396,38 +9531,100 @@
           <w:b/>
           <w:bCs/>
         </w:rPr>
-        <w:t xml:space="preserve">ota-manager 118 type errors</w:t>
-      </w:r>
-      <w:r>
-        <w:t xml:space="preserve"> </w:t>
-      </w:r>
-      <w:r>
-        <w:t xml:space="preserve">surfaced by the functional gate (</w:t>
-      </w:r>
-      <w:r>
-        <w:rPr>
-          <w:rStyle w:val="VerbatimChar"/>
-        </w:rPr>
-        <w:t xml:space="preserve">94fb10a2</w:t>
-      </w:r>
-      <w:r>
-        <w:t xml:space="preserve">). Stream</w:t>
-      </w:r>
-      <w:r>
-        <w:t xml:space="preserve"> </w:t>
-      </w:r>
-      <w:r>
-        <w:rPr>
-          <w:b/>
-          <w:bCs/>
-        </w:rPr>
-        <w:t xml:space="preserve">P</w:t>
-      </w:r>
-      <w:r>
-        <w:t xml:space="preserve"> </w:t>
-      </w:r>
-      <w:r>
-        <w:t xml:space="preserve">in flight: triaging into router-dependent (leave for C) vs independent (fix now). ~57 are on the dead unrouted feature pages (bundle with C).</w:t>
+        <w:t xml:space="preserve">ota-manager type errors — Stream P DONE (</w:t>
+      </w:r>
+      <w:r>
+        <w:rPr>
+          <w:rStyle w:val="VerbatimChar"/>
+          <w:b/>
+          <w:bCs/>
+        </w:rPr>
+        <w:t xml:space="preserve">34f7dcf6</w:t>
+      </w:r>
+      <w:r>
+        <w:rPr>
+          <w:b/>
+          <w:bCs/>
+        </w:rPr>
+        <w:t xml:space="preserve">): 118 → 85.</w:t>
+      </w:r>
+      <w:r>
+        <w:t xml:space="preserve"> </w:t>
+      </w:r>
+      <w:r>
+        <w:t xml:space="preserve">33 router-independent genuine bugs fixed (root cause: a</w:t>
+      </w:r>
+      <w:r>
+        <w:t xml:space="preserve"> </w:t>
+      </w:r>
+      <w:r>
+        <w:rPr>
+          <w:rStyle w:val="VerbatimChar"/>
+        </w:rPr>
+        <w:t xml:space="preserve">types/api.ts</w:t>
+      </w:r>
+      <w:r>
+        <w:t xml:space="preserve"> </w:t>
+      </w:r>
+      <w:r>
+        <w:t xml:space="preserve">re-export gap + real cache-key bugs verified against the Go server contract). The 85 remaining are ALL confined to the operator-gated router/unrouted-page cluster (</w:t>
+      </w:r>
+      <w:r>
+        <w:rPr>
+          <w:rStyle w:val="VerbatimChar"/>
+        </w:rPr>
+        <w:t xml:space="preserve">routes/index.tsx</w:t>
+      </w:r>
+      <w:r>
+        <w:t xml:space="preserve">,</w:t>
+      </w:r>
+      <w:r>
+        <w:t xml:space="preserve"> </w:t>
+      </w:r>
+      <w:r>
+        <w:rPr>
+          <w:rStyle w:val="VerbatimChar"/>
+        </w:rPr>
+        <w:t xml:space="preserve">*-page.tsx</w:t>
+      </w:r>
+      <w:r>
+        <w:t xml:space="preserve">,</w:t>
+      </w:r>
+      <w:r>
+        <w:t xml:space="preserve"> </w:t>
+      </w:r>
+      <w:r>
+        <w:rPr>
+          <w:rStyle w:val="VerbatimChar"/>
+        </w:rPr>
+        <w:t xml:space="preserve">app-layout</w:t>
+      </w:r>
+      <w:r>
+        <w:t xml:space="preserve">/</w:t>
+      </w:r>
+      <w:r>
+        <w:rPr>
+          <w:rStyle w:val="VerbatimChar"/>
+        </w:rPr>
+        <w:t xml:space="preserve">sidebar</w:t>
+      </w:r>
+      <w:r>
+        <w:t xml:space="preserve"> </w:t>
+      </w:r>
+      <w:r>
+        <w:t xml:space="preserve">react-router-dom shapes) — they await the tanstack-router reconciliation (item C). Evidence:</w:t>
+      </w:r>
+      <w:r>
+        <w:t xml:space="preserve"> </w:t>
+      </w:r>
+      <w:r>
+        <w:rPr>
+          <w:rStyle w:val="VerbatimChar"/>
+        </w:rPr>
+        <w:t xml:space="preserve">docs/qa/20260709-ota-manager-typecheck-triage/</w:t>
+      </w:r>
+      <w:r>
+        <w:t xml:space="preserve">.</w:t>
       </w:r>
       <w:r>
         <w:t xml:space="preserve"> </w:t>
@@ -9681,7 +9878,48 @@
         <w:t xml:space="preserve"> </w:t>
       </w:r>
       <w:r>
-        <w:t xml:space="preserve">in flight for dashboard (adding Deployments/Fleet/Groups/Overview to the existing 5). ota-manager still owes its matrix beyond LoginPage (unrouted pages + 118 type errors block it; bundle after B/C).</w:t>
+        <w:t xml:space="preserve">DONE (</w:t>
+      </w:r>
+      <w:r>
+        <w:rPr>
+          <w:rStyle w:val="VerbatimChar"/>
+        </w:rPr>
+        <w:t xml:space="preserve">df2784ec</w:t>
+      </w:r>
+      <w:r>
+        <w:t xml:space="preserve">): dashboard now proves</w:t>
+      </w:r>
+      <w:r>
+        <w:t xml:space="preserve"> </w:t>
+      </w:r>
+      <w:r>
+        <w:rPr>
+          <w:b/>
+          <w:bCs/>
+        </w:rPr>
+        <w:t xml:space="preserve">9</w:t>
+      </w:r>
+      <w:r>
+        <w:t xml:space="preserve"> </w:t>
+      </w:r>
+      <w:r>
+        <w:t xml:space="preserve">screens ×{light,dark} (added Deployments/Fleet/Groups/Overview; 45→81 host-render pass; found+fixed a real layout-oracle substring bug). Stream</w:t>
+      </w:r>
+      <w:r>
+        <w:t xml:space="preserve"> </w:t>
+      </w:r>
+      <w:r>
+        <w:rPr>
+          <w:b/>
+          <w:bCs/>
+        </w:rPr>
+        <w:t xml:space="preserve">U</w:t>
+      </w:r>
+      <w:r>
+        <w:t xml:space="preserve"> </w:t>
+      </w:r>
+      <w:r>
+        <w:t xml:space="preserve">in flight adding empty+error STATE variations for 2 core dashboard screens (screen×STATE×theme). ota-manager still owes its matrix beyond LoginPage (unrouted pages + 85 router-cluster errors block it; bundle after C).</w:t>
       </w:r>
       <w:r>
         <w:t xml:space="preserve"> </w:t>
@@ -9782,7 +10020,22 @@
           <w:b/>
           <w:bCs/>
         </w:rPr>
-        <w:t xml:space="preserve">brick fix — DONE by K, pending conductor submodule-commit.</w:t>
+        <w:t xml:space="preserve">brick fix — DONE + committed (</w:t>
+      </w:r>
+      <w:r>
+        <w:rPr>
+          <w:rStyle w:val="VerbatimChar"/>
+          <w:b/>
+          <w:bCs/>
+        </w:rPr>
+        <w:t xml:space="preserve">f553104f</w:t>
+      </w:r>
+      <w:r>
+        <w:rPr>
+          <w:b/>
+          <w:bCs/>
+        </w:rPr>
+        <w:t xml:space="preserve">).</w:t>
       </w:r>
       <w:r>
         <w:t xml:space="preserve"> </w:t>
@@ -9851,7 +10104,7 @@
         <w:t xml:space="preserve"> </w:t>
       </w:r>
       <w:r>
-        <w:t xml:space="preserve">PASS, full brick</w:t>
+        <w:t xml:space="preserve">PASS, brick</w:t>
       </w:r>
       <w:r>
         <w:t xml:space="preserve"> </w:t>
@@ -9866,7 +10119,22 @@
         <w:t xml:space="preserve"> </w:t>
       </w:r>
       <w:r>
-        <w:t xml:space="preserve">rc=0. Commit inside the submodule → push to its 4 upstreams (FF §11.4.113) → bump parent pointer.</w:t>
+        <w:t xml:space="preserve">rc=0; FF-pushed to the brick’s remotes (0-ahead/0-behind everywhere), parent pointer bumped to</w:t>
+      </w:r>
+      <w:r>
+        <w:t xml:space="preserve"> </w:t>
+      </w:r>
+      <w:r>
+        <w:rPr>
+          <w:rStyle w:val="VerbatimChar"/>
+        </w:rPr>
+        <w:t xml:space="preserve">5bac429</w:t>
+      </w:r>
+      <w:r>
+        <w:t xml:space="preserve"> </w:t>
+      </w:r>
+      <w:r>
+        <w:t xml:space="preserve">(also integrated the brick’s 3 upstream commits).</w:t>
       </w:r>
       <w:r>
         <w:t xml:space="preserve"> </w:t>
@@ -9897,7 +10165,7 @@
           <w:b/>
           <w:bCs/>
         </w:rPr>
-        <w:t xml:space="preserve">RED (pre-existing).</w:t>
+        <w:t xml:space="preserve">RED (pre-existing) — Stream T in flight.</w:t>
       </w:r>
       <w:r>
         <w:t xml:space="preserve"> </w:t>
@@ -9927,7 +10195,7 @@
         <w:t xml:space="preserve"> </w:t>
       </w:r>
       <w:r>
-        <w:t xml:space="preserve">fail (build/vet green → CLI-contract/behavioral mismatch). Dedicated systematic-debug pass (§11.4.102).</w:t>
+        <w:t xml:space="preserve">fail (build/vet green → CLI-contract/behavioral mismatch). Systematic-debug (§11.4.102) to root-cause test-vs-product then fix; conductor commits the submodule + bumps pointer.</w:t>
       </w:r>
       <w:r>
         <w:t xml:space="preserve"> </w:t>

</xml_diff>

<commit_message>
docs(continuation): Rev 18 — wave-2 (S/T/U/V) all landed; wave-3 (W/Y) in flight + server-gap queue
HEAD 95d8328e -> ca3860d8 (29 commits). Record wave-2 landings: A2 CLOSED for UI
boundaries (S ota-manager shadcn AA, rounding-trap caught), dashboard screen×STATE
empty+error (U 81→117), llms_verifier RED = foreign-TLS-port §11.4.3 SKIP + 11-behind
integrated (T), server §11.4.169 coverage audit (V). §4 wave-3 W (server memory+fuzz
gaps) / Y (ota-manager Dashboard host-render) in flight. §5: A2/I marked done; added
server-gap follow-ups L/M2/N/O/P/Q from V's audit (memory+fuzz in flight, Postgres
integration unexecuted, benchmark baseline, security-headers, aborted security run,
DDoS default). Standing resumption doc moment-valid (§12.10/§11.4.131); siblings synced.

Co-Authored-By: Claude Opus 4.8 (1M context) <noreply@anthropic.com>

Co-Authored-By: Claude Opus 4.8 (1M context) <noreply@anthropic.com>
</commit_message>
<xml_diff>
--- a/docs/CONTINUATION.docx
+++ b/docs/CONTINUATION.docx
@@ -26,7 +26,7 @@
         <w:t xml:space="preserve"> </w:t>
       </w:r>
       <w:r>
-        <w:t xml:space="preserve">17</w:t>
+        <w:t xml:space="preserve">18</w:t>
       </w:r>
       <w:r>
         <w:t xml:space="preserve"> </w:t>
@@ -42,7 +42,7 @@
         <w:t xml:space="preserve"> </w:t>
       </w:r>
       <w:r>
-        <w:t xml:space="preserve">2026-07-09T19:09:33Z</w:t>
+        <w:t xml:space="preserve">2026-07-09T19:26:31Z</w:t>
       </w:r>
     </w:p>
     <w:p>
@@ -125,13 +125,83 @@
               <w:rPr>
                 <w:rStyle w:val="VerbatimChar"/>
               </w:rPr>
-              <w:t xml:space="preserve">95d8328e</w:t>
+              <w:t xml:space="preserve">ca3860d8</w:t>
             </w:r>
             <w:r>
               <w:t xml:space="preserve"> </w:t>
             </w:r>
             <w:r>
-              <w:t xml:space="preserve">— 24 commits this session, all pushed 4/4 FF §11.4.113. Through</w:t>
+              <w:t xml:space="preserve">— 29 commits this session, all pushed 4/4 FF §11.4.113.</w:t>
+            </w:r>
+            <w:r>
+              <w:t xml:space="preserve"> </w:t>
+            </w:r>
+            <w:r>
+              <w:rPr>
+                <w:b/>
+                <w:bCs/>
+              </w:rPr>
+              <w:t xml:space="preserve">Wave-2 (S/T/U/V) all landed:</w:t>
+            </w:r>
+            <w:r>
+              <w:t xml:space="preserve"> </w:t>
+            </w:r>
+            <w:r>
+              <w:rPr>
+                <w:rStyle w:val="VerbatimChar"/>
+              </w:rPr>
+              <w:t xml:space="preserve">a8c12d9a</w:t>
+            </w:r>
+            <w:r>
+              <w:t xml:space="preserve"> </w:t>
+            </w:r>
+            <w:r>
+              <w:t xml:space="preserve">ota-manager shadcn AA fix (S — closes A2; S caught a rounding trap in M’s audit, used precise values, 38/38 verified) ·</w:t>
+            </w:r>
+            <w:r>
+              <w:t xml:space="preserve"> </w:t>
+            </w:r>
+            <w:r>
+              <w:rPr>
+                <w:rStyle w:val="VerbatimChar"/>
+              </w:rPr>
+              <w:t xml:space="preserve">870ca9ff</w:t>
+            </w:r>
+            <w:r>
+              <w:t xml:space="preserve"> </w:t>
+            </w:r>
+            <w:r>
+              <w:t xml:space="preserve">dashboard screen×STATE empty+error for Releases/Fleet (U — 81→117) ·</w:t>
+            </w:r>
+            <w:r>
+              <w:t xml:space="preserve"> </w:t>
+            </w:r>
+            <w:r>
+              <w:rPr>
+                <w:rStyle w:val="VerbatimChar"/>
+              </w:rPr>
+              <w:t xml:space="preserve">5a3e036a</w:t>
+            </w:r>
+            <w:r>
+              <w:t xml:space="preserve"> </w:t>
+            </w:r>
+            <w:r>
+              <w:t xml:space="preserve">llms_verifier pointer bump (T — RED tests were a foreign-TLS-on-port-8080 §11.4.3 SKIP condition, test-side fix + 11 upstream commits integrated) ·</w:t>
+            </w:r>
+            <w:r>
+              <w:t xml:space="preserve"> </w:t>
+            </w:r>
+            <w:r>
+              <w:rPr>
+                <w:rStyle w:val="VerbatimChar"/>
+              </w:rPr>
+              <w:t xml:space="preserve">ca3860d8</w:t>
+            </w:r>
+            <w:r>
+              <w:t xml:space="preserve"> </w:t>
+            </w:r>
+            <w:r>
+              <w:t xml:space="preserve">server §11.4.169 coverage audit (V). Through</w:t>
             </w:r>
             <w:r>
               <w:t xml:space="preserve"> </w:t>
@@ -9063,70 +9133,49 @@
           <w:b/>
           <w:bCs/>
         </w:rPr>
-        <w:t xml:space="preserve">Wave-2 streams (3 in flight at Rev 17, partitioned by buildable-project owner §11.4.119):</w:t>
-      </w:r>
-      <w:r>
-        <w:t xml:space="preserve"> </w:t>
-      </w:r>
-      <w:r>
-        <w:rPr>
-          <w:b/>
-          <w:bCs/>
-        </w:rPr>
-        <w:t xml:space="preserve">S</w:t>
-      </w:r>
-      <w:r>
-        <w:t xml:space="preserve"> </w:t>
-      </w:r>
-      <w:r>
-        <w:t xml:space="preserve">apply M’s ota-manager shadcn AA contrast fixes → re-prove via ota-manager host-render (owns ota-manager build);</w:t>
-      </w:r>
-      <w:r>
-        <w:t xml:space="preserve"> </w:t>
-      </w:r>
-      <w:r>
-        <w:rPr>
-          <w:b/>
-          <w:bCs/>
-        </w:rPr>
-        <w:t xml:space="preserve">T</w:t>
-      </w:r>
-      <w:r>
-        <w:t xml:space="preserve"> </w:t>
-      </w:r>
-      <w:r>
-        <w:t xml:space="preserve">root-cause + fix the</w:t>
-      </w:r>
-      <w:r>
-        <w:t xml:space="preserve"> </w:t>
-      </w:r>
-      <w:r>
-        <w:rPr>
-          <w:rStyle w:val="VerbatimChar"/>
-        </w:rPr>
-        <w:t xml:space="preserve">llms_verifier/llm-verifier</w:t>
-      </w:r>
-      <w:r>
-        <w:t xml:space="preserve"> </w:t>
-      </w:r>
-      <w:r>
-        <w:t xml:space="preserve">2 RED CLI tests (submodule; conductor commits per §11.4.113);</w:t>
-      </w:r>
-      <w:r>
-        <w:t xml:space="preserve"> </w:t>
-      </w:r>
-      <w:r>
-        <w:rPr>
-          <w:b/>
-          <w:bCs/>
-        </w:rPr>
-        <w:t xml:space="preserve">U</w:t>
-      </w:r>
-      <w:r>
-        <w:t xml:space="preserve"> </w:t>
-      </w:r>
-      <w:r>
-        <w:t xml:space="preserve">dashboard screen×STATE host-render — prove empty + error states for 2 core screens ×{light,dark} (owns dashboard build). Evidence only; conductor reviews + commits (no subagent git ops §11.4.84).</w:t>
+        <w:t xml:space="preserve">Wave-2 streams (S/T/U/V) — ALL LANDED + reviewed + committed</w:t>
+      </w:r>
+      <w:r>
+        <w:t xml:space="preserve"> </w:t>
+      </w:r>
+      <w:r>
+        <w:t xml:space="preserve">(</w:t>
+      </w:r>
+      <w:r>
+        <w:rPr>
+          <w:rStyle w:val="VerbatimChar"/>
+        </w:rPr>
+        <w:t xml:space="preserve">a8c12d9a</w:t>
+      </w:r>
+      <w:r>
+        <w:t xml:space="preserve">/</w:t>
+      </w:r>
+      <w:r>
+        <w:rPr>
+          <w:rStyle w:val="VerbatimChar"/>
+        </w:rPr>
+        <w:t xml:space="preserve">5a3e036a</w:t>
+      </w:r>
+      <w:r>
+        <w:t xml:space="preserve">/</w:t>
+      </w:r>
+      <w:r>
+        <w:rPr>
+          <w:rStyle w:val="VerbatimChar"/>
+        </w:rPr>
+        <w:t xml:space="preserve">870ca9ff</w:t>
+      </w:r>
+      <w:r>
+        <w:t xml:space="preserve">/</w:t>
+      </w:r>
+      <w:r>
+        <w:rPr>
+          <w:rStyle w:val="VerbatimChar"/>
+        </w:rPr>
+        <w:t xml:space="preserve">ca3860d8</w:t>
+      </w:r>
+      <w:r>
+        <w:t xml:space="preserve">), each conductor-re-verified (§11.4.142): S’s ratios re-run 38/38 + rounding-trap caught, T’s tests re-run SKIP-OK + submodule integrated 11-behind→FF-pushed, U’s 117/117 re-run, V’s audit real captured suite.</w:t>
       </w:r>
     </w:p>
     <w:p>
@@ -9142,6 +9191,69 @@
           <w:b/>
           <w:bCs/>
         </w:rPr>
+        <w:t xml:space="preserve">Wave-3 streams (2 in flight at Rev 18):</w:t>
+      </w:r>
+      <w:r>
+        <w:t xml:space="preserve"> </w:t>
+      </w:r>
+      <w:r>
+        <w:rPr>
+          <w:b/>
+          <w:bCs/>
+        </w:rPr>
+        <w:t xml:space="preserve">W</w:t>
+      </w:r>
+      <w:r>
+        <w:t xml:space="preserve"> </w:t>
+      </w:r>
+      <w:r>
+        <w:t xml:space="preserve">close V’s top server §11.4.169 gaps — memory/heap-growth assertion for core handlers + a native Go Fuzz target (test-only, owns server build);</w:t>
+      </w:r>
+      <w:r>
+        <w:t xml:space="preserve"> </w:t>
+      </w:r>
+      <w:r>
+        <w:rPr>
+          <w:b/>
+          <w:bCs/>
+        </w:rPr>
+        <w:t xml:space="preserve">Y</w:t>
+      </w:r>
+      <w:r>
+        <w:t xml:space="preserve"> </w:t>
+      </w:r>
+      <w:r>
+        <w:t xml:space="preserve">extend ota-manager §11.4.170 host-render beyond LoginPage to the shipped</w:t>
+      </w:r>
+      <w:r>
+        <w:t xml:space="preserve"> </w:t>
+      </w:r>
+      <w:r>
+        <w:rPr>
+          <w:rStyle w:val="VerbatimChar"/>
+        </w:rPr>
+        <w:t xml:space="preserve">/dashboard</w:t>
+      </w:r>
+      <w:r>
+        <w:t xml:space="preserve"> </w:t>
+      </w:r>
+      <w:r>
+        <w:t xml:space="preserve">screen ×{light,dark}, with honest §11.4.3 SKIP-with-reason if it’s too coupled to render (owns ota-manager build). Evidence only; conductor reviews + commits.</w:t>
+      </w:r>
+    </w:p>
+    <w:p>
+      <w:pPr>
+        <w:pStyle w:val="Compact"/>
+        <w:numPr>
+          <w:ilvl w:val="0"/>
+          <w:numId w:val="1008"/>
+        </w:numPr>
+      </w:pPr>
+      <w:r>
+        <w:rPr>
+          <w:b/>
+          <w:bCs/>
+        </w:rPr>
         <w:t xml:space="preserve">Recording directory:</w:t>
       </w:r>
       <w:r>
@@ -9476,22 +9588,86 @@
         <w:t xml:space="preserve"> </w:t>
       </w:r>
       <w:r>
-        <w:t xml:space="preserve">in flight APPLYING those fixes to</w:t>
-      </w:r>
-      <w:r>
-        <w:t xml:space="preserve"> </w:t>
-      </w:r>
-      <w:r>
-        <w:rPr>
-          <w:rStyle w:val="VerbatimChar"/>
-        </w:rPr>
-        <w:t xml:space="preserve">clients/ota-manager/src/index.css</w:t>
-      </w:r>
-      <w:r>
-        <w:t xml:space="preserve"> </w:t>
-      </w:r>
-      <w:r>
-        <w:t xml:space="preserve">+ re-proving via ota-manager host-render. Residual: light</w:t>
+        <w:t xml:space="preserve">DONE (</w:t>
+      </w:r>
+      <w:r>
+        <w:rPr>
+          <w:rStyle w:val="VerbatimChar"/>
+        </w:rPr>
+        <w:t xml:space="preserve">a8c12d9a</w:t>
+      </w:r>
+      <w:r>
+        <w:t xml:space="preserve">) —</w:t>
+      </w:r>
+      <w:r>
+        <w:t xml:space="preserve"> </w:t>
+      </w:r>
+      <w:r>
+        <w:rPr>
+          <w:b/>
+          <w:bCs/>
+        </w:rPr>
+        <w:t xml:space="preserve">A2 CLOSED for UI boundaries</w:t>
+      </w:r>
+      <w:r>
+        <w:t xml:space="preserve">: applied same-hue AA fixes to</w:t>
+      </w:r>
+      <w:r>
+        <w:t xml:space="preserve"> </w:t>
+      </w:r>
+      <w:r>
+        <w:rPr>
+          <w:rStyle w:val="VerbatimChar"/>
+        </w:rPr>
+        <w:t xml:space="preserve">--border</w:t>
+      </w:r>
+      <w:r>
+        <w:t xml:space="preserve">/</w:t>
+      </w:r>
+      <w:r>
+        <w:rPr>
+          <w:rStyle w:val="VerbatimChar"/>
+        </w:rPr>
+        <w:t xml:space="preserve">--input</w:t>
+      </w:r>
+      <w:r>
+        <w:t xml:space="preserve">/</w:t>
+      </w:r>
+      <w:r>
+        <w:rPr>
+          <w:rStyle w:val="VerbatimChar"/>
+        </w:rPr>
+        <w:t xml:space="preserve">--ring</w:t>
+      </w:r>
+      <w:r>
+        <w:t xml:space="preserve">/</w:t>
+      </w:r>
+      <w:r>
+        <w:rPr>
+          <w:rStyle w:val="VerbatimChar"/>
+        </w:rPr>
+        <w:t xml:space="preserve">--sidebar-border</w:t>
+      </w:r>
+      <w:r>
+        <w:t xml:space="preserve"> </w:t>
+      </w:r>
+      <w:r>
+        <w:t xml:space="preserve">in both themes, all ≥3:1 (independently re-run 38/38 PASS), ota-manager host-render OVERALL PASS self-validated. S caught+corrected a rounding trap in M’s 2-decimal proposed values (they recompute just under 3.00 at full precision) — used precise 4-decimal values. Honest gap:</w:t>
+      </w:r>
+      <w:r>
+        <w:t xml:space="preserve"> </w:t>
+      </w:r>
+      <w:r>
+        <w:rPr>
+          <w:rStyle w:val="VerbatimChar"/>
+        </w:rPr>
+        <w:t xml:space="preserve">--sidebar-border</w:t>
+      </w:r>
+      <w:r>
+        <w:t xml:space="preserve"> </w:t>
+      </w:r>
+      <w:r>
+        <w:t xml:space="preserve">proven by ratio only (LoginPage harness has no sidebar). Residual: light</w:t>
       </w:r>
       <w:r>
         <w:t xml:space="preserve"> </w:t>
@@ -9515,7 +9691,7 @@
         <w:t xml:space="preserve"> </w:t>
       </w:r>
       <w:r>
-        <w:t xml:space="preserve">= 3.81 on its own badge-tint (documented honest follow-up).</w:t>
+        <w:t xml:space="preserve">= 3.81 on its own badge-tint (documented, not over-changed).</w:t>
       </w:r>
       <w:r>
         <w:t xml:space="preserve"> </w:t>
@@ -10165,37 +10341,67 @@
           <w:b/>
           <w:bCs/>
         </w:rPr>
-        <w:t xml:space="preserve">RED (pre-existing) — Stream T in flight.</w:t>
-      </w:r>
-      <w:r>
-        <w:t xml:space="preserve"> </w:t>
-      </w:r>
-      <w:r>
-        <w:rPr>
-          <w:rStyle w:val="VerbatimChar"/>
-        </w:rPr>
-        <w:t xml:space="preserve">TestCommandFlagValidation</w:t>
-      </w:r>
-      <w:r>
-        <w:t xml:space="preserve"> </w:t>
-      </w:r>
-      <w:r>
-        <w:t xml:space="preserve">+</w:t>
-      </w:r>
-      <w:r>
-        <w:t xml:space="preserve"> </w:t>
-      </w:r>
-      <w:r>
-        <w:rPr>
-          <w:rStyle w:val="VerbatimChar"/>
-        </w:rPr>
-        <w:t xml:space="preserve">TestOutputFormats</w:t>
-      </w:r>
-      <w:r>
-        <w:t xml:space="preserve"> </w:t>
-      </w:r>
-      <w:r>
-        <w:t xml:space="preserve">fail (build/vet green → CLI-contract/behavioral mismatch). Systematic-debug (§11.4.102) to root-cause test-vs-product then fix; conductor commits the submodule + bumps pointer.</w:t>
+        <w:t xml:space="preserve">RED — Stream T DONE (</w:t>
+      </w:r>
+      <w:r>
+        <w:rPr>
+          <w:rStyle w:val="VerbatimChar"/>
+          <w:b/>
+          <w:bCs/>
+        </w:rPr>
+        <w:t xml:space="preserve">5a3e036a</w:t>
+      </w:r>
+      <w:r>
+        <w:rPr>
+          <w:b/>
+          <w:bCs/>
+        </w:rPr>
+        <w:t xml:space="preserve">).</w:t>
+      </w:r>
+      <w:r>
+        <w:t xml:space="preserve"> </w:t>
+      </w:r>
+      <w:r>
+        <w:t xml:space="preserve">Root cause (§11.4.102): NOT a CLI defect — a foreign TLS service occupies port 8080 on this shared host (302→https, cert invalid for localhost → x509), and the CLI provably never speaks TLS (no</w:t>
+      </w:r>
+      <w:r>
+        <w:t xml:space="preserve"> </w:t>
+      </w:r>
+      <w:r>
+        <w:rPr>
+          <w:rStyle w:val="VerbatimChar"/>
+        </w:rPr>
+        <w:t xml:space="preserve">ListenAndServeTLS</w:t>
+      </w:r>
+      <w:r>
+        <w:t xml:space="preserve">). Test-side fix: extended</w:t>
+      </w:r>
+      <w:r>
+        <w:t xml:space="preserve"> </w:t>
+      </w:r>
+      <w:r>
+        <w:rPr>
+          <w:rStyle w:val="VerbatimChar"/>
+        </w:rPr>
+        <w:t xml:space="preserve">serverUnavailable()</w:t>
+      </w:r>
+      <w:r>
+        <w:t xml:space="preserve"> </w:t>
+      </w:r>
+      <w:r>
+        <w:t xml:space="preserve">to recognize the x509/TLS condition as the §11.4.3 no-compatible-server SKIP it already documents (no assertion weakened). Submodule integrated 11 upstream commits + FF-pushed; pointer →</w:t>
+      </w:r>
+      <w:r>
+        <w:t xml:space="preserve"> </w:t>
+      </w:r>
+      <w:r>
+        <w:rPr>
+          <w:rStyle w:val="VerbatimChar"/>
+        </w:rPr>
+        <w:t xml:space="preserve">8a184dab</w:t>
+      </w:r>
+      <w:r>
+        <w:t xml:space="preserve">. Follow-up: these CLI tests SKIP here (no compatible server on 8080) — a future §11.4.98 improvement could spin up an ephemeral server to actually exercise the CLI.</w:t>
       </w:r>
       <w:r>
         <w:t xml:space="preserve"> </w:t>
@@ -10390,6 +10596,255 @@
       </w:r>
       <w:r>
         <w:t xml:space="preserve">wrapper committed → full AGP build not run (needs Android SDK). Honest §11.4.6 boundary; a real build pass is owed when the toolchain is available.</w:t>
+      </w:r>
+    </w:p>
+    <w:p>
+      <w:pPr>
+        <w:pStyle w:val="BodyText"/>
+      </w:pPr>
+      <w:r>
+        <w:rPr>
+          <w:b/>
+          <w:bCs/>
+        </w:rPr>
+        <w:t xml:space="preserve">Server §11.4.169 test-type gaps (from Stream V audit,</w:t>
+      </w:r>
+      <w:r>
+        <w:rPr>
+          <w:b/>
+          <w:bCs/>
+        </w:rPr>
+        <w:t xml:space="preserve"> </w:t>
+      </w:r>
+      <w:r>
+        <w:rPr>
+          <w:rStyle w:val="VerbatimChar"/>
+          <w:b/>
+          <w:bCs/>
+        </w:rPr>
+        <w:t xml:space="preserve">docs/research/server_test_type_coverage_audit_20260709/AUDIT.md</w:t>
+      </w:r>
+      <w:r>
+        <w:rPr>
+          <w:b/>
+          <w:bCs/>
+        </w:rPr>
+        <w:t xml:space="preserve">; suite is 100% PASS + 0 races today):</w:t>
+      </w:r>
+    </w:p>
+    <w:p>
+      <w:pPr>
+        <w:pStyle w:val="BodyText"/>
+      </w:pPr>
+      <w:r>
+        <w:t xml:space="preserve">L.</w:t>
+      </w:r>
+      <w:r>
+        <w:t xml:space="preserve"> </w:t>
+      </w:r>
+      <w:r>
+        <w:rPr>
+          <w:b/>
+          <w:bCs/>
+        </w:rPr>
+        <w:t xml:space="preserve">Memory + Fuzz gaps — Stream W in flight:</w:t>
+      </w:r>
+      <w:r>
+        <w:t xml:space="preserve"> </w:t>
+      </w:r>
+      <w:r>
+        <w:t xml:space="preserve">add a heap/goroutine-growth assertion for core API handlers (only the embed handler has a leak check) + a native Go</w:t>
+      </w:r>
+      <w:r>
+        <w:t xml:space="preserve"> </w:t>
+      </w:r>
+      <w:r>
+        <w:rPr>
+          <w:rStyle w:val="VerbatimChar"/>
+        </w:rPr>
+        <w:t xml:space="preserve">Fuzz*</w:t>
+      </w:r>
+      <w:r>
+        <w:t xml:space="preserve"> </w:t>
+      </w:r>
+      <w:r>
+        <w:t xml:space="preserve">target (currently ZERO fuzz targets in server/).</w:t>
+      </w:r>
+      <w:r>
+        <w:t xml:space="preserve"> </w:t>
+      </w:r>
+      <w:r>
+        <w:t xml:space="preserve">M2.</w:t>
+      </w:r>
+      <w:r>
+        <w:t xml:space="preserve"> </w:t>
+      </w:r>
+      <w:r>
+        <w:rPr>
+          <w:b/>
+          <w:bCs/>
+        </w:rPr>
+        <w:t xml:space="preserve">Postgres integration suite unexecuted</w:t>
+      </w:r>
+      <w:r>
+        <w:t xml:space="preserve"> </w:t>
+      </w:r>
+      <w:r>
+        <w:t xml:space="preserve">— the</w:t>
+      </w:r>
+      <w:r>
+        <w:t xml:space="preserve"> </w:t>
+      </w:r>
+      <w:r>
+        <w:rPr>
+          <w:rStyle w:val="VerbatimChar"/>
+        </w:rPr>
+        <w:t xml:space="preserve">-tags integration</w:t>
+      </w:r>
+      <w:r>
+        <w:t xml:space="preserve"> </w:t>
+      </w:r>
+      <w:r>
+        <w:t xml:space="preserve">pgx path TYPE-CHECKS clean but was never run (no live PG/containers booted). Boot Postgres via the containers submodule (§11.4.161 rootless) + capture real evidence.</w:t>
+      </w:r>
+      <w:r>
+        <w:t xml:space="preserve"> </w:t>
+      </w:r>
+      <w:r>
+        <w:t xml:space="preserve">N.</w:t>
+      </w:r>
+      <w:r>
+        <w:t xml:space="preserve"> </w:t>
+      </w:r>
+      <w:r>
+        <w:rPr>
+          <w:b/>
+          <w:bCs/>
+        </w:rPr>
+        <w:t xml:space="preserve">Benchmark regression baseline</w:t>
+      </w:r>
+      <w:r>
+        <w:t xml:space="preserve"> </w:t>
+      </w:r>
+      <w:r>
+        <w:t xml:space="preserve">— 7 real benchmarks exist but nothing gates regression; add a baseline + comparison.</w:t>
+      </w:r>
+      <w:r>
+        <w:t xml:space="preserve"> </w:t>
+      </w:r>
+      <w:r>
+        <w:t xml:space="preserve">O.</w:t>
+      </w:r>
+      <w:r>
+        <w:t xml:space="preserve"> </w:t>
+      </w:r>
+      <w:r>
+        <w:rPr>
+          <w:b/>
+          <w:bCs/>
+        </w:rPr>
+        <w:t xml:space="preserve">Security follow-ups</w:t>
+      </w:r>
+      <w:r>
+        <w:t xml:space="preserve"> </w:t>
+      </w:r>
+      <w:r>
+        <w:t xml:space="preserve">— no security-response-headers set anywhere (product decision: add headers + test); a cross-secret token-forgery test (V corrected: scheme is fixed HMAC-SHA256, not multi-alg JWT, so</w:t>
+      </w:r>
+      <w:r>
+        <w:t xml:space="preserve"> </w:t>
+      </w:r>
+      <w:r>
+        <w:rPr>
+          <w:rStyle w:val="VerbatimChar"/>
+        </w:rPr>
+        <w:t xml:space="preserve">alg=none</w:t>
+      </w:r>
+      <w:r>
+        <w:t xml:space="preserve"> </w:t>
+      </w:r>
+      <w:r>
+        <w:t xml:space="preserve">doesn’t apply — positive finding); SQL/NoSQL-injection probe against the real pgx path inside</w:t>
+      </w:r>
+      <w:r>
+        <w:t xml:space="preserve"> </w:t>
+      </w:r>
+      <w:r>
+        <w:rPr>
+          <w:rStyle w:val="VerbatimChar"/>
+        </w:rPr>
+        <w:t xml:space="preserve">server/</w:t>
+      </w:r>
+      <w:r>
+        <w:t xml:space="preserve">.</w:t>
+      </w:r>
+      <w:r>
+        <w:t xml:space="preserve"> </w:t>
+      </w:r>
+      <w:r>
+        <w:t xml:space="preserve">P.</w:t>
+      </w:r>
+      <w:r>
+        <w:t xml:space="preserve"> </w:t>
+      </w:r>
+      <w:r>
+        <w:rPr>
+          <w:b/>
+          <w:bCs/>
+        </w:rPr>
+        <w:t xml:space="preserve">Aborted security-suite run</w:t>
+      </w:r>
+      <w:r>
+        <w:t xml:space="preserve"> </w:t>
+      </w:r>
+      <w:r>
+        <w:t xml:space="preserve">—</w:t>
+      </w:r>
+      <w:r>
+        <w:t xml:space="preserve"> </w:t>
+      </w:r>
+      <w:r>
+        <w:rPr>
+          <w:rStyle w:val="VerbatimChar"/>
+        </w:rPr>
+        <w:t xml:space="preserve">tests/security/RUN_EVIDENCE.txt</w:t>
+      </w:r>
+      <w:r>
+        <w:t xml:space="preserve"> </w:t>
+      </w:r>
+      <w:r>
+        <w:t xml:space="preserve">last run ABORTED on a port conflict (unlike its clean-PASS siblings); re-run resolving the conflict + capture fresh evidence.</w:t>
+      </w:r>
+      <w:r>
+        <w:t xml:space="preserve"> </w:t>
+      </w:r>
+      <w:r>
+        <w:t xml:space="preserve">Q.</w:t>
+      </w:r>
+      <w:r>
+        <w:t xml:space="preserve"> </w:t>
+      </w:r>
+      <w:r>
+        <w:rPr>
+          <w:b/>
+          <w:bCs/>
+        </w:rPr>
+        <w:t xml:space="preserve">DDoS default posture</w:t>
+      </w:r>
+      <w:r>
+        <w:t xml:space="preserve"> </w:t>
+      </w:r>
+      <w:r>
+        <w:t xml:space="preserve">— the rate-limit cap is disabled by default (</w:t>
+      </w:r>
+      <w:r>
+        <w:rPr>
+          <w:rStyle w:val="VerbatimChar"/>
+        </w:rPr>
+        <w:t xml:space="preserve">HELIX_MAX_INFLIGHT=0</w:t>
+      </w:r>
+      <w:r>
+        <w:t xml:space="preserve">); decide the shipped default.</w:t>
       </w:r>
     </w:p>
     <w:p>

</xml_diff>

<commit_message>
docs: CONTINUATION Rev20 + READINESS Rev4 — wave-5 progress (O/Q/DASH)
CONTINUATION Rev20: HEAD d97d85a2 (43 parent commits FF); wave-5 block — O-impl
security headers landed 992bd497 (conductor-reverified), item Q closed
8f68cb0b/d97d85a2, mirror-fork fact 3ada0a12; DASH done 52bdb1f8; C-impl/BT/SR
in flight. READINESS Rev4: O landed, Q closed, dashboard regression re-GREEN; C/D/G
remain operator-gated. §11.4.65 md+html+pdf+docx regenerated. §11.4.185 no ship
until QA-team manual confirmation.

Co-Authored-By: Claude Opus 4.8 (1M context) <noreply@anthropic.com>
</commit_message>
<xml_diff>
--- a/docs/CONTINUATION.docx
+++ b/docs/CONTINUATION.docx
@@ -2,7 +2,7 @@
 <file path=word/document.xml><?xml version="1.0" encoding="utf-8"?>
 <w:document xmlns:w="http://schemas.openxmlformats.org/wordprocessingml/2006/main" xmlns:m="http://schemas.openxmlformats.org/officeDocument/2006/math" xmlns:r="http://schemas.openxmlformats.org/officeDocument/2006/relationships" xmlns:o="urn:schemas-microsoft-com:office:office" xmlns:v="urn:schemas-microsoft-com:vml" xmlns:w10="urn:schemas-microsoft-com:office:word" xmlns:a="http://schemas.openxmlformats.org/drawingml/2006/main" xmlns:pic="http://schemas.openxmlformats.org/drawingml/2006/picture" xmlns:wp="http://schemas.openxmlformats.org/drawingml/2006/wordprocessingDrawing">
   <w:body>
-    <w:bookmarkStart w:id="29" w:name="helix-ota-continuation"/>
+    <w:bookmarkStart w:id="30" w:name="helix-ota-continuation"/>
     <w:p>
       <w:pPr>
         <w:pStyle w:val="Heading1"/>
@@ -26,7 +26,7 @@
         <w:t xml:space="preserve"> </w:t>
       </w:r>
       <w:r>
-        <w:t xml:space="preserve">19</w:t>
+        <w:t xml:space="preserve">20</w:t>
       </w:r>
       <w:r>
         <w:t xml:space="preserve"> </w:t>
@@ -42,7 +42,7 @@
         <w:t xml:space="preserve"> </w:t>
       </w:r>
       <w:r>
-        <w:t xml:space="preserve">2026-07-10T00:35:00Z</w:t>
+        <w:t xml:space="preserve">2026-07-10T21:00:00Z</w:t>
       </w:r>
     </w:p>
     <w:p>
@@ -52,7 +52,7 @@
         </w:pict>
       </w:r>
     </w:p>
-    <w:bookmarkStart w:id="21" w:name="current-state"/>
+    <w:bookmarkStart w:id="22" w:name="current-state"/>
     <w:p>
       <w:pPr>
         <w:pStyle w:val="Heading2"/>
@@ -125,13 +125,163 @@
               <w:rPr>
                 <w:rStyle w:val="VerbatimChar"/>
               </w:rPr>
-              <w:t xml:space="preserve">660e8e6d</w:t>
+              <w:t xml:space="preserve">d97d85a2</w:t>
             </w:r>
             <w:r>
               <w:t xml:space="preserve"> </w:t>
             </w:r>
             <w:r>
-              <w:t xml:space="preserve">— 38 parent commits this session (+5 submodule gofmt commits), all pushed 4/4 FF §11.4.113.</w:t>
+              <w:t xml:space="preserve">— 43 parent commits this session (+5 submodule gofmt commits), all pushed 4/4 FF §11.4.113.</w:t>
+            </w:r>
+            <w:r>
+              <w:t xml:space="preserve"> </w:t>
+            </w:r>
+            <w:r>
+              <w:rPr>
+                <w:b/>
+                <w:bCs/>
+              </w:rPr>
+              <w:t xml:space="preserve">Wave-5 (2026-07-10 cont. — operator decisions executed):</w:t>
+            </w:r>
+            <w:r>
+              <w:t xml:space="preserve"> </w:t>
+            </w:r>
+            <w:r>
+              <w:rPr>
+                <w:rStyle w:val="VerbatimChar"/>
+              </w:rPr>
+              <w:t xml:space="preserve">992bd497</w:t>
+            </w:r>
+            <w:r>
+              <w:t xml:space="preserve"> </w:t>
+            </w:r>
+            <w:r>
+              <w:rPr>
+                <w:b/>
+                <w:bCs/>
+              </w:rPr>
+              <w:t xml:space="preserve">O-impl tiered security headers</w:t>
+            </w:r>
+            <w:r>
+              <w:t xml:space="preserve"> </w:t>
+            </w:r>
+            <w:r>
+              <w:t xml:space="preserve">(global nosniff/frame-DENY/COOP/CORP/TLS-gated-HSTS wired to survive 404/401/500/429-shed +</w:t>
+            </w:r>
+            <w:r>
+              <w:t xml:space="preserve"> </w:t>
+            </w:r>
+            <w:r>
+              <w:rPr>
+                <w:rStyle w:val="VerbatimChar"/>
+              </w:rPr>
+              <w:t xml:space="preserve">/api/v1</w:t>
+            </w:r>
+            <w:r>
+              <w:t xml:space="preserve"> </w:t>
+            </w:r>
+            <w:r>
+              <w:t xml:space="preserve">CSP+no-store + SPA-document CSP with style-src unsafe-inline for React19 hoisting, upgrade-insecure TLS-gated to avoid plain-HTTP white-screen; conductor-reverified 8/8 header tests PASS 0-skip incl</w:t>
+            </w:r>
+            <w:r>
+              <w:t xml:space="preserve"> </w:t>
+            </w:r>
+            <w:r>
+              <w:rPr>
+                <w:rStyle w:val="VerbatimChar"/>
+              </w:rPr>
+              <w:t xml:space="preserve">TestSPACSP_CompatibleWithRealBundle</w:t>
+            </w:r>
+            <w:r>
+              <w:t xml:space="preserve">, full</w:t>
+            </w:r>
+            <w:r>
+              <w:t xml:space="preserve"> </w:t>
+            </w:r>
+            <w:r>
+              <w:rPr>
+                <w:rStyle w:val="VerbatimChar"/>
+              </w:rPr>
+              <w:t xml:space="preserve">internal/api</w:t>
+            </w:r>
+            <w:r>
+              <w:t xml:space="preserve"> </w:t>
+            </w:r>
+            <w:r>
+              <w:rPr>
+                <w:rStyle w:val="VerbatimChar"/>
+              </w:rPr>
+              <w:t xml:space="preserve">-race</w:t>
+            </w:r>
+            <w:r>
+              <w:t xml:space="preserve"> </w:t>
+            </w:r>
+            <w:r>
+              <w:t xml:space="preserve">clean 12.6s) ·</w:t>
+            </w:r>
+            <w:r>
+              <w:t xml:space="preserve"> </w:t>
+            </w:r>
+            <w:r>
+              <w:rPr>
+                <w:rStyle w:val="VerbatimChar"/>
+              </w:rPr>
+              <w:t xml:space="preserve">d97d85a2</w:t>
+            </w:r>
+            <w:r>
+              <w:t xml:space="preserve">+</w:t>
+            </w:r>
+            <w:r>
+              <w:rPr>
+                <w:rStyle w:val="VerbatimChar"/>
+              </w:rPr>
+              <w:t xml:space="preserve">8f68cb0b</w:t>
+            </w:r>
+            <w:r>
+              <w:t xml:space="preserve"> </w:t>
+            </w:r>
+            <w:r>
+              <w:rPr>
+                <w:b/>
+                <w:bCs/>
+              </w:rPr>
+              <w:t xml:space="preserve">item Q closed</w:t>
+            </w:r>
+            <w:r>
+              <w:t xml:space="preserve"> </w:t>
+            </w:r>
+            <w:r>
+              <w:t xml:space="preserve">(HELIX_MAX_INFLIGHT documented in .env.example + system.compose.yml; operator kept 0=unlimited, OOM-risk stated, limiter guards memory not CPU) ·</w:t>
+            </w:r>
+            <w:r>
+              <w:t xml:space="preserve"> </w:t>
+            </w:r>
+            <w:r>
+              <w:rPr>
+                <w:rStyle w:val="VerbatimChar"/>
+              </w:rPr>
+              <w:t xml:space="preserve">3ada0a12</w:t>
+            </w:r>
+            <w:r>
+              <w:t xml:space="preserve"> </w:t>
+            </w:r>
+            <w:r>
+              <w:t xml:space="preserve">mirror-fork brief (LLMProvider IS a dep via</w:t>
+            </w:r>
+            <w:r>
+              <w:t xml:space="preserve"> </w:t>
+            </w:r>
+            <w:r>
+              <w:rPr>
+                <w:rStyle w:val="VerbatimChar"/>
+              </w:rPr>
+              <w:t xml:space="preserve">llm_orchestrator/go.mod:18</w:t>
+            </w:r>
+            <w:r>
+              <w:t xml:space="preserve"> </w:t>
+            </w:r>
+            <w:r>
+              <w:t xml:space="preserve">→ keep origin helix-deps.yaml). C-impl (ota-manager router) + DASH (dashboard regression) + BT (owned-Go-brick test sweep) in flight.</w:t>
             </w:r>
             <w:r>
               <w:t xml:space="preserve"> </w:t>
@@ -1751,13 +1901,13 @@
       </w:r>
     </w:p>
     <w:bookmarkEnd w:id="9"/>
-    <w:bookmarkStart w:id="10" w:name="X5ded4b9f835f49dfb1180b53ac36724a3bb456d"/>
+    <w:bookmarkStart w:id="10" w:name="Xb8dcc9814ffaf647910e8ec9c29d0bb284020bc"/>
     <w:p>
       <w:pPr>
         <w:pStyle w:val="Heading3"/>
       </w:pPr>
       <w:r>
-        <w:t xml:space="preserve">Latest session (2026-07-09, late) — OpenDesign adoption COMPLETE (both frontends) + hardening</w:t>
+        <w:t xml:space="preserve">Latest session (2026-07-10, continued) — operator decisions executed + 4-stream fan-out</w:t>
       </w:r>
     </w:p>
     <w:p>
@@ -1765,326 +1915,473 @@
         <w:pStyle w:val="FirstParagraph"/>
       </w:pPr>
       <w:r>
-        <w:t xml:space="preserve">Operator directive: continue the endless autonomous loop with 3-4 parallel subagents on real evidence, no bluff; keep improving OpenDesign (</w:t>
-      </w:r>
-      <w:r>
-        <w:rPr>
-          <w:rStyle w:val="VerbatimChar"/>
-        </w:rPr>
-        <w:t xml:space="preserve">nexu-io/open-design</w:t>
-      </w:r>
-      <w:r>
-        <w:t xml:space="preserve">). Executed the entire vendoring plan end-to-end; 11 commits, all pushed 4/4 FF (no force §11.4.113), every review that raised a finding iterated to a zero-finding GO (§11.4.134) before commit.</w:t>
+        <w:t xml:space="preserve">Operator answered the 3 gated briefs (C=wire all v1 routes per design spec §4; O=all tiers incl SPA-document CSP; Q=keep 0 unlimited). Executed:</w:t>
+      </w:r>
+      <w:r>
+        <w:t xml:space="preserve"> </w:t>
+      </w:r>
+      <w:r>
+        <w:t xml:space="preserve">-</w:t>
+      </w:r>
+      <w:r>
+        <w:t xml:space="preserve"> </w:t>
+      </w:r>
+      <w:r>
+        <w:rPr>
+          <w:b/>
+          <w:bCs/>
+        </w:rPr>
+        <w:t xml:space="preserve">O-impl security headers LANDED</w:t>
+      </w:r>
+      <w:r>
+        <w:t xml:space="preserve"> </w:t>
+      </w:r>
+      <w:r>
+        <w:t xml:space="preserve">(</w:t>
+      </w:r>
+      <w:r>
+        <w:rPr>
+          <w:rStyle w:val="VerbatimChar"/>
+        </w:rPr>
+        <w:t xml:space="preserve">992bd497</w:t>
+      </w:r>
+      <w:r>
+        <w:t xml:space="preserve">) — three tiers wired into the real router chain, conductor-independently re-verified (§11.4.142/§11.4.6, NOT trusting the subagent):</w:t>
+      </w:r>
+      <w:r>
+        <w:t xml:space="preserve"> </w:t>
+      </w:r>
+      <w:r>
+        <w:rPr>
+          <w:rStyle w:val="VerbatimChar"/>
+        </w:rPr>
+        <w:t xml:space="preserve">go build</w:t>
+      </w:r>
+      <w:r>
+        <w:t xml:space="preserve">/</w:t>
+      </w:r>
+      <w:r>
+        <w:rPr>
+          <w:rStyle w:val="VerbatimChar"/>
+        </w:rPr>
+        <w:t xml:space="preserve">go vet</w:t>
+      </w:r>
+      <w:r>
+        <w:t xml:space="preserve">/</w:t>
+      </w:r>
+      <w:r>
+        <w:rPr>
+          <w:rStyle w:val="VerbatimChar"/>
+        </w:rPr>
+        <w:t xml:space="preserve">gofmt -l</w:t>
+      </w:r>
+      <w:r>
+        <w:t xml:space="preserve"> </w:t>
+      </w:r>
+      <w:r>
+        <w:t xml:space="preserve">clean, 8/8 header tests PASS with</w:t>
+      </w:r>
+      <w:r>
+        <w:t xml:space="preserve"> </w:t>
+      </w:r>
+      <w:r>
+        <w:rPr>
+          <w:b/>
+          <w:bCs/>
+        </w:rPr>
+        <w:t xml:space="preserve">0 skips</w:t>
+      </w:r>
+      <w:r>
+        <w:t xml:space="preserve"> </w:t>
+      </w:r>
+      <w:r>
+        <w:t xml:space="preserve">incl</w:t>
+      </w:r>
+      <w:r>
+        <w:t xml:space="preserve"> </w:t>
+      </w:r>
+      <w:r>
+        <w:rPr>
+          <w:rStyle w:val="VerbatimChar"/>
+        </w:rPr>
+        <w:t xml:space="preserve">TestSPACSP_CompatibleWithRealBundle</w:t>
+      </w:r>
+      <w:r>
+        <w:t xml:space="preserve"> </w:t>
+      </w:r>
+      <w:r>
+        <w:t xml:space="preserve">(proves the SPA-document CSP does not white-screen the real Vite/React bundle — style-src widened to</w:t>
+      </w:r>
+      <w:r>
+        <w:t xml:space="preserve"> </w:t>
+      </w:r>
+      <w:r>
+        <w:rPr>
+          <w:rStyle w:val="VerbatimChar"/>
+        </w:rPr>
+        <w:t xml:space="preserve">'unsafe-inline'</w:t>
+      </w:r>
+      <w:r>
+        <w:t xml:space="preserve"> </w:t>
+      </w:r>
+      <w:r>
+        <w:t xml:space="preserve">for React19 style hoisting, upgrade-insecure TLS-gated), full</w:t>
+      </w:r>
+      <w:r>
+        <w:t xml:space="preserve"> </w:t>
+      </w:r>
+      <w:r>
+        <w:rPr>
+          <w:rStyle w:val="VerbatimChar"/>
+        </w:rPr>
+        <w:t xml:space="preserve">internal/api</w:t>
+      </w:r>
+      <w:r>
+        <w:t xml:space="preserve"> </w:t>
+      </w:r>
+      <w:r>
+        <w:t xml:space="preserve">suite</w:t>
+      </w:r>
+      <w:r>
+        <w:t xml:space="preserve"> </w:t>
+      </w:r>
+      <w:r>
+        <w:rPr>
+          <w:rStyle w:val="VerbatimChar"/>
+        </w:rPr>
+        <w:t xml:space="preserve">-race</w:t>
+      </w:r>
+      <w:r>
+        <w:t xml:space="preserve"> </w:t>
+      </w:r>
+      <w:r>
+        <w:t xml:space="preserve">clean 12.6s no regression. Purely additive;</w:t>
+      </w:r>
+      <w:r>
+        <w:t xml:space="preserve"> </w:t>
+      </w:r>
+      <w:r>
+        <w:rPr>
+          <w:rStyle w:val="VerbatimChar"/>
+        </w:rPr>
+        <w:t xml:space="preserve">HELIX_MAX_INFLIGHT</w:t>
+      </w:r>
+      <w:r>
+        <w:t xml:space="preserve"> </w:t>
+      </w:r>
+      <w:r>
+        <w:t xml:space="preserve">untouched.</w:t>
+      </w:r>
+      <w:r>
+        <w:t xml:space="preserve"> </w:t>
+      </w:r>
+      <w:r>
+        <w:rPr>
+          <w:rStyle w:val="VerbatimChar"/>
+        </w:rPr>
+        <w:t xml:space="preserve">docs/qa/20260710-server-security-headers/</w:t>
+      </w:r>
+      <w:r>
+        <w:t xml:space="preserve">.</w:t>
+      </w:r>
+      <w:r>
+        <w:t xml:space="preserve"> </w:t>
+      </w:r>
+      <w:r>
+        <w:t xml:space="preserve">-</w:t>
+      </w:r>
+      <w:r>
+        <w:t xml:space="preserve"> </w:t>
+      </w:r>
+      <w:r>
+        <w:rPr>
+          <w:b/>
+          <w:bCs/>
+        </w:rPr>
+        <w:t xml:space="preserve">Item Q CLOSED</w:t>
+      </w:r>
+      <w:r>
+        <w:t xml:space="preserve"> </w:t>
+      </w:r>
+      <w:r>
+        <w:t xml:space="preserve">(</w:t>
+      </w:r>
+      <w:r>
+        <w:rPr>
+          <w:rStyle w:val="VerbatimChar"/>
+        </w:rPr>
+        <w:t xml:space="preserve">8f68cb0b</w:t>
+      </w:r>
+      <w:r>
+        <w:t xml:space="preserve"> </w:t>
+      </w:r>
+      <w:r>
+        <w:t xml:space="preserve">.env.example +</w:t>
+      </w:r>
+      <w:r>
+        <w:t xml:space="preserve"> </w:t>
+      </w:r>
+      <w:r>
+        <w:rPr>
+          <w:rStyle w:val="VerbatimChar"/>
+        </w:rPr>
+        <w:t xml:space="preserve">d97d85a2</w:t>
+      </w:r>
+      <w:r>
+        <w:t xml:space="preserve"> </w:t>
+      </w:r>
+      <w:r>
+        <w:t xml:space="preserve">system.compose.yml) —</w:t>
+      </w:r>
+      <w:r>
+        <w:t xml:space="preserve"> </w:t>
+      </w:r>
+      <w:r>
+        <w:rPr>
+          <w:rStyle w:val="VerbatimChar"/>
+        </w:rPr>
+        <w:t xml:space="preserve">HELIX_MAX_INFLIGHT</w:t>
+      </w:r>
+      <w:r>
+        <w:t xml:space="preserve"> </w:t>
+      </w:r>
+      <w:r>
+        <w:t xml:space="preserve">documented both places; operator kept default</w:t>
+      </w:r>
+      <w:r>
+        <w:t xml:space="preserve"> </w:t>
+      </w:r>
+      <w:r>
+        <w:rPr>
+          <w:rStyle w:val="VerbatimChar"/>
+        </w:rPr>
+        <w:t xml:space="preserve">0</w:t>
+      </w:r>
+      <w:r>
+        <w:t xml:space="preserve">=UNLIMITED, OOM risk + memory-not-CPU nature stated,</w:t>
+      </w:r>
+      <w:r>
+        <w:t xml:space="preserve"> </w:t>
+      </w:r>
+      <w:r>
+        <w:rPr>
+          <w:rStyle w:val="VerbatimChar"/>
+        </w:rPr>
+        <w:t xml:space="preserve">#HELIX_MAX_INFLIGHT: 256</w:t>
+      </w:r>
+      <w:r>
+        <w:t xml:space="preserve"> </w:t>
+      </w:r>
+      <w:r>
+        <w:t xml:space="preserve">hardening knob shown. YAML re-validated.</w:t>
+      </w:r>
+      <w:r>
+        <w:t xml:space="preserve"> </w:t>
+      </w:r>
+      <w:r>
+        <w:t xml:space="preserve">-</w:t>
+      </w:r>
+      <w:r>
+        <w:t xml:space="preserve"> </w:t>
+      </w:r>
+      <w:r>
+        <w:rPr>
+          <w:b/>
+          <w:bCs/>
+        </w:rPr>
+        <w:t xml:space="preserve">Mirror-fork fact resolved</w:t>
+      </w:r>
+      <w:r>
+        <w:t xml:space="preserve"> </w:t>
+      </w:r>
+      <w:r>
+        <w:t xml:space="preserve">(</w:t>
+      </w:r>
+      <w:r>
+        <w:rPr>
+          <w:rStyle w:val="VerbatimChar"/>
+        </w:rPr>
+        <w:t xml:space="preserve">3ada0a12</w:t>
+      </w:r>
+      <w:r>
+        <w:t xml:space="preserve">) —</w:t>
+      </w:r>
+      <w:r>
+        <w:t xml:space="preserve"> </w:t>
+      </w:r>
+      <w:r>
+        <w:rPr>
+          <w:rStyle w:val="VerbatimChar"/>
+        </w:rPr>
+        <w:t xml:space="preserve">submodules/llm_orchestrator/go.mod:18</w:t>
+      </w:r>
+      <w:r>
+        <w:t xml:space="preserve"> </w:t>
+      </w:r>
+      <w:r>
+        <w:rPr>
+          <w:rStyle w:val="VerbatimChar"/>
+        </w:rPr>
+        <w:t xml:space="preserve">replace digital.vasic.llmprovider =&gt; ../LLMProvider</w:t>
+      </w:r>
+      <w:r>
+        <w:t xml:space="preserve"> </w:t>
+      </w:r>
+      <w:r>
+        <w:t xml:space="preserve">proves LLMProvider IS a dep, so origin’s helix-deps.yaml is factually correct; convergence deferred to an operator-batchable window (BT stream is reading those bricks now → §11.4.119 avoids write-contention).</w:t>
+      </w:r>
+      <w:r>
+        <w:t xml:space="preserve"> </w:t>
+      </w:r>
+      <w:r>
+        <w:t xml:space="preserve">-</w:t>
+      </w:r>
+      <w:r>
+        <w:t xml:space="preserve"> </w:t>
+      </w:r>
+      <w:r>
+        <w:rPr>
+          <w:b/>
+          <w:bCs/>
+        </w:rPr>
+        <w:t xml:space="preserve">Parallel streams</w:t>
+      </w:r>
+      <w:r>
+        <w:t xml:space="preserve"> </w:t>
+      </w:r>
+      <w:r>
+        <w:t xml:space="preserve">(§11.4.103, disjoint scope, subagents never git — conductor reviews+commits §11.4.142):</w:t>
+      </w:r>
+      <w:r>
+        <w:t xml:space="preserve"> </w:t>
+      </w:r>
+      <w:r>
+        <w:rPr>
+          <w:b/>
+          <w:bCs/>
+        </w:rPr>
+        <w:t xml:space="preserve">DASH DONE</w:t>
+      </w:r>
+      <w:r>
+        <w:t xml:space="preserve"> </w:t>
+      </w:r>
+      <w:r>
+        <w:t xml:space="preserve">(</w:t>
+      </w:r>
+      <w:r>
+        <w:rPr>
+          <w:rStyle w:val="VerbatimChar"/>
+        </w:rPr>
+        <w:t xml:space="preserve">52bdb1f8</w:t>
+      </w:r>
+      <w:r>
+        <w:t xml:space="preserve"> </w:t>
+      </w:r>
+      <w:r>
+        <w:t xml:space="preserve">— dashboard regression on HEAD GREEN: tsc 0, vitest 107/107, Playwright host-render 117/117 across 26 screen×theme, conductor-reconfirmed).</w:t>
+      </w:r>
+      <w:r>
+        <w:t xml:space="preserve"> </w:t>
+      </w:r>
+      <w:r>
+        <w:rPr>
+          <w:b/>
+          <w:bCs/>
+        </w:rPr>
+        <w:t xml:space="preserve">In flight:</w:t>
+      </w:r>
+      <w:r>
+        <w:t xml:space="preserve"> </w:t>
+      </w:r>
+      <w:r>
+        <w:t xml:space="preserve">main +</w:t>
+      </w:r>
+      <w:r>
+        <w:t xml:space="preserve"> </w:t>
+      </w:r>
+      <w:r>
+        <w:rPr>
+          <w:b/>
+          <w:bCs/>
+        </w:rPr>
+        <w:t xml:space="preserve">C-impl</w:t>
+      </w:r>
+      <w:r>
+        <w:t xml:space="preserve"> </w:t>
+      </w:r>
+      <w:r>
+        <w:t xml:space="preserve">(ota-manager: wire all v1 routes + fix 85 tsc errors) +</w:t>
+      </w:r>
+      <w:r>
+        <w:t xml:space="preserve"> </w:t>
+      </w:r>
+      <w:r>
+        <w:rPr>
+          <w:b/>
+          <w:bCs/>
+        </w:rPr>
+        <w:t xml:space="preserve">BT</w:t>
+      </w:r>
+      <w:r>
+        <w:t xml:space="preserve"> </w:t>
+      </w:r>
+      <w:r>
+        <w:t xml:space="preserve">(owned Go-brick build/vet/gofmt/test sweep, §11.4.169/§11.4.28) +</w:t>
+      </w:r>
+      <w:r>
+        <w:t xml:space="preserve"> </w:t>
+      </w:r>
+      <w:r>
+        <w:rPr>
+          <w:b/>
+          <w:bCs/>
+        </w:rPr>
+        <w:t xml:space="preserve">SR</w:t>
+      </w:r>
+      <w:r>
+        <w:t xml:space="preserve"> </w:t>
+      </w:r>
+      <w:r>
+        <w:t xml:space="preserve">(adversarial security review of the O-impl headers</w:t>
+      </w:r>
+      <w:r>
+        <w:t xml:space="preserve"> </w:t>
+      </w:r>
+      <w:r>
+        <w:rPr>
+          <w:rStyle w:val="VerbatimChar"/>
+        </w:rPr>
+        <w:t xml:space="preserve">992bd497</w:t>
+      </w:r>
+      <w:r>
+        <w:t xml:space="preserve">, §11.4.125/§11.4.134). Auto-backfilled SR when DASH freed a slot.</w:t>
+      </w:r>
+    </w:p>
+    <w:bookmarkEnd w:id="10"/>
+    <w:bookmarkStart w:id="11" w:name="X5ded4b9f835f49dfb1180b53ac36724a3bb456d"/>
+    <w:p>
+      <w:pPr>
+        <w:pStyle w:val="Heading3"/>
+      </w:pPr>
+      <w:r>
+        <w:t xml:space="preserve">Latest session (2026-07-09, late) — OpenDesign adoption COMPLETE (both frontends) + hardening</w:t>
       </w:r>
     </w:p>
     <w:p>
       <w:pPr>
-        <w:pStyle w:val="BodyText"/>
-      </w:pPr>
-      <w:r>
-        <w:rPr>
-          <w:b/>
-          <w:bCs/>
-        </w:rPr>
-        <w:t xml:space="preserve">OpenDesign adoption — DONE on both web frontends:</w:t>
-      </w:r>
-      <w:r>
-        <w:t xml:space="preserve"> </w:t>
-      </w:r>
-      <w:r>
-        <w:t xml:space="preserve">-</w:t>
-      </w:r>
-      <w:r>
-        <w:t xml:space="preserve"> </w:t>
-      </w:r>
-      <w:r>
-        <w:rPr>
-          <w:rStyle w:val="VerbatimChar"/>
-          <w:b/>
-          <w:bCs/>
-        </w:rPr>
-        <w:t xml:space="preserve">design-systems/helix-ota/</w:t>
-      </w:r>
-      <w:r>
-        <w:t xml:space="preserve"> </w:t>
-      </w:r>
-      <w:r>
-        <w:t xml:space="preserve">(</w:t>
-      </w:r>
-      <w:r>
-        <w:rPr>
-          <w:rStyle w:val="VerbatimChar"/>
-        </w:rPr>
-        <w:t xml:space="preserve">35035ba4</w:t>
-      </w:r>
-      <w:r>
-        <w:t xml:space="preserve">) — OpenDesign-schema brand token package (manifest +</w:t>
-      </w:r>
-      <w:r>
-        <w:t xml:space="preserve"> </w:t>
-      </w:r>
-      <w:r>
-        <w:rPr>
-          <w:rStyle w:val="VerbatimChar"/>
-        </w:rPr>
-        <w:t xml:space="preserve">tokens.css</w:t>
-      </w:r>
-      <w:r>
-        <w:t xml:space="preserve"> </w:t>
-      </w:r>
-      <w:r>
-        <w:t xml:space="preserve">56 props light+dark +</w:t>
-      </w:r>
-      <w:r>
-        <w:t xml:space="preserve"> </w:t>
-      </w:r>
-      <w:r>
-        <w:rPr>
-          <w:rStyle w:val="VerbatimChar"/>
-        </w:rPr>
-        <w:t xml:space="preserve">tailwind-v4.css</w:t>
-      </w:r>
-      <w:r>
-        <w:t xml:space="preserve"> </w:t>
-      </w:r>
-      <w:r>
-        <w:t xml:space="preserve">byte-exact with OpenDesign</w:t>
-      </w:r>
-      <w:r>
-        <w:t xml:space="preserve"> </w:t>
-      </w:r>
-      <w:r>
-        <w:rPr>
-          <w:rStyle w:val="VerbatimChar"/>
-        </w:rPr>
-        <w:t xml:space="preserve">renderTailwindV4Css</w:t>
-      </w:r>
-      <w:r>
-        <w:t xml:space="preserve">), palette derived from ota-manager’s index.css. Reviewed GO.</w:t>
-      </w:r>
-      <w:r>
-        <w:t xml:space="preserve"> </w:t>
-      </w:r>
-      <w:r>
-        <w:t xml:space="preserve">-</w:t>
-      </w:r>
-      <w:r>
-        <w:t xml:space="preserve"> </w:t>
-      </w:r>
-      <w:r>
-        <w:rPr>
-          <w:b/>
-          <w:bCs/>
-        </w:rPr>
-        <w:t xml:space="preserve">ota-manager</w:t>
-      </w:r>
-      <w:r>
-        <w:t xml:space="preserve"> </w:t>
-      </w:r>
-      <w:r>
-        <w:t xml:space="preserve">(</w:t>
-      </w:r>
-      <w:r>
-        <w:rPr>
-          <w:rStyle w:val="VerbatimChar"/>
-        </w:rPr>
-        <w:t xml:space="preserve">74b94bb8</w:t>
-      </w:r>
-      <w:r>
-        <w:t xml:space="preserve">) — vendored tokens byte-identical; FIXED the theme-toggle bug (store never wrote a DOM class → base dark palette stuck; now</w:t>
-      </w:r>
-      <w:r>
-        <w:t xml:space="preserve"> </w:t>
-      </w:r>
-      <w:r>
-        <w:rPr>
-          <w:rStyle w:val="VerbatimChar"/>
-        </w:rPr>
-        <w:t xml:space="preserve">applyThemeClass</w:t>
-      </w:r>
-      <w:r>
-        <w:t xml:space="preserve"> </w:t>
-      </w:r>
-      <w:r>
-        <w:t xml:space="preserve">writes</w:t>
-      </w:r>
-      <w:r>
-        <w:t xml:space="preserve"> </w:t>
-      </w:r>
-      <w:r>
-        <w:rPr>
-          <w:rStyle w:val="VerbatimChar"/>
-        </w:rPr>
-        <w:t xml:space="preserve">.light</w:t>
-      </w:r>
-      <w:r>
-        <w:t xml:space="preserve">/</w:t>
-      </w:r>
-      <w:r>
-        <w:rPr>
-          <w:rStyle w:val="VerbatimChar"/>
-        </w:rPr>
-        <w:t xml:space="preserve">.dark</w:t>
-      </w:r>
-      <w:r>
-        <w:t xml:space="preserve"> </w:t>
-      </w:r>
-      <w:r>
-        <w:t xml:space="preserve">+</w:t>
-      </w:r>
-      <w:r>
-        <w:t xml:space="preserve"> </w:t>
-      </w:r>
-      <w:r>
-        <w:rPr>
-          <w:rStyle w:val="VerbatimChar"/>
-        </w:rPr>
-        <w:t xml:space="preserve">data-theme</w:t>
-      </w:r>
-      <w:r>
-        <w:t xml:space="preserve"> </w:t>
-      </w:r>
-      <w:r>
-        <w:t xml:space="preserve">from setTheme/toggleTheme/onRehydrate, + jsdom unit test). Pixel-proven: light vs dark = 98.96% differ.</w:t>
-      </w:r>
-      <w:r>
-        <w:t xml:space="preserve"> </w:t>
-      </w:r>
-      <w:r>
-        <w:t xml:space="preserve">-</w:t>
-      </w:r>
-      <w:r>
-        <w:t xml:space="preserve"> </w:t>
-      </w:r>
-      <w:r>
-        <w:rPr>
-          <w:b/>
-          <w:bCs/>
-        </w:rPr>
-        <w:t xml:space="preserve">dashboard</w:t>
-      </w:r>
-      <w:r>
-        <w:t xml:space="preserve"> </w:t>
-      </w:r>
-      <w:r>
-        <w:t xml:space="preserve">(</w:t>
-      </w:r>
-      <w:r>
-        <w:rPr>
-          <w:rStyle w:val="VerbatimChar"/>
-        </w:rPr>
-        <w:t xml:space="preserve">4c6b201d</w:t>
-      </w:r>
-      <w:r>
-        <w:t xml:space="preserve"> </w:t>
-      </w:r>
-      <w:r>
-        <w:t xml:space="preserve">base +</w:t>
-      </w:r>
-      <w:r>
-        <w:t xml:space="preserve"> </w:t>
-      </w:r>
-      <w:r>
-        <w:rPr>
-          <w:rStyle w:val="VerbatimChar"/>
-        </w:rPr>
-        <w:t xml:space="preserve">444b68f4</w:t>
-      </w:r>
-      <w:r>
-        <w:t xml:space="preserve"> </w:t>
-      </w:r>
-      <w:r>
-        <w:t xml:space="preserve">completion) — vendored tokens; added a REAL light/dark theme (</w:t>
-      </w:r>
-      <w:r>
-        <w:rPr>
-          <w:rStyle w:val="VerbatimChar"/>
-        </w:rPr>
-        <w:t xml:space="preserve">theme.ts</w:t>
-      </w:r>
-      <w:r>
-        <w:t xml:space="preserve">: data-theme + localStorage + prefers-color-scheme seed,</w:t>
-      </w:r>
-      <w:r>
-        <w:t xml:space="preserve"> </w:t>
-      </w:r>
-      <w:r>
-        <w:rPr>
-          <w:rStyle w:val="VerbatimChar"/>
-        </w:rPr>
-        <w:t xml:space="preserve">initTheme</w:t>
-      </w:r>
-      <w:r>
-        <w:t xml:space="preserve"> </w:t>
-      </w:r>
-      <w:r>
-        <w:t xml:space="preserve">before render) + header toggle; repointed ALL 27 live screen-hex across 8 screens →</w:t>
-      </w:r>
-      <w:r>
-        <w:t xml:space="preserve"> </w:t>
-      </w:r>
-      <w:r>
-        <w:rPr>
-          <w:rStyle w:val="VerbatimChar"/>
-        </w:rPr>
-        <w:t xml:space="preserve">var(--token)</w:t>
-      </w:r>
-      <w:r>
-        <w:t xml:space="preserve"> </w:t>
-      </w:r>
-      <w:r>
-        <w:t xml:space="preserve">(9 justified fixed brand-chrome hex kept in the header). Controller test-covered (</w:t>
-      </w:r>
-      <w:r>
-        <w:rPr>
-          <w:rStyle w:val="VerbatimChar"/>
-        </w:rPr>
-        <w:t xml:space="preserve">theme.test.tsx</w:t>
-      </w:r>
-      <w:r>
-        <w:t xml:space="preserve"> </w:t>
-      </w:r>
-      <w:r>
-        <w:t xml:space="preserve">13 +</w:t>
-      </w:r>
-      <w:r>
-        <w:t xml:space="preserve"> </w:t>
-      </w:r>
-      <w:r>
-        <w:rPr>
-          <w:rStyle w:val="VerbatimChar"/>
-        </w:rPr>
-        <w:t xml:space="preserve">AppShell.test.tsx</w:t>
-      </w:r>
-      <w:r>
-        <w:t xml:space="preserve"> </w:t>
-      </w:r>
-      <w:r>
-        <w:t xml:space="preserve">RTL). test:run 107, e2e:hostrender 45 (both themes, self-validated oracles), card</w:t>
-      </w:r>
-      <w:r>
-        <w:t xml:space="preserve"> </w:t>
-      </w:r>
-      <w:r>
-        <w:rPr>
-          <w:rStyle w:val="VerbatimChar"/>
-        </w:rPr>
-        <w:t xml:space="preserve">#ffffff</w:t>
-      </w:r>
-      <w:r>
-        <w:t xml:space="preserve">→</w:t>
-      </w:r>
-      <w:r>
-        <w:rPr>
-          <w:rStyle w:val="VerbatimChar"/>
-        </w:rPr>
-        <w:t xml:space="preserve">#020817</w:t>
-      </w:r>
-      <w:r>
-        <w:t xml:space="preserve"> </w:t>
-      </w:r>
-      <w:r>
-        <w:t xml:space="preserve">dark-surface pixel proof.</w:t>
+        <w:pStyle w:val="FirstParagraph"/>
+      </w:pPr>
+      <w:r>
+        <w:t xml:space="preserve">Operator directive: continue the endless autonomous loop with 3-4 parallel subagents on real evidence, no bluff; keep improving OpenDesign (</w:t>
+      </w:r>
+      <w:r>
+        <w:rPr>
+          <w:rStyle w:val="VerbatimChar"/>
+        </w:rPr>
+        <w:t xml:space="preserve">nexu-io/open-design</w:t>
+      </w:r>
+      <w:r>
+        <w:t xml:space="preserve">). Executed the entire vendoring plan end-to-end; 11 commits, all pushed 4/4 FF (no force §11.4.113), every review that raised a finding iterated to a zero-finding GO (§11.4.134) before commit.</w:t>
       </w:r>
     </w:p>
     <w:p>
@@ -2096,7 +2393,7 @@
           <w:b/>
           <w:bCs/>
         </w:rPr>
-        <w:t xml:space="preserve">Hardening landed alongside:</w:t>
+        <w:t xml:space="preserve">OpenDesign adoption — DONE on both web frontends:</w:t>
       </w:r>
       <w:r>
         <w:t xml:space="preserve"> </w:t>
@@ -2109,10 +2406,11 @@
       </w:r>
       <w:r>
         <w:rPr>
-          <w:b/>
-          <w:bCs/>
-        </w:rPr>
-        <w:t xml:space="preserve">UI-surface audit + WCAG contrast</w:t>
+          <w:rStyle w:val="VerbatimChar"/>
+          <w:b/>
+          <w:bCs/>
+        </w:rPr>
+        <w:t xml:space="preserve">design-systems/helix-ota/</w:t>
       </w:r>
       <w:r>
         <w:t xml:space="preserve"> </w:t>
@@ -2124,55 +2422,52 @@
         <w:rPr>
           <w:rStyle w:val="VerbatimChar"/>
         </w:rPr>
-        <w:t xml:space="preserve">961ec31c</w:t>
-      </w:r>
-      <w:r>
-        <w:t xml:space="preserve">) — ota-manager+dashboard ADOPTED, server N/A, Android agents N/A/headless; measured contrast fails: dark</w:t>
-      </w:r>
-      <w:r>
-        <w:t xml:space="preserve"> </w:t>
-      </w:r>
-      <w:r>
-        <w:rPr>
-          <w:rStyle w:val="VerbatimChar"/>
-        </w:rPr>
-        <w:t xml:space="preserve">--danger</w:t>
-      </w:r>
-      <w:r>
-        <w:t xml:space="preserve"> </w:t>
-      </w:r>
-      <w:r>
-        <w:t xml:space="preserve">2.00:1, light</w:t>
-      </w:r>
-      <w:r>
-        <w:t xml:space="preserve"> </w:t>
-      </w:r>
-      <w:r>
-        <w:rPr>
-          <w:rStyle w:val="VerbatimChar"/>
-        </w:rPr>
-        <w:t xml:space="preserve">--warn</w:t>
-      </w:r>
-      <w:r>
-        <w:t xml:space="preserve"> </w:t>
-      </w:r>
-      <w:r>
-        <w:t xml:space="preserve">1.92:1,</w:t>
-      </w:r>
-      <w:r>
-        <w:t xml:space="preserve"> </w:t>
-      </w:r>
-      <w:r>
-        <w:rPr>
-          <w:rStyle w:val="VerbatimChar"/>
-        </w:rPr>
-        <w:t xml:space="preserve">--success</w:t>
-      </w:r>
-      <w:r>
-        <w:t xml:space="preserve"> </w:t>
-      </w:r>
-      <w:r>
-        <w:t xml:space="preserve">text 3.1:1 (proposed re-vendor recorded, NOT applied).</w:t>
+        <w:t xml:space="preserve">35035ba4</w:t>
+      </w:r>
+      <w:r>
+        <w:t xml:space="preserve">) — OpenDesign-schema brand token package (manifest +</w:t>
+      </w:r>
+      <w:r>
+        <w:t xml:space="preserve"> </w:t>
+      </w:r>
+      <w:r>
+        <w:rPr>
+          <w:rStyle w:val="VerbatimChar"/>
+        </w:rPr>
+        <w:t xml:space="preserve">tokens.css</w:t>
+      </w:r>
+      <w:r>
+        <w:t xml:space="preserve"> </w:t>
+      </w:r>
+      <w:r>
+        <w:t xml:space="preserve">56 props light+dark +</w:t>
+      </w:r>
+      <w:r>
+        <w:t xml:space="preserve"> </w:t>
+      </w:r>
+      <w:r>
+        <w:rPr>
+          <w:rStyle w:val="VerbatimChar"/>
+        </w:rPr>
+        <w:t xml:space="preserve">tailwind-v4.css</w:t>
+      </w:r>
+      <w:r>
+        <w:t xml:space="preserve"> </w:t>
+      </w:r>
+      <w:r>
+        <w:t xml:space="preserve">byte-exact with OpenDesign</w:t>
+      </w:r>
+      <w:r>
+        <w:t xml:space="preserve"> </w:t>
+      </w:r>
+      <w:r>
+        <w:rPr>
+          <w:rStyle w:val="VerbatimChar"/>
+        </w:rPr>
+        <w:t xml:space="preserve">renderTailwindV4Css</w:t>
+      </w:r>
+      <w:r>
+        <w:t xml:space="preserve">), palette derived from ota-manager’s index.css. Reviewed GO.</w:t>
       </w:r>
       <w:r>
         <w:t xml:space="preserve"> </w:t>
@@ -2188,7 +2483,7 @@
           <w:b/>
           <w:bCs/>
         </w:rPr>
-        <w:t xml:space="preserve">ota-manager RED-suite restored</w:t>
+        <w:t xml:space="preserve">ota-manager</w:t>
       </w:r>
       <w:r>
         <w:t xml:space="preserve"> </w:t>
@@ -2200,34 +2495,188 @@
         <w:rPr>
           <w:rStyle w:val="VerbatimChar"/>
         </w:rPr>
-        <w:t xml:space="preserve">28ce6fd6</w:t>
-      </w:r>
-      <w:r>
-        <w:t xml:space="preserve">, §11.4.124/§11.4.114) — commit</w:t>
-      </w:r>
-      <w:r>
-        <w:t xml:space="preserve"> </w:t>
-      </w:r>
-      <w:r>
-        <w:rPr>
-          <w:rStyle w:val="VerbatimChar"/>
-        </w:rPr>
-        <w:t xml:space="preserve">94246322</w:t>
-      </w:r>
-      <w:r>
-        <w:t xml:space="preserve"> </w:t>
-      </w:r>
-      <w:r>
-        <w:t xml:space="preserve">had mistakenly deleted 18 camelCase hook re-export shims (bundled into a dist/ cleanup), breaking 4 test files; restored from git history (byte-match) + fixed a latent</w:t>
-      </w:r>
-      <w:r>
-        <w:t xml:space="preserve"> </w:t>
-      </w:r>
-      <w:r>
-        <w:rPr>
-          <w:rStyle w:val="VerbatimChar"/>
-        </w:rPr>
-        <w:t xml:space="preserve">refetch</w:t>
+        <w:t xml:space="preserve">74b94bb8</w:t>
+      </w:r>
+      <w:r>
+        <w:t xml:space="preserve">) — vendored tokens byte-identical; FIXED the theme-toggle bug (store never wrote a DOM class → base dark palette stuck; now</w:t>
+      </w:r>
+      <w:r>
+        <w:t xml:space="preserve"> </w:t>
+      </w:r>
+      <w:r>
+        <w:rPr>
+          <w:rStyle w:val="VerbatimChar"/>
+        </w:rPr>
+        <w:t xml:space="preserve">applyThemeClass</w:t>
+      </w:r>
+      <w:r>
+        <w:t xml:space="preserve"> </w:t>
+      </w:r>
+      <w:r>
+        <w:t xml:space="preserve">writes</w:t>
+      </w:r>
+      <w:r>
+        <w:t xml:space="preserve"> </w:t>
+      </w:r>
+      <w:r>
+        <w:rPr>
+          <w:rStyle w:val="VerbatimChar"/>
+        </w:rPr>
+        <w:t xml:space="preserve">.light</w:t>
+      </w:r>
+      <w:r>
+        <w:t xml:space="preserve">/</w:t>
+      </w:r>
+      <w:r>
+        <w:rPr>
+          <w:rStyle w:val="VerbatimChar"/>
+        </w:rPr>
+        <w:t xml:space="preserve">.dark</w:t>
+      </w:r>
+      <w:r>
+        <w:t xml:space="preserve"> </w:t>
+      </w:r>
+      <w:r>
+        <w:t xml:space="preserve">+</w:t>
+      </w:r>
+      <w:r>
+        <w:t xml:space="preserve"> </w:t>
+      </w:r>
+      <w:r>
+        <w:rPr>
+          <w:rStyle w:val="VerbatimChar"/>
+        </w:rPr>
+        <w:t xml:space="preserve">data-theme</w:t>
+      </w:r>
+      <w:r>
+        <w:t xml:space="preserve"> </w:t>
+      </w:r>
+      <w:r>
+        <w:t xml:space="preserve">from setTheme/toggleTheme/onRehydrate, + jsdom unit test). Pixel-proven: light vs dark = 98.96% differ.</w:t>
+      </w:r>
+      <w:r>
+        <w:t xml:space="preserve"> </w:t>
+      </w:r>
+      <w:r>
+        <w:t xml:space="preserve">-</w:t>
+      </w:r>
+      <w:r>
+        <w:t xml:space="preserve"> </w:t>
+      </w:r>
+      <w:r>
+        <w:rPr>
+          <w:b/>
+          <w:bCs/>
+        </w:rPr>
+        <w:t xml:space="preserve">dashboard</w:t>
+      </w:r>
+      <w:r>
+        <w:t xml:space="preserve"> </w:t>
+      </w:r>
+      <w:r>
+        <w:t xml:space="preserve">(</w:t>
+      </w:r>
+      <w:r>
+        <w:rPr>
+          <w:rStyle w:val="VerbatimChar"/>
+        </w:rPr>
+        <w:t xml:space="preserve">4c6b201d</w:t>
+      </w:r>
+      <w:r>
+        <w:t xml:space="preserve"> </w:t>
+      </w:r>
+      <w:r>
+        <w:t xml:space="preserve">base +</w:t>
+      </w:r>
+      <w:r>
+        <w:t xml:space="preserve"> </w:t>
+      </w:r>
+      <w:r>
+        <w:rPr>
+          <w:rStyle w:val="VerbatimChar"/>
+        </w:rPr>
+        <w:t xml:space="preserve">444b68f4</w:t>
+      </w:r>
+      <w:r>
+        <w:t xml:space="preserve"> </w:t>
+      </w:r>
+      <w:r>
+        <w:t xml:space="preserve">completion) — vendored tokens; added a REAL light/dark theme (</w:t>
+      </w:r>
+      <w:r>
+        <w:rPr>
+          <w:rStyle w:val="VerbatimChar"/>
+        </w:rPr>
+        <w:t xml:space="preserve">theme.ts</w:t>
+      </w:r>
+      <w:r>
+        <w:t xml:space="preserve">: data-theme + localStorage + prefers-color-scheme seed,</w:t>
+      </w:r>
+      <w:r>
+        <w:t xml:space="preserve"> </w:t>
+      </w:r>
+      <w:r>
+        <w:rPr>
+          <w:rStyle w:val="VerbatimChar"/>
+        </w:rPr>
+        <w:t xml:space="preserve">initTheme</w:t>
+      </w:r>
+      <w:r>
+        <w:t xml:space="preserve"> </w:t>
+      </w:r>
+      <w:r>
+        <w:t xml:space="preserve">before render) + header toggle; repointed ALL 27 live screen-hex across 8 screens →</w:t>
+      </w:r>
+      <w:r>
+        <w:t xml:space="preserve"> </w:t>
+      </w:r>
+      <w:r>
+        <w:rPr>
+          <w:rStyle w:val="VerbatimChar"/>
+        </w:rPr>
+        <w:t xml:space="preserve">var(--token)</w:t>
+      </w:r>
+      <w:r>
+        <w:t xml:space="preserve"> </w:t>
+      </w:r>
+      <w:r>
+        <w:t xml:space="preserve">(9 justified fixed brand-chrome hex kept in the header). Controller test-covered (</w:t>
+      </w:r>
+      <w:r>
+        <w:rPr>
+          <w:rStyle w:val="VerbatimChar"/>
+        </w:rPr>
+        <w:t xml:space="preserve">theme.test.tsx</w:t>
+      </w:r>
+      <w:r>
+        <w:t xml:space="preserve"> </w:t>
+      </w:r>
+      <w:r>
+        <w:t xml:space="preserve">13 +</w:t>
+      </w:r>
+      <w:r>
+        <w:t xml:space="preserve"> </w:t>
+      </w:r>
+      <w:r>
+        <w:rPr>
+          <w:rStyle w:val="VerbatimChar"/>
+        </w:rPr>
+        <w:t xml:space="preserve">AppShell.test.tsx</w:t>
+      </w:r>
+      <w:r>
+        <w:t xml:space="preserve"> </w:t>
+      </w:r>
+      <w:r>
+        <w:t xml:space="preserve">RTL). test:run 107, e2e:hostrender 45 (both themes, self-validated oracles), card</w:t>
+      </w:r>
+      <w:r>
+        <w:t xml:space="preserve"> </w:t>
+      </w:r>
+      <w:r>
+        <w:rPr>
+          <w:rStyle w:val="VerbatimChar"/>
+        </w:rPr>
+        <w:t xml:space="preserve">#ffffff</w:t>
       </w:r>
       <w:r>
         <w:t xml:space="preserve">→</w:t>
@@ -2236,562 +2685,320 @@
         <w:rPr>
           <w:rStyle w:val="VerbatimChar"/>
         </w:rPr>
-        <w:t xml:space="preserve">refetchStats</w:t>
-      </w:r>
-      <w:r>
-        <w:t xml:space="preserve"> </w:t>
-      </w:r>
-      <w:r>
-        <w:t xml:space="preserve">ReferenceError; vitest 4-fail→9-pass/36.</w:t>
-      </w:r>
-      <w:r>
-        <w:t xml:space="preserve"> </w:t>
-      </w:r>
-      <w:r>
-        <w:t xml:space="preserve">-</w:t>
-      </w:r>
-      <w:r>
-        <w:t xml:space="preserve"> </w:t>
-      </w:r>
-      <w:r>
-        <w:rPr>
-          <w:b/>
-          <w:bCs/>
-        </w:rPr>
-        <w:t xml:space="preserve">Typecheck gate fixed</w:t>
-      </w:r>
-      <w:r>
-        <w:t xml:space="preserve"> </w:t>
-      </w:r>
-      <w:r>
-        <w:t xml:space="preserve">(</w:t>
-      </w:r>
-      <w:r>
-        <w:rPr>
-          <w:rStyle w:val="VerbatimChar"/>
-        </w:rPr>
-        <w:t xml:space="preserve">94fb10a2</w:t>
-      </w:r>
-      <w:r>
-        <w:t xml:space="preserve">, §11.4.120) —</w:t>
-      </w:r>
-      <w:r>
-        <w:t xml:space="preserve"> </w:t>
-      </w:r>
-      <w:r>
-        <w:rPr>
-          <w:rStyle w:val="VerbatimChar"/>
-        </w:rPr>
-        <w:t xml:space="preserve">tsconfig.node.json</w:t>
-      </w:r>
-      <w:r>
-        <w:t xml:space="preserve"> </w:t>
-      </w:r>
-      <w:r>
-        <w:t xml:space="preserve">invalid project-ref made</w:t>
-      </w:r>
-      <w:r>
-        <w:t xml:space="preserve"> </w:t>
-      </w:r>
-      <w:r>
-        <w:rPr>
-          <w:rStyle w:val="VerbatimChar"/>
-        </w:rPr>
-        <w:t xml:space="preserve">tsc</w:t>
-      </w:r>
-      <w:r>
-        <w:t xml:space="preserve"> </w:t>
-      </w:r>
-      <w:r>
-        <w:t xml:space="preserve">bail before checking source (why the refetch bug slipped); now functional, surfaces 118 pre-existing errors (tracked follow-up; ~57 on the dead unrouted pages).</w:t>
-      </w:r>
-      <w:r>
-        <w:t xml:space="preserve"> </w:t>
-      </w:r>
-      <w:r>
-        <w:t xml:space="preserve">-</w:t>
-      </w:r>
-      <w:r>
-        <w:t xml:space="preserve"> </w:t>
-      </w:r>
-      <w:r>
-        <w:rPr>
-          <w:b/>
-          <w:bCs/>
-        </w:rPr>
-        <w:t xml:space="preserve">Guard-hook false-positive root-caused</w:t>
-      </w:r>
-      <w:r>
-        <w:t xml:space="preserve"> </w:t>
-      </w:r>
-      <w:r>
-        <w:t xml:space="preserve">(</w:t>
-      </w:r>
-      <w:r>
-        <w:rPr>
-          <w:rStyle w:val="VerbatimChar"/>
-        </w:rPr>
-        <w:t xml:space="preserve">6466edc2</w:t>
-      </w:r>
-      <w:r>
-        <w:t xml:space="preserve">, §11.4.102) — the §11.4.109 PreToolUse guard’s OUTER regex spans any</w:t>
-      </w:r>
-      <w:r>
-        <w:t xml:space="preserve"> </w:t>
-      </w:r>
-      <w:r>
-        <w:rPr>
-          <w:rStyle w:val="VerbatimChar"/>
-        </w:rPr>
-        <w:t xml:space="preserve">git</w:t>
-      </w:r>
-      <w:r>
-        <w:t xml:space="preserve">…</w:t>
-      </w:r>
-      <w:r>
-        <w:rPr>
-          <w:rStyle w:val="VerbatimChar"/>
-        </w:rPr>
-        <w:t xml:space="preserve">push</w:t>
-      </w:r>
-      <w:r>
-        <w:t xml:space="preserve"> </w:t>
-      </w:r>
-      <w:r>
-        <w:t xml:space="preserve">across newlines + INNER matches any</w:t>
-      </w:r>
-      <w:r>
-        <w:t xml:space="preserve"> </w:t>
-      </w:r>
-      <w:r>
-        <w:rPr>
-          <w:rStyle w:val="VerbatimChar"/>
-        </w:rPr>
-        <w:t xml:space="preserve">-f</w:t>
-      </w:r>
-      <w:r>
-        <w:t xml:space="preserve"> </w:t>
-      </w:r>
-      <w:r>
-        <w:t xml:space="preserve">including benign flags → blocks legitimate multi-line commits. Fail-closed (safe). Fix deferred to §11.4.26 constitution workflow (evidence + validated proposal in FINDINGS.md).</w:t>
-      </w:r>
-    </w:p>
-    <w:bookmarkEnd w:id="10"/>
-    <w:bookmarkStart w:id="11" w:name="X45782095b5547133a4a93e662fd402e4a2de808"/>
-    <w:p>
-      <w:pPr>
-        <w:pStyle w:val="Heading3"/>
-      </w:pPr>
-      <w:r>
-        <w:t xml:space="preserve">Latest session (2026-07-09) — Constitution e60cbde adoption + UI/UX/OpenDesign audit</w:t>
+        <w:t xml:space="preserve">#020817</w:t>
+      </w:r>
+      <w:r>
+        <w:t xml:space="preserve"> </w:t>
+      </w:r>
+      <w:r>
+        <w:t xml:space="preserve">dark-surface pixel proof.</w:t>
       </w:r>
     </w:p>
     <w:p>
       <w:pPr>
-        <w:pStyle w:val="FirstParagraph"/>
-      </w:pPr>
-      <w:r>
-        <w:t xml:space="preserve">Operator directives this session: (1) fetch+pull latest constitution submodule + nested deps, adopt all new tech/rules ASAP; (2) continue the endless autonomous loop with 3-4 parallel subagents on real evidence, no bluff; (3) answer whether Helix OTA has OpenDesign-refined production UI on all platforms.</w:t>
+        <w:pStyle w:val="BodyText"/>
+      </w:pPr>
+      <w:r>
+        <w:rPr>
+          <w:b/>
+          <w:bCs/>
+        </w:rPr>
+        <w:t xml:space="preserve">Hardening landed alongside:</w:t>
+      </w:r>
+      <w:r>
+        <w:t xml:space="preserve"> </w:t>
+      </w:r>
+      <w:r>
+        <w:t xml:space="preserve">-</w:t>
+      </w:r>
+      <w:r>
+        <w:t xml:space="preserve"> </w:t>
+      </w:r>
+      <w:r>
+        <w:rPr>
+          <w:b/>
+          <w:bCs/>
+        </w:rPr>
+        <w:t xml:space="preserve">UI-surface audit + WCAG contrast</w:t>
+      </w:r>
+      <w:r>
+        <w:t xml:space="preserve"> </w:t>
+      </w:r>
+      <w:r>
+        <w:t xml:space="preserve">(</w:t>
+      </w:r>
+      <w:r>
+        <w:rPr>
+          <w:rStyle w:val="VerbatimChar"/>
+        </w:rPr>
+        <w:t xml:space="preserve">961ec31c</w:t>
+      </w:r>
+      <w:r>
+        <w:t xml:space="preserve">) — ota-manager+dashboard ADOPTED, server N/A, Android agents N/A/headless; measured contrast fails: dark</w:t>
+      </w:r>
+      <w:r>
+        <w:t xml:space="preserve"> </w:t>
+      </w:r>
+      <w:r>
+        <w:rPr>
+          <w:rStyle w:val="VerbatimChar"/>
+        </w:rPr>
+        <w:t xml:space="preserve">--danger</w:t>
+      </w:r>
+      <w:r>
+        <w:t xml:space="preserve"> </w:t>
+      </w:r>
+      <w:r>
+        <w:t xml:space="preserve">2.00:1, light</w:t>
+      </w:r>
+      <w:r>
+        <w:t xml:space="preserve"> </w:t>
+      </w:r>
+      <w:r>
+        <w:rPr>
+          <w:rStyle w:val="VerbatimChar"/>
+        </w:rPr>
+        <w:t xml:space="preserve">--warn</w:t>
+      </w:r>
+      <w:r>
+        <w:t xml:space="preserve"> </w:t>
+      </w:r>
+      <w:r>
+        <w:t xml:space="preserve">1.92:1,</w:t>
+      </w:r>
+      <w:r>
+        <w:t xml:space="preserve"> </w:t>
+      </w:r>
+      <w:r>
+        <w:rPr>
+          <w:rStyle w:val="VerbatimChar"/>
+        </w:rPr>
+        <w:t xml:space="preserve">--success</w:t>
+      </w:r>
+      <w:r>
+        <w:t xml:space="preserve"> </w:t>
+      </w:r>
+      <w:r>
+        <w:t xml:space="preserve">text 3.1:1 (proposed re-vendor recorded, NOT applied).</w:t>
+      </w:r>
+      <w:r>
+        <w:t xml:space="preserve"> </w:t>
+      </w:r>
+      <w:r>
+        <w:t xml:space="preserve">-</w:t>
+      </w:r>
+      <w:r>
+        <w:t xml:space="preserve"> </w:t>
+      </w:r>
+      <w:r>
+        <w:rPr>
+          <w:b/>
+          <w:bCs/>
+        </w:rPr>
+        <w:t xml:space="preserve">ota-manager RED-suite restored</w:t>
+      </w:r>
+      <w:r>
+        <w:t xml:space="preserve"> </w:t>
+      </w:r>
+      <w:r>
+        <w:t xml:space="preserve">(</w:t>
+      </w:r>
+      <w:r>
+        <w:rPr>
+          <w:rStyle w:val="VerbatimChar"/>
+        </w:rPr>
+        <w:t xml:space="preserve">28ce6fd6</w:t>
+      </w:r>
+      <w:r>
+        <w:t xml:space="preserve">, §11.4.124/§11.4.114) — commit</w:t>
+      </w:r>
+      <w:r>
+        <w:t xml:space="preserve"> </w:t>
+      </w:r>
+      <w:r>
+        <w:rPr>
+          <w:rStyle w:val="VerbatimChar"/>
+        </w:rPr>
+        <w:t xml:space="preserve">94246322</w:t>
+      </w:r>
+      <w:r>
+        <w:t xml:space="preserve"> </w:t>
+      </w:r>
+      <w:r>
+        <w:t xml:space="preserve">had mistakenly deleted 18 camelCase hook re-export shims (bundled into a dist/ cleanup), breaking 4 test files; restored from git history (byte-match) + fixed a latent</w:t>
+      </w:r>
+      <w:r>
+        <w:t xml:space="preserve"> </w:t>
+      </w:r>
+      <w:r>
+        <w:rPr>
+          <w:rStyle w:val="VerbatimChar"/>
+        </w:rPr>
+        <w:t xml:space="preserve">refetch</w:t>
+      </w:r>
+      <w:r>
+        <w:t xml:space="preserve">→</w:t>
+      </w:r>
+      <w:r>
+        <w:rPr>
+          <w:rStyle w:val="VerbatimChar"/>
+        </w:rPr>
+        <w:t xml:space="preserve">refetchStats</w:t>
+      </w:r>
+      <w:r>
+        <w:t xml:space="preserve"> </w:t>
+      </w:r>
+      <w:r>
+        <w:t xml:space="preserve">ReferenceError; vitest 4-fail→9-pass/36.</w:t>
+      </w:r>
+      <w:r>
+        <w:t xml:space="preserve"> </w:t>
+      </w:r>
+      <w:r>
+        <w:t xml:space="preserve">-</w:t>
+      </w:r>
+      <w:r>
+        <w:t xml:space="preserve"> </w:t>
+      </w:r>
+      <w:r>
+        <w:rPr>
+          <w:b/>
+          <w:bCs/>
+        </w:rPr>
+        <w:t xml:space="preserve">Typecheck gate fixed</w:t>
+      </w:r>
+      <w:r>
+        <w:t xml:space="preserve"> </w:t>
+      </w:r>
+      <w:r>
+        <w:t xml:space="preserve">(</w:t>
+      </w:r>
+      <w:r>
+        <w:rPr>
+          <w:rStyle w:val="VerbatimChar"/>
+        </w:rPr>
+        <w:t xml:space="preserve">94fb10a2</w:t>
+      </w:r>
+      <w:r>
+        <w:t xml:space="preserve">, §11.4.120) —</w:t>
+      </w:r>
+      <w:r>
+        <w:t xml:space="preserve"> </w:t>
+      </w:r>
+      <w:r>
+        <w:rPr>
+          <w:rStyle w:val="VerbatimChar"/>
+        </w:rPr>
+        <w:t xml:space="preserve">tsconfig.node.json</w:t>
+      </w:r>
+      <w:r>
+        <w:t xml:space="preserve"> </w:t>
+      </w:r>
+      <w:r>
+        <w:t xml:space="preserve">invalid project-ref made</w:t>
+      </w:r>
+      <w:r>
+        <w:t xml:space="preserve"> </w:t>
+      </w:r>
+      <w:r>
+        <w:rPr>
+          <w:rStyle w:val="VerbatimChar"/>
+        </w:rPr>
+        <w:t xml:space="preserve">tsc</w:t>
+      </w:r>
+      <w:r>
+        <w:t xml:space="preserve"> </w:t>
+      </w:r>
+      <w:r>
+        <w:t xml:space="preserve">bail before checking source (why the refetch bug slipped); now functional, surfaces 118 pre-existing errors (tracked follow-up; ~57 on the dead unrouted pages).</w:t>
+      </w:r>
+      <w:r>
+        <w:t xml:space="preserve"> </w:t>
+      </w:r>
+      <w:r>
+        <w:t xml:space="preserve">-</w:t>
+      </w:r>
+      <w:r>
+        <w:t xml:space="preserve"> </w:t>
+      </w:r>
+      <w:r>
+        <w:rPr>
+          <w:b/>
+          <w:bCs/>
+        </w:rPr>
+        <w:t xml:space="preserve">Guard-hook false-positive root-caused</w:t>
+      </w:r>
+      <w:r>
+        <w:t xml:space="preserve"> </w:t>
+      </w:r>
+      <w:r>
+        <w:t xml:space="preserve">(</w:t>
+      </w:r>
+      <w:r>
+        <w:rPr>
+          <w:rStyle w:val="VerbatimChar"/>
+        </w:rPr>
+        <w:t xml:space="preserve">6466edc2</w:t>
+      </w:r>
+      <w:r>
+        <w:t xml:space="preserve">, §11.4.102) — the §11.4.109 PreToolUse guard’s OUTER regex spans any</w:t>
+      </w:r>
+      <w:r>
+        <w:t xml:space="preserve"> </w:t>
+      </w:r>
+      <w:r>
+        <w:rPr>
+          <w:rStyle w:val="VerbatimChar"/>
+        </w:rPr>
+        <w:t xml:space="preserve">git</w:t>
+      </w:r>
+      <w:r>
+        <w:t xml:space="preserve">…</w:t>
+      </w:r>
+      <w:r>
+        <w:rPr>
+          <w:rStyle w:val="VerbatimChar"/>
+        </w:rPr>
+        <w:t xml:space="preserve">push</w:t>
+      </w:r>
+      <w:r>
+        <w:t xml:space="preserve"> </w:t>
+      </w:r>
+      <w:r>
+        <w:t xml:space="preserve">across newlines + INNER matches any</w:t>
+      </w:r>
+      <w:r>
+        <w:t xml:space="preserve"> </w:t>
+      </w:r>
+      <w:r>
+        <w:rPr>
+          <w:rStyle w:val="VerbatimChar"/>
+        </w:rPr>
+        <w:t xml:space="preserve">-f</w:t>
+      </w:r>
+      <w:r>
+        <w:t xml:space="preserve"> </w:t>
+      </w:r>
+      <w:r>
+        <w:t xml:space="preserve">including benign flags → blocks legitimate multi-line commits. Fail-closed (safe). Fix deferred to §11.4.26 constitution workflow (evidence + validated proposal in FINDINGS.md).</w:t>
+      </w:r>
+    </w:p>
+    <w:bookmarkEnd w:id="11"/>
+    <w:bookmarkStart w:id="12" w:name="X45782095b5547133a4a93e662fd402e4a2de808"/>
+    <w:p>
+      <w:pPr>
+        <w:pStyle w:val="Heading3"/>
+      </w:pPr>
+      <w:r>
+        <w:t xml:space="preserve">Latest session (2026-07-09) — Constitution e60cbde adoption + UI/UX/OpenDesign audit</w:t>
       </w:r>
     </w:p>
     <w:p>
       <w:pPr>
-        <w:pStyle w:val="BodyText"/>
-      </w:pPr>
-      <w:r>
-        <w:t xml:space="preserve">Landed + pushed 4/4 FF (no force §11.4.113), commits</w:t>
-      </w:r>
-      <w:r>
-        <w:t xml:space="preserve"> </w:t>
-      </w:r>
-      <w:r>
-        <w:rPr>
-          <w:rStyle w:val="VerbatimChar"/>
-        </w:rPr>
-        <w:t xml:space="preserve">bb3b4189</w:t>
-      </w:r>
-      <w:r>
-        <w:t xml:space="preserve"> </w:t>
-      </w:r>
-      <w:r>
-        <w:t xml:space="preserve">(semgrep meta-test deletion, split off by a</w:t>
-      </w:r>
-      <w:r>
-        <w:t xml:space="preserve"> </w:t>
-      </w:r>
-      <w:r>
-        <w:rPr>
-          <w:rStyle w:val="VerbatimChar"/>
-        </w:rPr>
-        <w:t xml:space="preserve">git add</w:t>
-      </w:r>
-      <w:r>
-        <w:t xml:space="preserve"> </w:t>
-      </w:r>
-      <w:r>
-        <w:t xml:space="preserve">pathspec fatal) +</w:t>
-      </w:r>
-      <w:r>
-        <w:t xml:space="preserve"> </w:t>
-      </w:r>
-      <w:r>
-        <w:rPr>
-          <w:rStyle w:val="VerbatimChar"/>
-        </w:rPr>
-        <w:t xml:space="preserve">634fcb50</w:t>
-      </w:r>
-      <w:r>
-        <w:t xml:space="preserve"> </w:t>
-      </w:r>
-      <w:r>
-        <w:t xml:space="preserve">(main batch, 29 files +3485/−110):</w:t>
-      </w:r>
-      <w:r>
-        <w:t xml:space="preserve"> </w:t>
-      </w:r>
-      <w:r>
-        <w:t xml:space="preserve">-</w:t>
-      </w:r>
-      <w:r>
-        <w:t xml:space="preserve"> </w:t>
-      </w:r>
-      <w:r>
-        <w:rPr>
-          <w:b/>
-          <w:bCs/>
-        </w:rPr>
-        <w:t xml:space="preserve">Constitution</w:t>
-      </w:r>
-      <w:r>
-        <w:t xml:space="preserve"> </w:t>
-      </w:r>
-      <w:r>
-        <w:rPr>
-          <w:rStyle w:val="VerbatimChar"/>
-        </w:rPr>
-        <w:t xml:space="preserve">fc4e9b8→e60cbde</w:t>
-      </w:r>
-      <w:r>
-        <w:t xml:space="preserve"> </w:t>
-      </w:r>
-      <w:r>
-        <w:t xml:space="preserve">(59 commits); nested engines pulled (token_optimizer</w:t>
-      </w:r>
-      <w:r>
-        <w:t xml:space="preserve"> </w:t>
-      </w:r>
-      <w:r>
-        <w:t xml:space="preserve">@c0591b5</w:t>
-      </w:r>
-      <w:r>
-        <w:t xml:space="preserve">, session_orchestrator</w:t>
-      </w:r>
-      <w:r>
-        <w:t xml:space="preserve"> </w:t>
-      </w:r>
-      <w:r>
-        <w:t xml:space="preserve">@6961c99</w:t>
-      </w:r>
-      <w:r>
-        <w:t xml:space="preserve">). Parent pointer bumped.</w:t>
-      </w:r>
-      <w:r>
-        <w:t xml:space="preserve"> </w:t>
-      </w:r>
-      <w:r>
-        <w:t xml:space="preserve">-</w:t>
-      </w:r>
-      <w:r>
-        <w:t xml:space="preserve"> </w:t>
-      </w:r>
-      <w:r>
-        <w:rPr>
-          <w:b/>
-          <w:bCs/>
-        </w:rPr>
-        <w:t xml:space="preserve">Carriers</w:t>
-      </w:r>
-      <w:r>
-        <w:t xml:space="preserve"> </w:t>
-      </w:r>
-      <w:r>
-        <w:t xml:space="preserve">CLAUDE/AGENTS/GEMINI (.md+HTML+PDF §11.4.65): appended §11.4.167-174, 176-186, §12.12 (pure append, 0 deletions).</w:t>
-      </w:r>
-      <w:r>
-        <w:t xml:space="preserve"> </w:t>
-      </w:r>
-      <w:r>
-        <w:t xml:space="preserve">-</w:t>
-      </w:r>
-      <w:r>
-        <w:t xml:space="preserve"> </w:t>
-      </w:r>
-      <w:r>
-        <w:rPr>
-          <w:b/>
-          <w:bCs/>
-        </w:rPr>
-        <w:t xml:space="preserve">§11.4.166 REPEALED reconciliation</w:t>
-      </w:r>
-      <w:r>
-        <w:t xml:space="preserve"> </w:t>
-      </w:r>
-      <w:r>
-        <w:t xml:space="preserve">(§11.4.120, not fake-pass): removed CM-SEMGREP-WIRED gate + CM-COVENANT-114-166 propagation +</w:t>
-      </w:r>
-      <w:r>
-        <w:t xml:space="preserve"> </w:t>
-      </w:r>
-      <w:r>
-        <w:rPr>
-          <w:rStyle w:val="VerbatimChar"/>
-        </w:rPr>
-        <w:t xml:space="preserve">_semgrep_scan_check</w:t>
-      </w:r>
-      <w:r>
-        <w:t xml:space="preserve"> </w:t>
-      </w:r>
-      <w:r>
-        <w:t xml:space="preserve">in commit_all.sh + the semgrep meta-test;</w:t>
-      </w:r>
-      <w:r>
-        <w:t xml:space="preserve"> </w:t>
-      </w:r>
-      <w:r>
-        <w:rPr>
-          <w:b/>
-          <w:bCs/>
-        </w:rPr>
-        <w:t xml:space="preserve">added</w:t>
-      </w:r>
-      <w:r>
-        <w:t xml:space="preserve"> </w:t>
-      </w:r>
-      <w:r>
-        <w:t xml:space="preserve">propagation gates 167-174/176-186/§12.12 to pre_build.</w:t>
-      </w:r>
-      <w:r>
-        <w:t xml:space="preserve"> </w:t>
-      </w:r>
-      <w:r>
-        <w:t xml:space="preserve">-</w:t>
-      </w:r>
-      <w:r>
-        <w:t xml:space="preserve"> </w:t>
-      </w:r>
-      <w:r>
-        <w:rPr>
-          <w:b/>
-          <w:bCs/>
-        </w:rPr>
-        <w:t xml:space="preserve">§11.4.109 anti-forgetting</w:t>
-      </w:r>
-      <w:r>
-        <w:t xml:space="preserve"> </w:t>
-      </w:r>
-      <w:r>
-        <w:t xml:space="preserve">wired:</w:t>
-      </w:r>
-      <w:r>
-        <w:t xml:space="preserve"> </w:t>
-      </w:r>
-      <w:r>
-        <w:rPr>
-          <w:rStyle w:val="VerbatimChar"/>
-        </w:rPr>
-        <w:t xml:space="preserve">.claude/settings.json</w:t>
-      </w:r>
-      <w:r>
-        <w:t xml:space="preserve"> </w:t>
-      </w:r>
-      <w:r>
-        <w:t xml:space="preserve">PreToolUse guard-hook (blocks force-push/sudo/host-power/raw-emulator at the tool boundary) +</w:t>
-      </w:r>
-      <w:r>
-        <w:t xml:space="preserve"> </w:t>
-      </w:r>
-      <w:r>
-        <w:rPr>
-          <w:rStyle w:val="VerbatimChar"/>
-        </w:rPr>
-        <w:t xml:space="preserve">docs/AGENT_GUARDRAILS.md</w:t>
-      </w:r>
-      <w:r>
-        <w:t xml:space="preserve"> </w:t>
-      </w:r>
-      <w:r>
-        <w:t xml:space="preserve">(preamble+checklist) + renamed guard meta-test (26/26 bluff-proof).</w:t>
-      </w:r>
-      <w:r>
-        <w:t xml:space="preserve"> </w:t>
-      </w:r>
-      <w:r>
-        <w:t xml:space="preserve">-</w:t>
-      </w:r>
-      <w:r>
-        <w:t xml:space="preserve"> </w:t>
-      </w:r>
-      <w:r>
-        <w:rPr>
-          <w:b/>
-          <w:bCs/>
-        </w:rPr>
-        <w:t xml:space="preserve">Fixes:</w:t>
-      </w:r>
-      <w:r>
-        <w:t xml:space="preserve"> </w:t>
-      </w:r>
-      <w:r>
-        <w:rPr>
-          <w:rStyle w:val="VerbatimChar"/>
-        </w:rPr>
-        <w:t xml:space="preserve">coverage_extra_test.go</w:t>
-      </w:r>
-      <w:r>
-        <w:t xml:space="preserve"> </w:t>
-      </w:r>
-      <w:r>
-        <w:t xml:space="preserve">execStubMu mutex → ETXTBSY fork+exec fd race (golang/go#22315; 20/20 -count, 10× -race clean);</w:t>
-      </w:r>
-      <w:r>
-        <w:t xml:space="preserve"> </w:t>
-      </w:r>
-      <w:r>
-        <w:rPr>
-          <w:rStyle w:val="VerbatimChar"/>
-        </w:rPr>
-        <w:t xml:space="preserve">guard_benchmark_baseline.sh</w:t>
-      </w:r>
-      <w:r>
-        <w:t xml:space="preserve"> </w:t>
-      </w:r>
-      <w:r>
-        <w:t xml:space="preserve">GUARD-SKIP when benchstat absent (regression 9/9);</w:t>
-      </w:r>
-      <w:r>
-        <w:t xml:space="preserve"> </w:t>
-      </w:r>
-      <w:r>
-        <w:rPr>
-          <w:rStyle w:val="VerbatimChar"/>
-        </w:rPr>
-        <w:t xml:space="preserve">export_docs.sh</w:t>
-      </w:r>
-      <w:r>
-        <w:t xml:space="preserve"> </w:t>
-      </w:r>
-      <w:r>
-        <w:t xml:space="preserve">+weasyprint PDF engine (pandoc 3.10 EXIT-0, genuine PDF 1.7 — a haiku delta-reviewer’s NO-GO on this was</w:t>
-      </w:r>
-      <w:r>
-        <w:t xml:space="preserve"> </w:t>
-      </w:r>
-      <w:r>
-        <w:rPr>
-          <w:b/>
-          <w:bCs/>
-        </w:rPr>
-        <w:t xml:space="preserve">refuted by captured same-conditions evidence</w:t>
-      </w:r>
-      <w:r>
-        <w:t xml:space="preserve"> </w:t>
-      </w:r>
-      <w:r>
-        <w:t xml:space="preserve">per §11.4.7, see</w:t>
-      </w:r>
-      <w:r>
-        <w:t xml:space="preserve"> </w:t>
-      </w:r>
-      <w:r>
-        <w:rPr>
-          <w:rStyle w:val="VerbatimChar"/>
-        </w:rPr>
-        <w:t xml:space="preserve">qa-results/delta_review_20260709/refutation.md</w:t>
-      </w:r>
-      <w:r>
-        <w:t xml:space="preserve">).</w:t>
-      </w:r>
-      <w:r>
-        <w:t xml:space="preserve"> </w:t>
-      </w:r>
-      <w:r>
-        <w:t xml:space="preserve">-</w:t>
-      </w:r>
-      <w:r>
-        <w:t xml:space="preserve"> </w:t>
-      </w:r>
-      <w:r>
-        <w:rPr>
-          <w:b/>
-          <w:bCs/>
-        </w:rPr>
-        <w:t xml:space="preserve">UI/UX audit answer (</w:t>
-      </w:r>
-      <w:r>
-        <w:rPr>
-          <w:rStyle w:val="VerbatimChar"/>
-          <w:b/>
-          <w:bCs/>
-        </w:rPr>
-        <w:t xml:space="preserve">docs/research/ui_ux_opendesign_audit_20260709/FINDINGS.md</w:t>
-      </w:r>
-      <w:r>
-        <w:rPr>
-          <w:b/>
-          <w:bCs/>
-        </w:rPr>
-        <w:t xml:space="preserve">):</w:t>
-      </w:r>
-      <w:r>
-        <w:t xml:space="preserve"> </w:t>
-      </w:r>
-      <w:r>
-        <w:t xml:space="preserve">NO — Helix OTA is NOT OpenDesign-refined. TWO React frontends exist (</w:t>
-      </w:r>
-      <w:r>
-        <w:rPr>
-          <w:rStyle w:val="VerbatimChar"/>
-        </w:rPr>
-        <w:t xml:space="preserve">clients/ota-manager</w:t>
-      </w:r>
-      <w:r>
-        <w:t xml:space="preserve"> </w:t>
-      </w:r>
-      <w:r>
-        <w:t xml:space="preserve">shadcn/Tauri;</w:t>
-      </w:r>
-      <w:r>
-        <w:t xml:space="preserve"> </w:t>
-      </w:r>
-      <w:r>
-        <w:rPr>
-          <w:rStyle w:val="VerbatimChar"/>
-        </w:rPr>
-        <w:t xml:space="preserve">dashboard</w:t>
-      </w:r>
-      <w:r>
-        <w:t xml:space="preserve"> </w:t>
-      </w:r>
-      <w:r>
-        <w:t xml:space="preserve">hand-rolled+Playwright/axe); OpenDesign (§11.4.162) not installed in either; host-render visual-proof (§11.4.170) unmet in both. The project CLAUDE.md</w:t>
-      </w:r>
-      <w:r>
-        <w:t xml:space="preserve"> </w:t>
-      </w:r>
-      <w:r>
-        <w:t xml:space="preserve">“§11.4.162 latent”</w:t>
-      </w:r>
-      <w:r>
-        <w:t xml:space="preserve"> </w:t>
-      </w:r>
-      <w:r>
-        <w:t xml:space="preserve">note is stale.</w:t>
-      </w:r>
-      <w:r>
-        <w:t xml:space="preserve"> </w:t>
-      </w:r>
-      <w:r>
-        <w:t xml:space="preserve">- Validation: pre_build PASS, inheritance PASS, regression 9/9, meta 6/6 bluff-proof, device 10× deterministic; independent review GO.</w:t>
+        <w:pStyle w:val="FirstParagraph"/>
+      </w:pPr>
+      <w:r>
+        <w:t xml:space="preserve">Operator directives this session: (1) fetch+pull latest constitution submodule + nested deps, adopt all new tech/rules ASAP; (2) continue the endless autonomous loop with 3-4 parallel subagents on real evidence, no bluff; (3) answer whether Helix OTA has OpenDesign-refined production UI on all platforms.</w:t>
       </w:r>
     </w:p>
     <w:p>
@@ -2799,11 +3006,52 @@
         <w:pStyle w:val="BodyText"/>
       </w:pPr>
       <w:r>
-        <w:rPr>
-          <w:b/>
-          <w:bCs/>
-        </w:rPr>
-        <w:t xml:space="preserve">Three parallel streams COMPLETE (§11.4.147 registry: A/B/C all complete), evidence committed:</w:t>
+        <w:t xml:space="preserve">Landed + pushed 4/4 FF (no force §11.4.113), commits</w:t>
+      </w:r>
+      <w:r>
+        <w:t xml:space="preserve"> </w:t>
+      </w:r>
+      <w:r>
+        <w:rPr>
+          <w:rStyle w:val="VerbatimChar"/>
+        </w:rPr>
+        <w:t xml:space="preserve">bb3b4189</w:t>
+      </w:r>
+      <w:r>
+        <w:t xml:space="preserve"> </w:t>
+      </w:r>
+      <w:r>
+        <w:t xml:space="preserve">(semgrep meta-test deletion, split off by a</w:t>
+      </w:r>
+      <w:r>
+        <w:t xml:space="preserve"> </w:t>
+      </w:r>
+      <w:r>
+        <w:rPr>
+          <w:rStyle w:val="VerbatimChar"/>
+        </w:rPr>
+        <w:t xml:space="preserve">git add</w:t>
+      </w:r>
+      <w:r>
+        <w:t xml:space="preserve"> </w:t>
+      </w:r>
+      <w:r>
+        <w:t xml:space="preserve">pathspec fatal) +</w:t>
+      </w:r>
+      <w:r>
+        <w:t xml:space="preserve"> </w:t>
+      </w:r>
+      <w:r>
+        <w:rPr>
+          <w:rStyle w:val="VerbatimChar"/>
+        </w:rPr>
+        <w:t xml:space="preserve">634fcb50</w:t>
+      </w:r>
+      <w:r>
+        <w:t xml:space="preserve"> </w:t>
+      </w:r>
+      <w:r>
+        <w:t xml:space="preserve">(main batch, 29 files +3485/−110):</w:t>
       </w:r>
       <w:r>
         <w:t xml:space="preserve"> </w:t>
@@ -2819,96 +3067,40 @@
           <w:b/>
           <w:bCs/>
         </w:rPr>
-        <w:t xml:space="preserve">A — new-tech engine adoption</w:t>
-      </w:r>
-      <w:r>
-        <w:t xml:space="preserve"> </w:t>
-      </w:r>
-      <w:r>
-        <w:t xml:space="preserve">→</w:t>
-      </w:r>
-      <w:r>
-        <w:t xml:space="preserve"> </w:t>
-      </w:r>
-      <w:r>
-        <w:rPr>
-          <w:rStyle w:val="VerbatimChar"/>
-        </w:rPr>
-        <w:t xml:space="preserve">docs/research/new_tech_adoption_20260709/ADOPTION_PLAN.md</w:t>
-      </w:r>
-      <w:r>
-        <w:t xml:space="preserve">. Finding (§11.4.6/§11.4.124): server has NO LLM request path today → wiring either engine now = dead code.</w:t>
-      </w:r>
-      <w:r>
-        <w:t xml:space="preserve"> </w:t>
-      </w:r>
-      <w:r>
-        <w:rPr>
-          <w:b/>
-          <w:bCs/>
-        </w:rPr>
-        <w:t xml:space="preserve">token_optimizer</w:t>
-      </w:r>
-      <w:r>
-        <w:t xml:space="preserve"> </w:t>
-      </w:r>
-      <w:r>
-        <w:t xml:space="preserve">= adopt-as-available (first use: deterministic</w:t>
-      </w:r>
-      <w:r>
-        <w:t xml:space="preserve"> </w:t>
-      </w:r>
-      <w:r>
-        <w:rPr>
-          <w:rStyle w:val="VerbatimChar"/>
-        </w:rPr>
-        <w:t xml:space="preserve">log_triage</w:t>
-      </w:r>
-      <w:r>
-        <w:t xml:space="preserve"> </w:t>
-      </w:r>
-      <w:r>
-        <w:t xml:space="preserve">over the §11.4.128 recording corpus at first AI feature);</w:t>
-      </w:r>
-      <w:r>
-        <w:t xml:space="preserve"> </w:t>
-      </w:r>
-      <w:r>
-        <w:rPr>
-          <w:b/>
-          <w:bCs/>
-        </w:rPr>
-        <w:t xml:space="preserve">session_orchestrator</w:t>
-      </w:r>
-      <w:r>
-        <w:t xml:space="preserve"> </w:t>
-      </w:r>
-      <w:r>
-        <w:t xml:space="preserve">= needs-review (its</w:t>
-      </w:r>
-      <w:r>
-        <w:t xml:space="preserve"> </w:t>
-      </w:r>
-      <w:r>
-        <w:rPr>
-          <w:rStyle w:val="VerbatimChar"/>
-        </w:rPr>
-        <w:t xml:space="preserve">claim</w:t>
-      </w:r>
-      <w:r>
-        <w:t xml:space="preserve">+</w:t>
-      </w:r>
-      <w:r>
-        <w:rPr>
-          <w:rStyle w:val="VerbatimChar"/>
-        </w:rPr>
-        <w:t xml:space="preserve">scheduler</w:t>
-      </w:r>
-      <w:r>
-        <w:t xml:space="preserve"> </w:t>
-      </w:r>
-      <w:r>
-        <w:t xml:space="preserve">are the §11.4.176/§11.4.119 single-owner device-claim primitive — a prototype target for parallel device testing). Both build+test GREEN. Neither operator-blocked. §11.4.141 token-efficiency wins are separate Claude-Code config.</w:t>
+        <w:t xml:space="preserve">Constitution</w:t>
+      </w:r>
+      <w:r>
+        <w:t xml:space="preserve"> </w:t>
+      </w:r>
+      <w:r>
+        <w:rPr>
+          <w:rStyle w:val="VerbatimChar"/>
+        </w:rPr>
+        <w:t xml:space="preserve">fc4e9b8→e60cbde</w:t>
+      </w:r>
+      <w:r>
+        <w:t xml:space="preserve"> </w:t>
+      </w:r>
+      <w:r>
+        <w:t xml:space="preserve">(59 commits); nested engines pulled (token_optimizer</w:t>
+      </w:r>
+      <w:r>
+        <w:t xml:space="preserve"> </w:t>
+      </w:r>
+      <w:r>
+        <w:t xml:space="preserve">@c0591b5</w:t>
+      </w:r>
+      <w:r>
+        <w:t xml:space="preserve">, session_orchestrator</w:t>
+      </w:r>
+      <w:r>
+        <w:t xml:space="preserve"> </w:t>
+      </w:r>
+      <w:r>
+        <w:t xml:space="preserve">@6961c99</w:t>
+      </w:r>
+      <w:r>
+        <w:t xml:space="preserve">). Parent pointer bumped.</w:t>
       </w:r>
       <w:r>
         <w:t xml:space="preserve"> </w:t>
@@ -2924,125 +3116,13 @@
           <w:b/>
           <w:bCs/>
         </w:rPr>
-        <w:t xml:space="preserve">B — server health</w:t>
-      </w:r>
-      <w:r>
-        <w:t xml:space="preserve"> </w:t>
-      </w:r>
-      <w:r>
-        <w:t xml:space="preserve">→</w:t>
-      </w:r>
-      <w:r>
-        <w:t xml:space="preserve"> </w:t>
-      </w:r>
-      <w:r>
-        <w:rPr>
-          <w:rStyle w:val="VerbatimChar"/>
-        </w:rPr>
-        <w:t xml:space="preserve">docs/research/server_health_20260709/REMEDIATION.md</w:t>
-      </w:r>
-      <w:r>
-        <w:t xml:space="preserve">.</w:t>
-      </w:r>
-      <w:r>
-        <w:t xml:space="preserve"> </w:t>
-      </w:r>
-      <w:r>
-        <w:rPr>
-          <w:rStyle w:val="VerbatimChar"/>
-        </w:rPr>
-        <w:t xml:space="preserve">go build</w:t>
-      </w:r>
-      <w:r>
-        <w:t xml:space="preserve">/</w:t>
-      </w:r>
-      <w:r>
-        <w:rPr>
-          <w:rStyle w:val="VerbatimChar"/>
-        </w:rPr>
-        <w:t xml:space="preserve">vet</w:t>
-      </w:r>
-      <w:r>
-        <w:t xml:space="preserve">/</w:t>
-      </w:r>
-      <w:r>
-        <w:rPr>
-          <w:rStyle w:val="VerbatimChar"/>
-        </w:rPr>
-        <w:t xml:space="preserve">gofmt</w:t>
-      </w:r>
-      <w:r>
-        <w:t xml:space="preserve">/</w:t>
-      </w:r>
-      <w:r>
-        <w:rPr>
-          <w:rStyle w:val="VerbatimChar"/>
-        </w:rPr>
-        <w:t xml:space="preserve">test</w:t>
-      </w:r>
-      <w:r>
-        <w:t xml:space="preserve"> </w:t>
-      </w:r>
-      <w:r>
-        <w:t xml:space="preserve">all GREEN, 15/15 pkgs (forced</w:t>
-      </w:r>
-      <w:r>
-        <w:t xml:space="preserve"> </w:t>
-      </w:r>
-      <w:r>
-        <w:rPr>
-          <w:rStyle w:val="VerbatimChar"/>
-        </w:rPr>
-        <w:t xml:space="preserve">-count=1</w:t>
-      </w:r>
-      <w:r>
-        <w:t xml:space="preserve"> </w:t>
-      </w:r>
-      <w:r>
-        <w:t xml:space="preserve">non-cached).</w:t>
-      </w:r>
-      <w:r>
-        <w:t xml:space="preserve"> </w:t>
-      </w:r>
-      <w:r>
-        <w:rPr>
-          <w:b/>
-          <w:bCs/>
-        </w:rPr>
-        <w:t xml:space="preserve">No fix required</w:t>
-      </w:r>
-      <w:r>
-        <w:t xml:space="preserve"> </w:t>
-      </w:r>
-      <w:r>
-        <w:t xml:space="preserve">(zero-finding tree; correctly changed nothing per §11.4.102). Tracked gap unchanged:</w:t>
-      </w:r>
-      <w:r>
-        <w:t xml:space="preserve"> </w:t>
-      </w:r>
-      <w:r>
-        <w:rPr>
-          <w:rStyle w:val="VerbatimChar"/>
-        </w:rPr>
-        <w:t xml:space="preserve">internal/api/manager-dist</w:t>
-      </w:r>
-      <w:r>
-        <w:t xml:space="preserve"> </w:t>
-      </w:r>
-      <w:r>
-        <w:t xml:space="preserve">has no</w:t>
-      </w:r>
-      <w:r>
-        <w:t xml:space="preserve"> </w:t>
-      </w:r>
-      <w:r>
-        <w:rPr>
-          <w:rStyle w:val="VerbatimChar"/>
-        </w:rPr>
-        <w:t xml:space="preserve">_test.go</w:t>
-      </w:r>
-      <w:r>
-        <w:t xml:space="preserve">.</w:t>
+        <w:t xml:space="preserve">Carriers</w:t>
+      </w:r>
+      <w:r>
+        <w:t xml:space="preserve"> </w:t>
+      </w:r>
+      <w:r>
+        <w:t xml:space="preserve">CLAUDE/AGENTS/GEMINI (.md+HTML+PDF §11.4.65): appended §11.4.167-174, 176-186, §12.12 (pure append, 0 deletions).</w:t>
       </w:r>
       <w:r>
         <w:t xml:space="preserve"> </w:t>
@@ -3058,71 +3138,267 @@
           <w:b/>
           <w:bCs/>
         </w:rPr>
-        <w:t xml:space="preserve">C — OpenDesign + §11.4.170 harness</w:t>
-      </w:r>
-      <w:r>
-        <w:t xml:space="preserve"> </w:t>
-      </w:r>
-      <w:r>
-        <w:t xml:space="preserve">→</w:t>
-      </w:r>
-      <w:r>
-        <w:t xml:space="preserve"> </w:t>
-      </w:r>
-      <w:r>
-        <w:rPr>
-          <w:rStyle w:val="VerbatimChar"/>
-        </w:rPr>
-        <w:t xml:space="preserve">docs/research/ui_ux_opendesign_audit_20260709/OPENDESIGN_PLAN.md</w:t>
-      </w:r>
-      <w:r>
-        <w:t xml:space="preserve">. Recommends</w:t>
-      </w:r>
-      <w:r>
-        <w:t xml:space="preserve"> </w:t>
-      </w:r>
-      <w:r>
-        <w:rPr>
-          <w:rStyle w:val="VerbatimChar"/>
-          <w:b/>
-          <w:bCs/>
+        <w:t xml:space="preserve">§11.4.166 REPEALED reconciliation</w:t>
+      </w:r>
+      <w:r>
+        <w:t xml:space="preserve"> </w:t>
+      </w:r>
+      <w:r>
+        <w:t xml:space="preserve">(§11.4.120, not fake-pass): removed CM-SEMGREP-WIRED gate + CM-COVENANT-114-166 propagation +</w:t>
+      </w:r>
+      <w:r>
+        <w:t xml:space="preserve"> </w:t>
+      </w:r>
+      <w:r>
+        <w:rPr>
+          <w:rStyle w:val="VerbatimChar"/>
+        </w:rPr>
+        <w:t xml:space="preserve">_semgrep_scan_check</w:t>
+      </w:r>
+      <w:r>
+        <w:t xml:space="preserve"> </w:t>
+      </w:r>
+      <w:r>
+        <w:t xml:space="preserve">in commit_all.sh + the semgrep meta-test;</w:t>
+      </w:r>
+      <w:r>
+        <w:t xml:space="preserve"> </w:t>
+      </w:r>
+      <w:r>
+        <w:rPr>
+          <w:b/>
+          <w:bCs/>
+        </w:rPr>
+        <w:t xml:space="preserve">added</w:t>
+      </w:r>
+      <w:r>
+        <w:t xml:space="preserve"> </w:t>
+      </w:r>
+      <w:r>
+        <w:t xml:space="preserve">propagation gates 167-174/176-186/§12.12 to pre_build.</w:t>
+      </w:r>
+      <w:r>
+        <w:t xml:space="preserve"> </w:t>
+      </w:r>
+      <w:r>
+        <w:t xml:space="preserve">-</w:t>
+      </w:r>
+      <w:r>
+        <w:t xml:space="preserve"> </w:t>
+      </w:r>
+      <w:r>
+        <w:rPr>
+          <w:b/>
+          <w:bCs/>
+        </w:rPr>
+        <w:t xml:space="preserve">§11.4.109 anti-forgetting</w:t>
+      </w:r>
+      <w:r>
+        <w:t xml:space="preserve"> </w:t>
+      </w:r>
+      <w:r>
+        <w:t xml:space="preserve">wired:</w:t>
+      </w:r>
+      <w:r>
+        <w:t xml:space="preserve"> </w:t>
+      </w:r>
+      <w:r>
+        <w:rPr>
+          <w:rStyle w:val="VerbatimChar"/>
+        </w:rPr>
+        <w:t xml:space="preserve">.claude/settings.json</w:t>
+      </w:r>
+      <w:r>
+        <w:t xml:space="preserve"> </w:t>
+      </w:r>
+      <w:r>
+        <w:t xml:space="preserve">PreToolUse guard-hook (blocks force-push/sudo/host-power/raw-emulator at the tool boundary) +</w:t>
+      </w:r>
+      <w:r>
+        <w:t xml:space="preserve"> </w:t>
+      </w:r>
+      <w:r>
+        <w:rPr>
+          <w:rStyle w:val="VerbatimChar"/>
+        </w:rPr>
+        <w:t xml:space="preserve">docs/AGENT_GUARDRAILS.md</w:t>
+      </w:r>
+      <w:r>
+        <w:t xml:space="preserve"> </w:t>
+      </w:r>
+      <w:r>
+        <w:t xml:space="preserve">(preamble+checklist) + renamed guard meta-test (26/26 bluff-proof).</w:t>
+      </w:r>
+      <w:r>
+        <w:t xml:space="preserve"> </w:t>
+      </w:r>
+      <w:r>
+        <w:t xml:space="preserve">-</w:t>
+      </w:r>
+      <w:r>
+        <w:t xml:space="preserve"> </w:t>
+      </w:r>
+      <w:r>
+        <w:rPr>
+          <w:b/>
+          <w:bCs/>
+        </w:rPr>
+        <w:t xml:space="preserve">Fixes:</w:t>
+      </w:r>
+      <w:r>
+        <w:t xml:space="preserve"> </w:t>
+      </w:r>
+      <w:r>
+        <w:rPr>
+          <w:rStyle w:val="VerbatimChar"/>
+        </w:rPr>
+        <w:t xml:space="preserve">coverage_extra_test.go</w:t>
+      </w:r>
+      <w:r>
+        <w:t xml:space="preserve"> </w:t>
+      </w:r>
+      <w:r>
+        <w:t xml:space="preserve">execStubMu mutex → ETXTBSY fork+exec fd race (golang/go#22315; 20/20 -count, 10× -race clean);</w:t>
+      </w:r>
+      <w:r>
+        <w:t xml:space="preserve"> </w:t>
+      </w:r>
+      <w:r>
+        <w:rPr>
+          <w:rStyle w:val="VerbatimChar"/>
+        </w:rPr>
+        <w:t xml:space="preserve">guard_benchmark_baseline.sh</w:t>
+      </w:r>
+      <w:r>
+        <w:t xml:space="preserve"> </w:t>
+      </w:r>
+      <w:r>
+        <w:t xml:space="preserve">GUARD-SKIP when benchstat absent (regression 9/9);</w:t>
+      </w:r>
+      <w:r>
+        <w:t xml:space="preserve"> </w:t>
+      </w:r>
+      <w:r>
+        <w:rPr>
+          <w:rStyle w:val="VerbatimChar"/>
+        </w:rPr>
+        <w:t xml:space="preserve">export_docs.sh</w:t>
+      </w:r>
+      <w:r>
+        <w:t xml:space="preserve"> </w:t>
+      </w:r>
+      <w:r>
+        <w:t xml:space="preserve">+weasyprint PDF engine (pandoc 3.10 EXIT-0, genuine PDF 1.7 — a haiku delta-reviewer’s NO-GO on this was</w:t>
+      </w:r>
+      <w:r>
+        <w:t xml:space="preserve"> </w:t>
+      </w:r>
+      <w:r>
+        <w:rPr>
+          <w:b/>
+          <w:bCs/>
+        </w:rPr>
+        <w:t xml:space="preserve">refuted by captured same-conditions evidence</w:t>
+      </w:r>
+      <w:r>
+        <w:t xml:space="preserve"> </w:t>
+      </w:r>
+      <w:r>
+        <w:t xml:space="preserve">per §11.4.7, see</w:t>
+      </w:r>
+      <w:r>
+        <w:t xml:space="preserve"> </w:t>
+      </w:r>
+      <w:r>
+        <w:rPr>
+          <w:rStyle w:val="VerbatimChar"/>
+        </w:rPr>
+        <w:t xml:space="preserve">qa-results/delta_review_20260709/refutation.md</w:t>
+      </w:r>
+      <w:r>
+        <w:t xml:space="preserve">).</w:t>
+      </w:r>
+      <w:r>
+        <w:t xml:space="preserve"> </w:t>
+      </w:r>
+      <w:r>
+        <w:t xml:space="preserve">-</w:t>
+      </w:r>
+      <w:r>
+        <w:t xml:space="preserve"> </w:t>
+      </w:r>
+      <w:r>
+        <w:rPr>
+          <w:b/>
+          <w:bCs/>
+        </w:rPr>
+        <w:t xml:space="preserve">UI/UX audit answer (</w:t>
+      </w:r>
+      <w:r>
+        <w:rPr>
+          <w:rStyle w:val="VerbatimChar"/>
+          <w:b/>
+          <w:bCs/>
+        </w:rPr>
+        <w:t xml:space="preserve">docs/research/ui_ux_opendesign_audit_20260709/FINDINGS.md</w:t>
+      </w:r>
+      <w:r>
+        <w:rPr>
+          <w:b/>
+          <w:bCs/>
+        </w:rPr>
+        <w:t xml:space="preserve">):</w:t>
+      </w:r>
+      <w:r>
+        <w:t xml:space="preserve"> </w:t>
+      </w:r>
+      <w:r>
+        <w:t xml:space="preserve">NO — Helix OTA is NOT OpenDesign-refined. TWO React frontends exist (</w:t>
+      </w:r>
+      <w:r>
+        <w:rPr>
+          <w:rStyle w:val="VerbatimChar"/>
         </w:rPr>
         <w:t xml:space="preserve">clients/ota-manager</w:t>
       </w:r>
       <w:r>
-        <w:rPr>
-          <w:b/>
-          <w:bCs/>
-        </w:rPr>
-        <w:t xml:space="preserve"> </w:t>
-      </w:r>
-      <w:r>
-        <w:rPr>
-          <w:b/>
-          <w:bCs/>
-        </w:rPr>
-        <w:t xml:space="preserve">canonical</w:t>
-      </w:r>
-      <w:r>
-        <w:t xml:space="preserve"> </w:t>
-      </w:r>
-      <w:r>
-        <w:t xml:space="preserve">(already has the token/dark-mode arch OpenDesign feeds; dashboard would be a rebuild; dashboard’s Playwright/axe e2e is portable). §11.4.170 harness spec: Storybook 8 + addon-themes × Playwright</w:t>
-      </w:r>
-      <w:r>
-        <w:t xml:space="preserve"> </w:t>
-      </w:r>
-      <w:r>
-        <w:rPr>
-          <w:rStyle w:val="VerbatimChar"/>
-        </w:rPr>
-        <w:t xml:space="preserve">toHaveScreenshot()</w:t>
-      </w:r>
-      <w:r>
-        <w:t xml:space="preserve"> </w:t>
-      </w:r>
-      <w:r>
-        <w:t xml:space="preserve">golden-diff + Tesseract-OCR layout oracle, self-validated golden fixtures (§11.4.107(10)).</w:t>
+        <w:t xml:space="preserve"> </w:t>
+      </w:r>
+      <w:r>
+        <w:t xml:space="preserve">shadcn/Tauri;</w:t>
+      </w:r>
+      <w:r>
+        <w:t xml:space="preserve"> </w:t>
+      </w:r>
+      <w:r>
+        <w:rPr>
+          <w:rStyle w:val="VerbatimChar"/>
+        </w:rPr>
+        <w:t xml:space="preserve">dashboard</w:t>
+      </w:r>
+      <w:r>
+        <w:t xml:space="preserve"> </w:t>
+      </w:r>
+      <w:r>
+        <w:t xml:space="preserve">hand-rolled+Playwright/axe); OpenDesign (§11.4.162) not installed in either; host-render visual-proof (§11.4.170) unmet in both. The project CLAUDE.md</w:t>
+      </w:r>
+      <w:r>
+        <w:t xml:space="preserve"> </w:t>
+      </w:r>
+      <w:r>
+        <w:t xml:space="preserve">“§11.4.162 latent”</w:t>
+      </w:r>
+      <w:r>
+        <w:t xml:space="preserve"> </w:t>
+      </w:r>
+      <w:r>
+        <w:t xml:space="preserve">note is stale.</w:t>
+      </w:r>
+      <w:r>
+        <w:t xml:space="preserve"> </w:t>
+      </w:r>
+      <w:r>
+        <w:t xml:space="preserve">- Validation: pre_build PASS, inheritance PASS, regression 9/9, meta 6/6 bluff-proof, device 10× deterministic; independent review GO.</w:t>
       </w:r>
     </w:p>
     <w:p>
@@ -3134,99 +3410,326 @@
           <w:b/>
           <w:bCs/>
         </w:rPr>
-        <w:t xml:space="preserve">BOTH OPERATOR DECISIONS RESOLVED (2026-07-09):</w:t>
-      </w:r>
-      <w:r>
-        <w:t xml:space="preserve"> </w:t>
-      </w:r>
-      <w:r>
-        <w:t xml:space="preserve">1.</w:t>
-      </w:r>
-      <w:r>
-        <w:t xml:space="preserve"> </w:t>
-      </w:r>
-      <w:r>
-        <w:rPr>
-          <w:b/>
-          <w:bCs/>
-        </w:rPr>
-        <w:t xml:space="preserve">Canonical frontend → KEEP + IMPROVE BOTH</w:t>
-      </w:r>
-      <w:r>
-        <w:t xml:space="preserve"> </w:t>
-      </w:r>
-      <w:r>
-        <w:t xml:space="preserve">(</w:t>
-      </w:r>
-      <w:r>
-        <w:rPr>
-          <w:rStyle w:val="VerbatimChar"/>
+        <w:t xml:space="preserve">Three parallel streams COMPLETE (§11.4.147 registry: A/B/C all complete), evidence committed:</w:t>
+      </w:r>
+      <w:r>
+        <w:t xml:space="preserve"> </w:t>
+      </w:r>
+      <w:r>
+        <w:t xml:space="preserve">-</w:t>
+      </w:r>
+      <w:r>
+        <w:t xml:space="preserve"> </w:t>
+      </w:r>
+      <w:r>
+        <w:rPr>
+          <w:b/>
+          <w:bCs/>
+        </w:rPr>
+        <w:t xml:space="preserve">A — new-tech engine adoption</w:t>
+      </w:r>
+      <w:r>
+        <w:t xml:space="preserve"> </w:t>
+      </w:r>
+      <w:r>
+        <w:t xml:space="preserve">→</w:t>
+      </w:r>
+      <w:r>
+        <w:t xml:space="preserve"> </w:t>
+      </w:r>
+      <w:r>
+        <w:rPr>
+          <w:rStyle w:val="VerbatimChar"/>
+        </w:rPr>
+        <w:t xml:space="preserve">docs/research/new_tech_adoption_20260709/ADOPTION_PLAN.md</w:t>
+      </w:r>
+      <w:r>
+        <w:t xml:space="preserve">. Finding (§11.4.6/§11.4.124): server has NO LLM request path today → wiring either engine now = dead code.</w:t>
+      </w:r>
+      <w:r>
+        <w:t xml:space="preserve"> </w:t>
+      </w:r>
+      <w:r>
+        <w:rPr>
+          <w:b/>
+          <w:bCs/>
+        </w:rPr>
+        <w:t xml:space="preserve">token_optimizer</w:t>
+      </w:r>
+      <w:r>
+        <w:t xml:space="preserve"> </w:t>
+      </w:r>
+      <w:r>
+        <w:t xml:space="preserve">= adopt-as-available (first use: deterministic</w:t>
+      </w:r>
+      <w:r>
+        <w:t xml:space="preserve"> </w:t>
+      </w:r>
+      <w:r>
+        <w:rPr>
+          <w:rStyle w:val="VerbatimChar"/>
+        </w:rPr>
+        <w:t xml:space="preserve">log_triage</w:t>
+      </w:r>
+      <w:r>
+        <w:t xml:space="preserve"> </w:t>
+      </w:r>
+      <w:r>
+        <w:t xml:space="preserve">over the §11.4.128 recording corpus at first AI feature);</w:t>
+      </w:r>
+      <w:r>
+        <w:t xml:space="preserve"> </w:t>
+      </w:r>
+      <w:r>
+        <w:rPr>
+          <w:b/>
+          <w:bCs/>
+        </w:rPr>
+        <w:t xml:space="preserve">session_orchestrator</w:t>
+      </w:r>
+      <w:r>
+        <w:t xml:space="preserve"> </w:t>
+      </w:r>
+      <w:r>
+        <w:t xml:space="preserve">= needs-review (its</w:t>
+      </w:r>
+      <w:r>
+        <w:t xml:space="preserve"> </w:t>
+      </w:r>
+      <w:r>
+        <w:rPr>
+          <w:rStyle w:val="VerbatimChar"/>
+        </w:rPr>
+        <w:t xml:space="preserve">claim</w:t>
+      </w:r>
+      <w:r>
+        <w:t xml:space="preserve">+</w:t>
+      </w:r>
+      <w:r>
+        <w:rPr>
+          <w:rStyle w:val="VerbatimChar"/>
+        </w:rPr>
+        <w:t xml:space="preserve">scheduler</w:t>
+      </w:r>
+      <w:r>
+        <w:t xml:space="preserve"> </w:t>
+      </w:r>
+      <w:r>
+        <w:t xml:space="preserve">are the §11.4.176/§11.4.119 single-owner device-claim primitive — a prototype target for parallel device testing). Both build+test GREEN. Neither operator-blocked. §11.4.141 token-efficiency wins are separate Claude-Code config.</w:t>
+      </w:r>
+      <w:r>
+        <w:t xml:space="preserve"> </w:t>
+      </w:r>
+      <w:r>
+        <w:t xml:space="preserve">-</w:t>
+      </w:r>
+      <w:r>
+        <w:t xml:space="preserve"> </w:t>
+      </w:r>
+      <w:r>
+        <w:rPr>
+          <w:b/>
+          <w:bCs/>
+        </w:rPr>
+        <w:t xml:space="preserve">B — server health</w:t>
+      </w:r>
+      <w:r>
+        <w:t xml:space="preserve"> </w:t>
+      </w:r>
+      <w:r>
+        <w:t xml:space="preserve">→</w:t>
+      </w:r>
+      <w:r>
+        <w:t xml:space="preserve"> </w:t>
+      </w:r>
+      <w:r>
+        <w:rPr>
+          <w:rStyle w:val="VerbatimChar"/>
+        </w:rPr>
+        <w:t xml:space="preserve">docs/research/server_health_20260709/REMEDIATION.md</w:t>
+      </w:r>
+      <w:r>
+        <w:t xml:space="preserve">.</w:t>
+      </w:r>
+      <w:r>
+        <w:t xml:space="preserve"> </w:t>
+      </w:r>
+      <w:r>
+        <w:rPr>
+          <w:rStyle w:val="VerbatimChar"/>
+        </w:rPr>
+        <w:t xml:space="preserve">go build</w:t>
+      </w:r>
+      <w:r>
+        <w:t xml:space="preserve">/</w:t>
+      </w:r>
+      <w:r>
+        <w:rPr>
+          <w:rStyle w:val="VerbatimChar"/>
+        </w:rPr>
+        <w:t xml:space="preserve">vet</w:t>
+      </w:r>
+      <w:r>
+        <w:t xml:space="preserve">/</w:t>
+      </w:r>
+      <w:r>
+        <w:rPr>
+          <w:rStyle w:val="VerbatimChar"/>
+        </w:rPr>
+        <w:t xml:space="preserve">gofmt</w:t>
+      </w:r>
+      <w:r>
+        <w:t xml:space="preserve">/</w:t>
+      </w:r>
+      <w:r>
+        <w:rPr>
+          <w:rStyle w:val="VerbatimChar"/>
+        </w:rPr>
+        <w:t xml:space="preserve">test</w:t>
+      </w:r>
+      <w:r>
+        <w:t xml:space="preserve"> </w:t>
+      </w:r>
+      <w:r>
+        <w:t xml:space="preserve">all GREEN, 15/15 pkgs (forced</w:t>
+      </w:r>
+      <w:r>
+        <w:t xml:space="preserve"> </w:t>
+      </w:r>
+      <w:r>
+        <w:rPr>
+          <w:rStyle w:val="VerbatimChar"/>
+        </w:rPr>
+        <w:t xml:space="preserve">-count=1</w:t>
+      </w:r>
+      <w:r>
+        <w:t xml:space="preserve"> </w:t>
+      </w:r>
+      <w:r>
+        <w:t xml:space="preserve">non-cached).</w:t>
+      </w:r>
+      <w:r>
+        <w:t xml:space="preserve"> </w:t>
+      </w:r>
+      <w:r>
+        <w:rPr>
+          <w:b/>
+          <w:bCs/>
+        </w:rPr>
+        <w:t xml:space="preserve">No fix required</w:t>
+      </w:r>
+      <w:r>
+        <w:t xml:space="preserve"> </w:t>
+      </w:r>
+      <w:r>
+        <w:t xml:space="preserve">(zero-finding tree; correctly changed nothing per §11.4.102). Tracked gap unchanged:</w:t>
+      </w:r>
+      <w:r>
+        <w:t xml:space="preserve"> </w:t>
+      </w:r>
+      <w:r>
+        <w:rPr>
+          <w:rStyle w:val="VerbatimChar"/>
+        </w:rPr>
+        <w:t xml:space="preserve">internal/api/manager-dist</w:t>
+      </w:r>
+      <w:r>
+        <w:t xml:space="preserve"> </w:t>
+      </w:r>
+      <w:r>
+        <w:t xml:space="preserve">has no</w:t>
+      </w:r>
+      <w:r>
+        <w:t xml:space="preserve"> </w:t>
+      </w:r>
+      <w:r>
+        <w:rPr>
+          <w:rStyle w:val="VerbatimChar"/>
+        </w:rPr>
+        <w:t xml:space="preserve">_test.go</w:t>
+      </w:r>
+      <w:r>
+        <w:t xml:space="preserve">.</w:t>
+      </w:r>
+      <w:r>
+        <w:t xml:space="preserve"> </w:t>
+      </w:r>
+      <w:r>
+        <w:t xml:space="preserve">-</w:t>
+      </w:r>
+      <w:r>
+        <w:t xml:space="preserve"> </w:t>
+      </w:r>
+      <w:r>
+        <w:rPr>
+          <w:b/>
+          <w:bCs/>
+        </w:rPr>
+        <w:t xml:space="preserve">C — OpenDesign + §11.4.170 harness</w:t>
+      </w:r>
+      <w:r>
+        <w:t xml:space="preserve"> </w:t>
+      </w:r>
+      <w:r>
+        <w:t xml:space="preserve">→</w:t>
+      </w:r>
+      <w:r>
+        <w:t xml:space="preserve"> </w:t>
+      </w:r>
+      <w:r>
+        <w:rPr>
+          <w:rStyle w:val="VerbatimChar"/>
+        </w:rPr>
+        <w:t xml:space="preserve">docs/research/ui_ux_opendesign_audit_20260709/OPENDESIGN_PLAN.md</w:t>
+      </w:r>
+      <w:r>
+        <w:t xml:space="preserve">. Recommends</w:t>
+      </w:r>
+      <w:r>
+        <w:t xml:space="preserve"> </w:t>
+      </w:r>
+      <w:r>
+        <w:rPr>
+          <w:rStyle w:val="VerbatimChar"/>
+          <w:b/>
+          <w:bCs/>
         </w:rPr>
         <w:t xml:space="preserve">clients/ota-manager</w:t>
       </w:r>
       <w:r>
-        <w:t xml:space="preserve"> </w:t>
-      </w:r>
-      <w:r>
-        <w:t xml:space="preserve">+</w:t>
-      </w:r>
-      <w:r>
-        <w:t xml:space="preserve"> </w:t>
-      </w:r>
-      <w:r>
-        <w:rPr>
-          <w:rStyle w:val="VerbatimChar"/>
-        </w:rPr>
-        <w:t xml:space="preserve">dashboard</w:t>
-      </w:r>
-      <w:r>
-        <w:t xml:space="preserve">). Nothing retired (§11.4.122 satisfied). OpenDesign adopted across both.</w:t>
-      </w:r>
-      <w:r>
-        <w:t xml:space="preserve"> </w:t>
-      </w:r>
-      <w:r>
-        <w:t xml:space="preserve">2.</w:t>
-      </w:r>
-      <w:r>
-        <w:t xml:space="preserve"> </w:t>
-      </w:r>
-      <w:r>
-        <w:rPr>
-          <w:b/>
-          <w:bCs/>
-        </w:rPr>
-        <w:t xml:space="preserve">OpenDesign =</w:t>
-      </w:r>
-      <w:r>
-        <w:rPr>
-          <w:b/>
-          <w:bCs/>
-        </w:rPr>
-        <w:t xml:space="preserve"> </w:t>
-      </w:r>
-      <w:r>
-        <w:rPr>
-          <w:rStyle w:val="VerbatimChar"/>
-          <w:b/>
-          <w:bCs/>
-        </w:rPr>
-        <w:t xml:space="preserve">nexu-io/open-design</w:t>
-      </w:r>
-      <w:r>
-        <w:t xml:space="preserve"> </w:t>
-      </w:r>
-      <w:r>
-        <w:t xml:space="preserve">(</w:t>
-      </w:r>
-      <w:r>
-        <w:rPr>
-          <w:rStyle w:val="VerbatimChar"/>
-        </w:rPr>
-        <w:t xml:space="preserve">git@github.com:nexu-io/open-design.git</w:t>
-      </w:r>
-      <w:r>
-        <w:t xml:space="preserve">) CONFIRMED by operator.</w:t>
+        <w:rPr>
+          <w:b/>
+          <w:bCs/>
+        </w:rPr>
+        <w:t xml:space="preserve"> </w:t>
+      </w:r>
+      <w:r>
+        <w:rPr>
+          <w:b/>
+          <w:bCs/>
+        </w:rPr>
+        <w:t xml:space="preserve">canonical</w:t>
+      </w:r>
+      <w:r>
+        <w:t xml:space="preserve"> </w:t>
+      </w:r>
+      <w:r>
+        <w:t xml:space="preserve">(already has the token/dark-mode arch OpenDesign feeds; dashboard would be a rebuild; dashboard’s Playwright/axe e2e is portable). §11.4.170 harness spec: Storybook 8 + addon-themes × Playwright</w:t>
+      </w:r>
+      <w:r>
+        <w:t xml:space="preserve"> </w:t>
+      </w:r>
+      <w:r>
+        <w:rPr>
+          <w:rStyle w:val="VerbatimChar"/>
+        </w:rPr>
+        <w:t xml:space="preserve">toHaveScreenshot()</w:t>
+      </w:r>
+      <w:r>
+        <w:t xml:space="preserve"> </w:t>
+      </w:r>
+      <w:r>
+        <w:t xml:space="preserve">golden-diff + Tesseract-OCR layout oracle, self-validated golden fixtures (§11.4.107(10)).</w:t>
       </w:r>
     </w:p>
     <w:p>
@@ -3238,183 +3741,99 @@
           <w:b/>
           <w:bCs/>
         </w:rPr>
-        <w:t xml:space="preserve">OpenDesign ground truth (W1 evidence,</w:t>
-      </w:r>
-      <w:r>
-        <w:rPr>
-          <w:b/>
-          <w:bCs/>
-        </w:rPr>
-        <w:t xml:space="preserve"> </w:t>
-      </w:r>
-      <w:r>
-        <w:rPr>
-          <w:rStyle w:val="VerbatimChar"/>
-          <w:b/>
-          <w:bCs/>
-        </w:rPr>
-        <w:t xml:space="preserve">docs/research/opendesign_integration_20260709/INTEGRATION_GROUND_TRUTH.md</w:t>
-      </w:r>
-      <w:r>
-        <w:rPr>
-          <w:b/>
-          <w:bCs/>
-        </w:rPr>
-        <w:t xml:space="preserve">):</w:t>
-      </w:r>
-      <w:r>
-        <w:t xml:space="preserve"> </w:t>
-      </w:r>
-      <w:r>
-        <w:t xml:space="preserve">it is NOT a CSS-token npm package — it is a local-first design PRODUCT (Electron +</w:t>
-      </w:r>
-      <w:r>
-        <w:t xml:space="preserve"> </w:t>
-      </w:r>
-      <w:r>
-        <w:rPr>
-          <w:rStyle w:val="VerbatimChar"/>
-        </w:rPr>
-        <w:t xml:space="preserve">od</w:t>
-      </w:r>
-      <w:r>
-        <w:t xml:space="preserve"> </w:t>
-      </w:r>
-      <w:r>
-        <w:t xml:space="preserve">daemon + Next.js UI) exposing itself to coding agents over stdio-MCP +</w:t>
-      </w:r>
-      <w:r>
-        <w:t xml:space="preserve"> </w:t>
-      </w:r>
-      <w:r>
-        <w:rPr>
-          <w:rStyle w:val="VerbatimChar"/>
-        </w:rPr>
-        <w:t xml:space="preserve">od</w:t>
-      </w:r>
-      <w:r>
-        <w:t xml:space="preserve"> </w:t>
-      </w:r>
-      <w:r>
-        <w:t xml:space="preserve">CLI, shipping 153 design-system token packages as static files.</w:t>
-      </w:r>
-      <w:r>
-        <w:t xml:space="preserve"> </w:t>
-      </w:r>
-      <w:r>
-        <w:rPr>
-          <w:b/>
-          <w:bCs/>
-        </w:rPr>
-        <w:t xml:space="preserve">Adoption = combination:</w:t>
-      </w:r>
-      <w:r>
-        <w:t xml:space="preserve"> </w:t>
-      </w:r>
-      <w:r>
-        <w:t xml:space="preserve">(author-time) build daemon + wire its MCP plugin into Claude Code; (build-time, what ships) vendor a design system’s static</w:t>
-      </w:r>
-      <w:r>
-        <w:t xml:space="preserve"> </w:t>
-      </w:r>
-      <w:r>
-        <w:rPr>
-          <w:rStyle w:val="VerbatimChar"/>
-        </w:rPr>
-        <w:t xml:space="preserve">tokens.css</w:t>
-      </w:r>
-      <w:r>
-        <w:t xml:space="preserve"> </w:t>
-      </w:r>
-      <w:r>
-        <w:t xml:space="preserve">(~56</w:t>
-      </w:r>
-      <w:r>
-        <w:t xml:space="preserve"> </w:t>
-      </w:r>
-      <w:r>
-        <w:rPr>
-          <w:rStyle w:val="VerbatimChar"/>
-        </w:rPr>
-        <w:t xml:space="preserve">:root</w:t>
-      </w:r>
-      <w:r>
-        <w:t xml:space="preserve"> </w:t>
-      </w:r>
-      <w:r>
-        <w:t xml:space="preserve">custom props) +</w:t>
-      </w:r>
-      <w:r>
-        <w:t xml:space="preserve"> </w:t>
-      </w:r>
-      <w:r>
-        <w:rPr>
-          <w:rStyle w:val="VerbatimChar"/>
-        </w:rPr>
-        <w:t xml:space="preserve">tailwind-v4.css</w:t>
-      </w:r>
-      <w:r>
-        <w:t xml:space="preserve"> </w:t>
-      </w:r>
-      <w:r>
-        <w:t xml:space="preserve">(Tailwind-v4</w:t>
-      </w:r>
-      <w:r>
-        <w:t xml:space="preserve"> </w:t>
-      </w:r>
-      <w:r>
-        <w:rPr>
-          <w:rStyle w:val="VerbatimChar"/>
-        </w:rPr>
-        <w:t xml:space="preserve">@theme</w:t>
-      </w:r>
-      <w:r>
-        <w:t xml:space="preserve">, matches ota-manager’s Tailwind 4), light+dark first-class. Do NOT consume</w:t>
-      </w:r>
-      <w:r>
-        <w:t xml:space="preserve"> </w:t>
-      </w:r>
-      <w:r>
-        <w:rPr>
-          <w:rStyle w:val="VerbatimChar"/>
-        </w:rPr>
-        <w:t xml:space="preserve">@open-design/components</w:t>
-      </w:r>
-      <w:r>
-        <w:t xml:space="preserve"> </w:t>
-      </w:r>
-      <w:r>
-        <w:t xml:space="preserve">(private, React-18.3.1-pinned ⇒ conflicts with ota-manager React 19). §11.4.74 path: author a</w:t>
-      </w:r>
-      <w:r>
-        <w:t xml:space="preserve"> </w:t>
-      </w:r>
-      <w:r>
-        <w:rPr>
-          <w:rStyle w:val="VerbatimChar"/>
-        </w:rPr>
-        <w:t xml:space="preserve">design-systems/helix-ota/</w:t>
-      </w:r>
-      <w:r>
-        <w:t xml:space="preserve"> </w:t>
-      </w:r>
-      <w:r>
-        <w:t xml:space="preserve">brand package. Verdict NEEDS-REVIEW (heavy product;</w:t>
-      </w:r>
-      <w:r>
-        <w:t xml:space="preserve"> </w:t>
-      </w:r>
-      <w:r>
-        <w:rPr>
-          <w:rStyle w:val="VerbatimChar"/>
-        </w:rPr>
-        <w:t xml:space="preserve">od</w:t>
-      </w:r>
-      <w:r>
-        <w:t xml:space="preserve"> </w:t>
-      </w:r>
-      <w:r>
-        <w:t xml:space="preserve">daemon = network service ⇒ rootless/containerized §11.4.161/§11.4.173; keep React-18 components out).</w:t>
+        <w:t xml:space="preserve">BOTH OPERATOR DECISIONS RESOLVED (2026-07-09):</w:t>
+      </w:r>
+      <w:r>
+        <w:t xml:space="preserve"> </w:t>
+      </w:r>
+      <w:r>
+        <w:t xml:space="preserve">1.</w:t>
+      </w:r>
+      <w:r>
+        <w:t xml:space="preserve"> </w:t>
+      </w:r>
+      <w:r>
+        <w:rPr>
+          <w:b/>
+          <w:bCs/>
+        </w:rPr>
+        <w:t xml:space="preserve">Canonical frontend → KEEP + IMPROVE BOTH</w:t>
+      </w:r>
+      <w:r>
+        <w:t xml:space="preserve"> </w:t>
+      </w:r>
+      <w:r>
+        <w:t xml:space="preserve">(</w:t>
+      </w:r>
+      <w:r>
+        <w:rPr>
+          <w:rStyle w:val="VerbatimChar"/>
+        </w:rPr>
+        <w:t xml:space="preserve">clients/ota-manager</w:t>
+      </w:r>
+      <w:r>
+        <w:t xml:space="preserve"> </w:t>
+      </w:r>
+      <w:r>
+        <w:t xml:space="preserve">+</w:t>
+      </w:r>
+      <w:r>
+        <w:t xml:space="preserve"> </w:t>
+      </w:r>
+      <w:r>
+        <w:rPr>
+          <w:rStyle w:val="VerbatimChar"/>
+        </w:rPr>
+        <w:t xml:space="preserve">dashboard</w:t>
+      </w:r>
+      <w:r>
+        <w:t xml:space="preserve">). Nothing retired (§11.4.122 satisfied). OpenDesign adopted across both.</w:t>
+      </w:r>
+      <w:r>
+        <w:t xml:space="preserve"> </w:t>
+      </w:r>
+      <w:r>
+        <w:t xml:space="preserve">2.</w:t>
+      </w:r>
+      <w:r>
+        <w:t xml:space="preserve"> </w:t>
+      </w:r>
+      <w:r>
+        <w:rPr>
+          <w:b/>
+          <w:bCs/>
+        </w:rPr>
+        <w:t xml:space="preserve">OpenDesign =</w:t>
+      </w:r>
+      <w:r>
+        <w:rPr>
+          <w:b/>
+          <w:bCs/>
+        </w:rPr>
+        <w:t xml:space="preserve"> </w:t>
+      </w:r>
+      <w:r>
+        <w:rPr>
+          <w:rStyle w:val="VerbatimChar"/>
+          <w:b/>
+          <w:bCs/>
+        </w:rPr>
+        <w:t xml:space="preserve">nexu-io/open-design</w:t>
+      </w:r>
+      <w:r>
+        <w:t xml:space="preserve"> </w:t>
+      </w:r>
+      <w:r>
+        <w:t xml:space="preserve">(</w:t>
+      </w:r>
+      <w:r>
+        <w:rPr>
+          <w:rStyle w:val="VerbatimChar"/>
+        </w:rPr>
+        <w:t xml:space="preserve">git@github.com:nexu-io/open-design.git</w:t>
+      </w:r>
+      <w:r>
+        <w:t xml:space="preserve">) CONFIRMED by operator.</w:t>
       </w:r>
     </w:p>
     <w:p>
@@ -3426,124 +3845,183 @@
           <w:b/>
           <w:bCs/>
         </w:rPr>
-        <w:t xml:space="preserve">§11.4.170 host-render harnesses LANDED on BOTH frontends (W2/W3, independent-review GO each):</w:t>
-      </w:r>
-      <w:r>
-        <w:t xml:space="preserve"> </w:t>
-      </w:r>
-      <w:r>
-        <w:t xml:space="preserve">-</w:t>
-      </w:r>
-      <w:r>
-        <w:t xml:space="preserve"> </w:t>
-      </w:r>
-      <w:r>
-        <w:rPr>
-          <w:b/>
-          <w:bCs/>
-        </w:rPr>
-        <w:t xml:space="preserve">ota-manager</w:t>
-      </w:r>
-      <w:r>
-        <w:t xml:space="preserve"> </w:t>
-      </w:r>
-      <w:r>
-        <w:t xml:space="preserve">(</w:t>
-      </w:r>
-      <w:r>
-        <w:rPr>
-          <w:rStyle w:val="VerbatimChar"/>
-        </w:rPr>
-        <w:t xml:space="preserve">docs/qa/20260709-ota-manager-hostrender/</w:t>
-      </w:r>
-      <w:r>
-        <w:t xml:space="preserve">, harness</w:t>
-      </w:r>
-      <w:r>
-        <w:t xml:space="preserve"> </w:t>
-      </w:r>
-      <w:r>
-        <w:rPr>
-          <w:rStyle w:val="VerbatimChar"/>
-        </w:rPr>
-        <w:t xml:space="preserve">clients/ota-manager/visual/</w:t>
-      </w:r>
-      <w:r>
-        <w:t xml:space="preserve">): LoginPage × {light,dark} rendered host-side (Playwright+Vite+Tailwind4+pixelmatch+</w:t>
-      </w:r>
-      <w:r>
-        <w:rPr>
-          <w:b/>
-          <w:bCs/>
-        </w:rPr>
-        <w:t xml:space="preserve">Tesseract OCR</w:t>
-      </w:r>
-      <w:r>
-        <w:t xml:space="preserve">); dual oracle image-diff good 0% / bad flagged both themes + layout oracle flags collapsed-submit; self-validation</w:t>
-      </w:r>
-      <w:r>
-        <w:t xml:space="preserve"> </w:t>
-      </w:r>
-      <w:r>
-        <w:rPr>
-          <w:rStyle w:val="VerbatimChar"/>
-        </w:rPr>
-        <w:t xml:space="preserve">image_diff_analyzer_sound</w:t>
-      </w:r>
-      <w:r>
-        <w:t xml:space="preserve">+</w:t>
-      </w:r>
-      <w:r>
-        <w:rPr>
-          <w:rStyle w:val="VerbatimChar"/>
-        </w:rPr>
-        <w:t xml:space="preserve">layout_analyzer_sound</w:t>
-      </w:r>
-      <w:r>
-        <w:t xml:space="preserve">=true (golden-good/golden-bad §11.4.107(10)); reviewer re-ran byte-identical, GO.</w:t>
-      </w:r>
-      <w:r>
-        <w:t xml:space="preserve"> </w:t>
-      </w:r>
-      <w:r>
-        <w:t xml:space="preserve">-</w:t>
-      </w:r>
-      <w:r>
-        <w:t xml:space="preserve"> </w:t>
-      </w:r>
-      <w:r>
-        <w:rPr>
-          <w:b/>
-          <w:bCs/>
-        </w:rPr>
-        <w:t xml:space="preserve">dashboard</w:t>
-      </w:r>
-      <w:r>
-        <w:t xml:space="preserve"> </w:t>
-      </w:r>
-      <w:r>
-        <w:t xml:space="preserve">(</w:t>
-      </w:r>
-      <w:r>
-        <w:rPr>
-          <w:rStyle w:val="VerbatimChar"/>
-        </w:rPr>
-        <w:t xml:space="preserve">docs/qa/20260709-dashboard-hostrender/</w:t>
-      </w:r>
-      <w:r>
-        <w:t xml:space="preserve">, harness</w:t>
-      </w:r>
-      <w:r>
-        <w:t xml:space="preserve"> </w:t>
-      </w:r>
-      <w:r>
-        <w:rPr>
-          <w:rStyle w:val="VerbatimChar"/>
-        </w:rPr>
-        <w:t xml:space="preserve">dashboard/hostrender/</w:t>
-      </w:r>
-      <w:r>
-        <w:t xml:space="preserve">): Login host-rendered (vite-only, backend-independent), pixelmatch good 0% / bad 13% + layout oracle + committed golden REJECTs mutation; reviewer’s adversarial negative-control (mutation-disabled → self-checks correctly FAIL) proves non-rubber-stamp, GO. Existing suite baselined: vitest 93/93, Playwright 22/1-pre-existing-flake, axe 0 critical/serious.</w:t>
+        <w:t xml:space="preserve">OpenDesign ground truth (W1 evidence,</w:t>
+      </w:r>
+      <w:r>
+        <w:rPr>
+          <w:b/>
+          <w:bCs/>
+        </w:rPr>
+        <w:t xml:space="preserve"> </w:t>
+      </w:r>
+      <w:r>
+        <w:rPr>
+          <w:rStyle w:val="VerbatimChar"/>
+          <w:b/>
+          <w:bCs/>
+        </w:rPr>
+        <w:t xml:space="preserve">docs/research/opendesign_integration_20260709/INTEGRATION_GROUND_TRUTH.md</w:t>
+      </w:r>
+      <w:r>
+        <w:rPr>
+          <w:b/>
+          <w:bCs/>
+        </w:rPr>
+        <w:t xml:space="preserve">):</w:t>
+      </w:r>
+      <w:r>
+        <w:t xml:space="preserve"> </w:t>
+      </w:r>
+      <w:r>
+        <w:t xml:space="preserve">it is NOT a CSS-token npm package — it is a local-first design PRODUCT (Electron +</w:t>
+      </w:r>
+      <w:r>
+        <w:t xml:space="preserve"> </w:t>
+      </w:r>
+      <w:r>
+        <w:rPr>
+          <w:rStyle w:val="VerbatimChar"/>
+        </w:rPr>
+        <w:t xml:space="preserve">od</w:t>
+      </w:r>
+      <w:r>
+        <w:t xml:space="preserve"> </w:t>
+      </w:r>
+      <w:r>
+        <w:t xml:space="preserve">daemon + Next.js UI) exposing itself to coding agents over stdio-MCP +</w:t>
+      </w:r>
+      <w:r>
+        <w:t xml:space="preserve"> </w:t>
+      </w:r>
+      <w:r>
+        <w:rPr>
+          <w:rStyle w:val="VerbatimChar"/>
+        </w:rPr>
+        <w:t xml:space="preserve">od</w:t>
+      </w:r>
+      <w:r>
+        <w:t xml:space="preserve"> </w:t>
+      </w:r>
+      <w:r>
+        <w:t xml:space="preserve">CLI, shipping 153 design-system token packages as static files.</w:t>
+      </w:r>
+      <w:r>
+        <w:t xml:space="preserve"> </w:t>
+      </w:r>
+      <w:r>
+        <w:rPr>
+          <w:b/>
+          <w:bCs/>
+        </w:rPr>
+        <w:t xml:space="preserve">Adoption = combination:</w:t>
+      </w:r>
+      <w:r>
+        <w:t xml:space="preserve"> </w:t>
+      </w:r>
+      <w:r>
+        <w:t xml:space="preserve">(author-time) build daemon + wire its MCP plugin into Claude Code; (build-time, what ships) vendor a design system’s static</w:t>
+      </w:r>
+      <w:r>
+        <w:t xml:space="preserve"> </w:t>
+      </w:r>
+      <w:r>
+        <w:rPr>
+          <w:rStyle w:val="VerbatimChar"/>
+        </w:rPr>
+        <w:t xml:space="preserve">tokens.css</w:t>
+      </w:r>
+      <w:r>
+        <w:t xml:space="preserve"> </w:t>
+      </w:r>
+      <w:r>
+        <w:t xml:space="preserve">(~56</w:t>
+      </w:r>
+      <w:r>
+        <w:t xml:space="preserve"> </w:t>
+      </w:r>
+      <w:r>
+        <w:rPr>
+          <w:rStyle w:val="VerbatimChar"/>
+        </w:rPr>
+        <w:t xml:space="preserve">:root</w:t>
+      </w:r>
+      <w:r>
+        <w:t xml:space="preserve"> </w:t>
+      </w:r>
+      <w:r>
+        <w:t xml:space="preserve">custom props) +</w:t>
+      </w:r>
+      <w:r>
+        <w:t xml:space="preserve"> </w:t>
+      </w:r>
+      <w:r>
+        <w:rPr>
+          <w:rStyle w:val="VerbatimChar"/>
+        </w:rPr>
+        <w:t xml:space="preserve">tailwind-v4.css</w:t>
+      </w:r>
+      <w:r>
+        <w:t xml:space="preserve"> </w:t>
+      </w:r>
+      <w:r>
+        <w:t xml:space="preserve">(Tailwind-v4</w:t>
+      </w:r>
+      <w:r>
+        <w:t xml:space="preserve"> </w:t>
+      </w:r>
+      <w:r>
+        <w:rPr>
+          <w:rStyle w:val="VerbatimChar"/>
+        </w:rPr>
+        <w:t xml:space="preserve">@theme</w:t>
+      </w:r>
+      <w:r>
+        <w:t xml:space="preserve">, matches ota-manager’s Tailwind 4), light+dark first-class. Do NOT consume</w:t>
+      </w:r>
+      <w:r>
+        <w:t xml:space="preserve"> </w:t>
+      </w:r>
+      <w:r>
+        <w:rPr>
+          <w:rStyle w:val="VerbatimChar"/>
+        </w:rPr>
+        <w:t xml:space="preserve">@open-design/components</w:t>
+      </w:r>
+      <w:r>
+        <w:t xml:space="preserve"> </w:t>
+      </w:r>
+      <w:r>
+        <w:t xml:space="preserve">(private, React-18.3.1-pinned ⇒ conflicts with ota-manager React 19). §11.4.74 path: author a</w:t>
+      </w:r>
+      <w:r>
+        <w:t xml:space="preserve"> </w:t>
+      </w:r>
+      <w:r>
+        <w:rPr>
+          <w:rStyle w:val="VerbatimChar"/>
+        </w:rPr>
+        <w:t xml:space="preserve">design-systems/helix-ota/</w:t>
+      </w:r>
+      <w:r>
+        <w:t xml:space="preserve"> </w:t>
+      </w:r>
+      <w:r>
+        <w:t xml:space="preserve">brand package. Verdict NEEDS-REVIEW (heavy product;</w:t>
+      </w:r>
+      <w:r>
+        <w:t xml:space="preserve"> </w:t>
+      </w:r>
+      <w:r>
+        <w:rPr>
+          <w:rStyle w:val="VerbatimChar"/>
+        </w:rPr>
+        <w:t xml:space="preserve">od</w:t>
+      </w:r>
+      <w:r>
+        <w:t xml:space="preserve"> </w:t>
+      </w:r>
+      <w:r>
+        <w:t xml:space="preserve">daemon = network service ⇒ rootless/containerized §11.4.161/§11.4.173; keep React-18 components out).</w:t>
       </w:r>
     </w:p>
     <w:p>
@@ -3555,82 +4033,23 @@
           <w:b/>
           <w:bCs/>
         </w:rPr>
-        <w:t xml:space="preserve">NEW TRACKED BUG (real, surfaced by W2 host-render proof — §11.4.170 working as designed):</w:t>
-      </w:r>
-      <w:r>
-        <w:t xml:space="preserve"> </w:t>
-      </w:r>
-      <w:r>
-        <w:t xml:space="preserve">ota-manager’s</w:t>
-      </w:r>
-      <w:r>
-        <w:t xml:space="preserve"> </w:t>
-      </w:r>
-      <w:r>
-        <w:rPr>
-          <w:rStyle w:val="VerbatimChar"/>
-        </w:rPr>
-        <w:t xml:space="preserve">ui-store</w:t>
-      </w:r>
-      <w:r>
-        <w:t xml:space="preserve"> </w:t>
-      </w:r>
-      <w:r>
-        <w:t xml:space="preserve">theme value is</w:t>
-      </w:r>
-      <w:r>
-        <w:t xml:space="preserve"> </w:t>
-      </w:r>
-      <w:r>
-        <w:rPr>
-          <w:b/>
-          <w:bCs/>
-        </w:rPr>
-        <w:t xml:space="preserve">never wired to a DOM</w:t>
-      </w:r>
-      <w:r>
-        <w:rPr>
-          <w:b/>
-          <w:bCs/>
-        </w:rPr>
-        <w:t xml:space="preserve"> </w:t>
-      </w:r>
-      <w:r>
-        <w:rPr>
-          <w:rStyle w:val="VerbatimChar"/>
-          <w:b/>
-          <w:bCs/>
-        </w:rPr>
-        <w:t xml:space="preserve">.dark</w:t>
-      </w:r>
-      <w:r>
-        <w:rPr>
-          <w:b/>
-          <w:bCs/>
-        </w:rPr>
-        <w:t xml:space="preserve">/</w:t>
-      </w:r>
-      <w:r>
-        <w:rPr>
-          <w:rStyle w:val="VerbatimChar"/>
-          <w:b/>
-          <w:bCs/>
-        </w:rPr>
-        <w:t xml:space="preserve">.light</w:t>
-      </w:r>
-      <w:r>
-        <w:rPr>
-          <w:b/>
-          <w:bCs/>
-        </w:rPr>
-        <w:t xml:space="preserve"> </w:t>
-      </w:r>
-      <w:r>
-        <w:rPr>
-          <w:b/>
-          <w:bCs/>
-        </w:rPr>
-        <w:t xml:space="preserve">class</w:t>
+        <w:t xml:space="preserve">§11.4.170 host-render harnesses LANDED on BOTH frontends (W2/W3, independent-review GO each):</w:t>
+      </w:r>
+      <w:r>
+        <w:t xml:space="preserve"> </w:t>
+      </w:r>
+      <w:r>
+        <w:t xml:space="preserve">-</w:t>
+      </w:r>
+      <w:r>
+        <w:t xml:space="preserve"> </w:t>
+      </w:r>
+      <w:r>
+        <w:rPr>
+          <w:b/>
+          <w:bCs/>
+        </w:rPr>
+        <w:t xml:space="preserve">ota-manager</w:t>
       </w:r>
       <w:r>
         <w:t xml:space="preserve"> </w:t>
@@ -3642,67 +4061,96 @@
         <w:rPr>
           <w:rStyle w:val="VerbatimChar"/>
         </w:rPr>
-        <w:t xml:space="preserve">ui-store.ts:27-32</w:t>
-      </w:r>
-      <w:r>
-        <w:t xml:space="preserve"> </w:t>
-      </w:r>
-      <w:r>
-        <w:t xml:space="preserve">mutates zustand only;</w:t>
-      </w:r>
-      <w:r>
-        <w:t xml:space="preserve"> </w:t>
-      </w:r>
-      <w:r>
-        <w:rPr>
-          <w:rStyle w:val="VerbatimChar"/>
-        </w:rPr>
-        <w:t xml:space="preserve">topbar.tsx</w:t>
-      </w:r>
-      <w:r>
-        <w:t xml:space="preserve"> </w:t>
-      </w:r>
-      <w:r>
-        <w:t xml:space="preserve">swaps just the Sun/Moon icon; no</w:t>
-      </w:r>
-      <w:r>
-        <w:t xml:space="preserve"> </w:t>
-      </w:r>
-      <w:r>
-        <w:rPr>
-          <w:rStyle w:val="VerbatimChar"/>
-        </w:rPr>
-        <w:t xml:space="preserve">document.documentElement.classList</w:t>
-      </w:r>
-      <w:r>
-        <w:t xml:space="preserve"> </w:t>
-      </w:r>
-      <w:r>
-        <w:t xml:space="preserve">writer in</w:t>
-      </w:r>
-      <w:r>
-        <w:t xml:space="preserve"> </w:t>
-      </w:r>
-      <w:r>
-        <w:rPr>
-          <w:rStyle w:val="VerbatimChar"/>
-        </w:rPr>
-        <w:t xml:space="preserve">src/</w:t>
-      </w:r>
-      <w:r>
-        <w:t xml:space="preserve">) → the toggle changes only the icon,</w:t>
-      </w:r>
-      <w:r>
-        <w:t xml:space="preserve"> </w:t>
-      </w:r>
-      <w:r>
-        <w:rPr>
-          <w:rStyle w:val="VerbatimChar"/>
-        </w:rPr>
-        <w:t xml:space="preserve">:root</w:t>
-      </w:r>
-      <w:r>
-        <w:t xml:space="preserve">(dark) always applies. To be FIXED by the OpenDesign light/dark wiring.</w:t>
+        <w:t xml:space="preserve">docs/qa/20260709-ota-manager-hostrender/</w:t>
+      </w:r>
+      <w:r>
+        <w:t xml:space="preserve">, harness</w:t>
+      </w:r>
+      <w:r>
+        <w:t xml:space="preserve"> </w:t>
+      </w:r>
+      <w:r>
+        <w:rPr>
+          <w:rStyle w:val="VerbatimChar"/>
+        </w:rPr>
+        <w:t xml:space="preserve">clients/ota-manager/visual/</w:t>
+      </w:r>
+      <w:r>
+        <w:t xml:space="preserve">): LoginPage × {light,dark} rendered host-side (Playwright+Vite+Tailwind4+pixelmatch+</w:t>
+      </w:r>
+      <w:r>
+        <w:rPr>
+          <w:b/>
+          <w:bCs/>
+        </w:rPr>
+        <w:t xml:space="preserve">Tesseract OCR</w:t>
+      </w:r>
+      <w:r>
+        <w:t xml:space="preserve">); dual oracle image-diff good 0% / bad flagged both themes + layout oracle flags collapsed-submit; self-validation</w:t>
+      </w:r>
+      <w:r>
+        <w:t xml:space="preserve"> </w:t>
+      </w:r>
+      <w:r>
+        <w:rPr>
+          <w:rStyle w:val="VerbatimChar"/>
+        </w:rPr>
+        <w:t xml:space="preserve">image_diff_analyzer_sound</w:t>
+      </w:r>
+      <w:r>
+        <w:t xml:space="preserve">+</w:t>
+      </w:r>
+      <w:r>
+        <w:rPr>
+          <w:rStyle w:val="VerbatimChar"/>
+        </w:rPr>
+        <w:t xml:space="preserve">layout_analyzer_sound</w:t>
+      </w:r>
+      <w:r>
+        <w:t xml:space="preserve">=true (golden-good/golden-bad §11.4.107(10)); reviewer re-ran byte-identical, GO.</w:t>
+      </w:r>
+      <w:r>
+        <w:t xml:space="preserve"> </w:t>
+      </w:r>
+      <w:r>
+        <w:t xml:space="preserve">-</w:t>
+      </w:r>
+      <w:r>
+        <w:t xml:space="preserve"> </w:t>
+      </w:r>
+      <w:r>
+        <w:rPr>
+          <w:b/>
+          <w:bCs/>
+        </w:rPr>
+        <w:t xml:space="preserve">dashboard</w:t>
+      </w:r>
+      <w:r>
+        <w:t xml:space="preserve"> </w:t>
+      </w:r>
+      <w:r>
+        <w:t xml:space="preserve">(</w:t>
+      </w:r>
+      <w:r>
+        <w:rPr>
+          <w:rStyle w:val="VerbatimChar"/>
+        </w:rPr>
+        <w:t xml:space="preserve">docs/qa/20260709-dashboard-hostrender/</w:t>
+      </w:r>
+      <w:r>
+        <w:t xml:space="preserve">, harness</w:t>
+      </w:r>
+      <w:r>
+        <w:t xml:space="preserve"> </w:t>
+      </w:r>
+      <w:r>
+        <w:rPr>
+          <w:rStyle w:val="VerbatimChar"/>
+        </w:rPr>
+        <w:t xml:space="preserve">dashboard/hostrender/</w:t>
+      </w:r>
+      <w:r>
+        <w:t xml:space="preserve">): Login host-rendered (vite-only, backend-independent), pixelmatch good 0% / bad 13% + layout oracle + committed golden REJECTs mutation; reviewer’s adversarial negative-control (mutation-disabled → self-checks correctly FAIL) proves non-rubber-stamp, GO. Existing suite baselined: vitest 93/93, Playwright 22/1-pre-existing-flake, axe 0 critical/serious.</w:t>
       </w:r>
     </w:p>
     <w:p>
@@ -3714,37 +4162,154 @@
           <w:b/>
           <w:bCs/>
         </w:rPr>
-        <w:t xml:space="preserve">§11.4.170 ledger / Minor follow-ups (tracked, non-blocking):</w:t>
-      </w:r>
-      <w:r>
-        <w:t xml:space="preserve"> </w:t>
-      </w:r>
-      <w:r>
-        <w:t xml:space="preserve">(a) OCR oracle not yet mutation-validated on ota-manager — add an OCR golden-bad; (b) coverage is 1 screen/state on each frontend — remaining screen×state×{light,dark} matrix owed; (c) dashboard has NO dark mode in code (light-only proven, honest gap); (d) pre-existing ota-manager tsconfig TS6306/6310 (</w:t>
-      </w:r>
-      <w:r>
-        <w:rPr>
-          <w:rStyle w:val="VerbatimChar"/>
-        </w:rPr>
-        <w:t xml:space="preserve">tsconfig.node.json</w:t>
-      </w:r>
-      <w:r>
-        <w:t xml:space="preserve"> </w:t>
-      </w:r>
-      <w:r>
-        <w:t xml:space="preserve">lacks</w:t>
-      </w:r>
-      <w:r>
-        <w:t xml:space="preserve"> </w:t>
-      </w:r>
-      <w:r>
-        <w:rPr>
-          <w:rStyle w:val="VerbatimChar"/>
-        </w:rPr>
-        <w:t xml:space="preserve">composite:true</w:t>
-      </w:r>
-      <w:r>
-        <w:t xml:space="preserve">) — pre-existing, unrelated.</w:t>
+        <w:t xml:space="preserve">NEW TRACKED BUG (real, surfaced by W2 host-render proof — §11.4.170 working as designed):</w:t>
+      </w:r>
+      <w:r>
+        <w:t xml:space="preserve"> </w:t>
+      </w:r>
+      <w:r>
+        <w:t xml:space="preserve">ota-manager’s</w:t>
+      </w:r>
+      <w:r>
+        <w:t xml:space="preserve"> </w:t>
+      </w:r>
+      <w:r>
+        <w:rPr>
+          <w:rStyle w:val="VerbatimChar"/>
+        </w:rPr>
+        <w:t xml:space="preserve">ui-store</w:t>
+      </w:r>
+      <w:r>
+        <w:t xml:space="preserve"> </w:t>
+      </w:r>
+      <w:r>
+        <w:t xml:space="preserve">theme value is</w:t>
+      </w:r>
+      <w:r>
+        <w:t xml:space="preserve"> </w:t>
+      </w:r>
+      <w:r>
+        <w:rPr>
+          <w:b/>
+          <w:bCs/>
+        </w:rPr>
+        <w:t xml:space="preserve">never wired to a DOM</w:t>
+      </w:r>
+      <w:r>
+        <w:rPr>
+          <w:b/>
+          <w:bCs/>
+        </w:rPr>
+        <w:t xml:space="preserve"> </w:t>
+      </w:r>
+      <w:r>
+        <w:rPr>
+          <w:rStyle w:val="VerbatimChar"/>
+          <w:b/>
+          <w:bCs/>
+        </w:rPr>
+        <w:t xml:space="preserve">.dark</w:t>
+      </w:r>
+      <w:r>
+        <w:rPr>
+          <w:b/>
+          <w:bCs/>
+        </w:rPr>
+        <w:t xml:space="preserve">/</w:t>
+      </w:r>
+      <w:r>
+        <w:rPr>
+          <w:rStyle w:val="VerbatimChar"/>
+          <w:b/>
+          <w:bCs/>
+        </w:rPr>
+        <w:t xml:space="preserve">.light</w:t>
+      </w:r>
+      <w:r>
+        <w:rPr>
+          <w:b/>
+          <w:bCs/>
+        </w:rPr>
+        <w:t xml:space="preserve"> </w:t>
+      </w:r>
+      <w:r>
+        <w:rPr>
+          <w:b/>
+          <w:bCs/>
+        </w:rPr>
+        <w:t xml:space="preserve">class</w:t>
+      </w:r>
+      <w:r>
+        <w:t xml:space="preserve"> </w:t>
+      </w:r>
+      <w:r>
+        <w:t xml:space="preserve">(</w:t>
+      </w:r>
+      <w:r>
+        <w:rPr>
+          <w:rStyle w:val="VerbatimChar"/>
+        </w:rPr>
+        <w:t xml:space="preserve">ui-store.ts:27-32</w:t>
+      </w:r>
+      <w:r>
+        <w:t xml:space="preserve"> </w:t>
+      </w:r>
+      <w:r>
+        <w:t xml:space="preserve">mutates zustand only;</w:t>
+      </w:r>
+      <w:r>
+        <w:t xml:space="preserve"> </w:t>
+      </w:r>
+      <w:r>
+        <w:rPr>
+          <w:rStyle w:val="VerbatimChar"/>
+        </w:rPr>
+        <w:t xml:space="preserve">topbar.tsx</w:t>
+      </w:r>
+      <w:r>
+        <w:t xml:space="preserve"> </w:t>
+      </w:r>
+      <w:r>
+        <w:t xml:space="preserve">swaps just the Sun/Moon icon; no</w:t>
+      </w:r>
+      <w:r>
+        <w:t xml:space="preserve"> </w:t>
+      </w:r>
+      <w:r>
+        <w:rPr>
+          <w:rStyle w:val="VerbatimChar"/>
+        </w:rPr>
+        <w:t xml:space="preserve">document.documentElement.classList</w:t>
+      </w:r>
+      <w:r>
+        <w:t xml:space="preserve"> </w:t>
+      </w:r>
+      <w:r>
+        <w:t xml:space="preserve">writer in</w:t>
+      </w:r>
+      <w:r>
+        <w:t xml:space="preserve"> </w:t>
+      </w:r>
+      <w:r>
+        <w:rPr>
+          <w:rStyle w:val="VerbatimChar"/>
+        </w:rPr>
+        <w:t xml:space="preserve">src/</w:t>
+      </w:r>
+      <w:r>
+        <w:t xml:space="preserve">) → the toggle changes only the icon,</w:t>
+      </w:r>
+      <w:r>
+        <w:t xml:space="preserve"> </w:t>
+      </w:r>
+      <w:r>
+        <w:rPr>
+          <w:rStyle w:val="VerbatimChar"/>
+        </w:rPr>
+        <w:t xml:space="preserve">:root</w:t>
+      </w:r>
+      <w:r>
+        <w:t xml:space="preserve">(dark) always applies. To be FIXED by the OpenDesign light/dark wiring.</w:t>
       </w:r>
     </w:p>
     <w:p>
@@ -3756,6 +4321,48 @@
           <w:b/>
           <w:bCs/>
         </w:rPr>
+        <w:t xml:space="preserve">§11.4.170 ledger / Minor follow-ups (tracked, non-blocking):</w:t>
+      </w:r>
+      <w:r>
+        <w:t xml:space="preserve"> </w:t>
+      </w:r>
+      <w:r>
+        <w:t xml:space="preserve">(a) OCR oracle not yet mutation-validated on ota-manager — add an OCR golden-bad; (b) coverage is 1 screen/state on each frontend — remaining screen×state×{light,dark} matrix owed; (c) dashboard has NO dark mode in code (light-only proven, honest gap); (d) pre-existing ota-manager tsconfig TS6306/6310 (</w:t>
+      </w:r>
+      <w:r>
+        <w:rPr>
+          <w:rStyle w:val="VerbatimChar"/>
+        </w:rPr>
+        <w:t xml:space="preserve">tsconfig.node.json</w:t>
+      </w:r>
+      <w:r>
+        <w:t xml:space="preserve"> </w:t>
+      </w:r>
+      <w:r>
+        <w:t xml:space="preserve">lacks</w:t>
+      </w:r>
+      <w:r>
+        <w:t xml:space="preserve"> </w:t>
+      </w:r>
+      <w:r>
+        <w:rPr>
+          <w:rStyle w:val="VerbatimChar"/>
+        </w:rPr>
+        <w:t xml:space="preserve">composite:true</w:t>
+      </w:r>
+      <w:r>
+        <w:t xml:space="preserve">) — pre-existing, unrelated.</w:t>
+      </w:r>
+    </w:p>
+    <w:p>
+      <w:pPr>
+        <w:pStyle w:val="BodyText"/>
+      </w:pPr>
+      <w:r>
+        <w:rPr>
+          <w:b/>
+          <w:bCs/>
+        </w:rPr>
         <w:t xml:space="preserve">NEXT (feature/opendesign-adoption, §11.4.167):</w:t>
       </w:r>
       <w:r>
@@ -3845,8 +4452,8 @@
         <w:t xml:space="preserve">OPERATOR: rotate the posted password (§11.4.10).</w:t>
       </w:r>
     </w:p>
-    <w:bookmarkEnd w:id="11"/>
-    <w:bookmarkStart w:id="12" w:name="X0029dec7485217fbd4db87ea083113e66cf9662"/>
+    <w:bookmarkEnd w:id="12"/>
+    <w:bookmarkStart w:id="13" w:name="X0029dec7485217fbd4db87ea083113e66cf9662"/>
     <w:p>
       <w:pPr>
         <w:pStyle w:val="Heading3"/>
@@ -4785,8 +5392,8 @@
         <w:t xml:space="preserve">OPERATOR: rotate the posted password (§11.4.10).</w:t>
       </w:r>
     </w:p>
-    <w:bookmarkEnd w:id="12"/>
-    <w:bookmarkStart w:id="13" w:name="X1bc77efc0734d9fed6159659640d0d04ce5ad81"/>
+    <w:bookmarkEnd w:id="13"/>
+    <w:bookmarkStart w:id="14" w:name="X1bc77efc0734d9fed6159659640d0d04ce5ad81"/>
     <w:p>
       <w:pPr>
         <w:pStyle w:val="Heading3"/>
@@ -5318,8 +5925,8 @@
         <w:t xml:space="preserve">OPERATOR: rotate the posted password (§11.4.10).</w:t>
       </w:r>
     </w:p>
-    <w:bookmarkEnd w:id="13"/>
-    <w:bookmarkStart w:id="14" w:name="Xc68443ab008a029c94b728346fbc005bf4278e7"/>
+    <w:bookmarkEnd w:id="14"/>
+    <w:bookmarkStart w:id="15" w:name="Xc68443ab008a029c94b728346fbc005bf4278e7"/>
     <w:p>
       <w:pPr>
         <w:pStyle w:val="Heading3"/>
@@ -5923,8 +6530,8 @@
         <w:t xml:space="preserve">are root-only on the cvd (FACT).</w:t>
       </w:r>
     </w:p>
-    <w:bookmarkEnd w:id="14"/>
-    <w:bookmarkStart w:id="15" w:name="X68c831284264b2267f4ef1c51dee8318c2755fe"/>
+    <w:bookmarkEnd w:id="15"/>
+    <w:bookmarkStart w:id="16" w:name="X68c831284264b2267f4ef1c51dee8318c2755fe"/>
     <w:p>
       <w:pPr>
         <w:pStyle w:val="Heading3"/>
@@ -6734,8 +7341,8 @@
         <w:t xml:space="preserve">). F112/F55 are VERIFIED.</w:t>
       </w:r>
     </w:p>
-    <w:bookmarkEnd w:id="15"/>
-    <w:bookmarkStart w:id="16" w:name="X524ee940c29465177613ba0ab4d16bf54214917"/>
+    <w:bookmarkEnd w:id="16"/>
+    <w:bookmarkStart w:id="17" w:name="X524ee940c29465177613ba0ab4d16bf54214917"/>
     <w:p>
       <w:pPr>
         <w:pStyle w:val="Heading3"/>
@@ -7823,8 +8430,8 @@
         <w:t xml:space="preserve">operator-attended; (4) physical RK3588 boards remain NON-A/B (control-plane validation only).</w:t>
       </w:r>
     </w:p>
-    <w:bookmarkEnd w:id="16"/>
-    <w:bookmarkStart w:id="17" w:name="X95ea5767d32de136cd94937ba506db38fe2af85"/>
+    <w:bookmarkEnd w:id="17"/>
+    <w:bookmarkStart w:id="18" w:name="X95ea5767d32de136cd94937ba506db38fe2af85"/>
     <w:p>
       <w:pPr>
         <w:pStyle w:val="Heading3"/>
@@ -8583,8 +9190,8 @@
         <w:t xml:space="preserve">Cuttlefish path’s job, not these boards (control-plane validation only on them).</w:t>
       </w:r>
     </w:p>
-    <w:bookmarkEnd w:id="17"/>
-    <w:bookmarkStart w:id="18" w:name="Xfd5d7ce9acf0ccf32d7854ccd0147955536aca5"/>
+    <w:bookmarkEnd w:id="18"/>
+    <w:bookmarkStart w:id="19" w:name="Xfd5d7ce9acf0ccf32d7854ccd0147955536aca5"/>
     <w:p>
       <w:pPr>
         <w:pStyle w:val="Heading3"/>
@@ -9027,8 +9634,8 @@
         <w:t xml:space="preserve">on nezha) for true detachment — deferred because on-target persistence verification (re-boot + interrupt test, leaves remote state) is operator-attended; a blind change to the working boot path is forbidden per §11.4.1 without rock-solid proof.</w:t>
       </w:r>
     </w:p>
-    <w:bookmarkEnd w:id="18"/>
-    <w:bookmarkStart w:id="19" w:name="active-items"/>
+    <w:bookmarkEnd w:id="19"/>
+    <w:bookmarkStart w:id="20" w:name="active-items"/>
     <w:p>
       <w:pPr>
         <w:pStyle w:val="Heading3"/>
@@ -9192,8 +9799,8 @@
         </w:tc>
       </w:tr>
     </w:tbl>
-    <w:bookmarkEnd w:id="19"/>
-    <w:bookmarkStart w:id="20" w:name="recently-closed-items"/>
+    <w:bookmarkEnd w:id="20"/>
+    <w:bookmarkStart w:id="21" w:name="recently-closed-items"/>
     <w:p>
       <w:pPr>
         <w:pStyle w:val="Heading3"/>
@@ -9570,9 +10177,9 @@
         </w:pict>
       </w:r>
     </w:p>
-    <w:bookmarkEnd w:id="20"/>
     <w:bookmarkEnd w:id="21"/>
-    <w:bookmarkStart w:id="22" w:name="server-tests-all-green"/>
+    <w:bookmarkEnd w:id="22"/>
+    <w:bookmarkStart w:id="23" w:name="server-tests-all-green"/>
     <w:p>
       <w:pPr>
         <w:pStyle w:val="Heading2"/>
@@ -9753,8 +10360,8 @@
         </w:pict>
       </w:r>
     </w:p>
-    <w:bookmarkEnd w:id="22"/>
-    <w:bookmarkStart w:id="23" w:name="emulator-status"/>
+    <w:bookmarkEnd w:id="23"/>
+    <w:bookmarkStart w:id="24" w:name="emulator-status"/>
     <w:p>
       <w:pPr>
         <w:pStyle w:val="Heading2"/>
@@ -10021,8 +10628,8 @@
         </w:pict>
       </w:r>
     </w:p>
-    <w:bookmarkEnd w:id="23"/>
-    <w:bookmarkStart w:id="24" w:name="whats-running"/>
+    <w:bookmarkEnd w:id="24"/>
+    <w:bookmarkStart w:id="25" w:name="whats-running"/>
     <w:p>
       <w:pPr>
         <w:pStyle w:val="Heading2"/>
@@ -10294,8 +10901,8 @@
         </w:pict>
       </w:r>
     </w:p>
-    <w:bookmarkEnd w:id="24"/>
-    <w:bookmarkStart w:id="25" w:name="next-actions-priority-ordered"/>
+    <w:bookmarkEnd w:id="25"/>
+    <w:bookmarkStart w:id="26" w:name="next-actions-priority-ordered"/>
     <w:p>
       <w:pPr>
         <w:pStyle w:val="Heading2"/>
@@ -12541,8 +13148,8 @@
         </w:pict>
       </w:r>
     </w:p>
-    <w:bookmarkEnd w:id="25"/>
-    <w:bookmarkStart w:id="26" w:name="binding-constraints"/>
+    <w:bookmarkEnd w:id="26"/>
+    <w:bookmarkStart w:id="27" w:name="binding-constraints"/>
     <w:p>
       <w:pPr>
         <w:pStyle w:val="Heading2"/>
@@ -12864,8 +13471,8 @@
         </w:pict>
       </w:r>
     </w:p>
-    <w:bookmarkEnd w:id="26"/>
-    <w:bookmarkStart w:id="27" w:name="feature-tracking"/>
+    <w:bookmarkEnd w:id="27"/>
+    <w:bookmarkStart w:id="28" w:name="feature-tracking"/>
     <w:p>
       <w:pPr>
         <w:pStyle w:val="Heading2"/>
@@ -12922,8 +13529,8 @@
         </w:pict>
       </w:r>
     </w:p>
-    <w:bookmarkEnd w:id="27"/>
-    <w:bookmarkStart w:id="28" w:name="fresh-session-start"/>
+    <w:bookmarkEnd w:id="28"/>
+    <w:bookmarkStart w:id="29" w:name="fresh-session-start"/>
     <w:p>
       <w:pPr>
         <w:pStyle w:val="Heading2"/>
@@ -13036,8 +13643,8 @@
         <w:t xml:space="preserve">). The remaining open item is OTA-004 (Tier-3 physical RK3588), which is operator-blocked on hardware (boards stay control-plane-only by operator decision, §11.4.133). The cvd is left running on nezha.</w:t>
       </w:r>
     </w:p>
-    <w:bookmarkEnd w:id="28"/>
     <w:bookmarkEnd w:id="29"/>
+    <w:bookmarkEnd w:id="30"/>
     <w:sectPr>
       <w:footnotePr>
         <w:numRestart w:val="eachSect"/>

</xml_diff>

<commit_message>
docs: CONTINUATION Rev21 + §11.4.84 incident record (4 streams done + leak forensics)
All 4 wave-5 streams DONE: DASH 52bdb1f8, BT a021a3ca, SR 970fac0f, C-impl
512df0eb. Records the §11.4.84 incident (9d21dd6a docs commit swept 3 clients/
deletions C-impl staged via git rm; commit_all.sh --paths bare-commit index-sweep
= item E, elevated) + forward recovery (512df0eb, no force-push §11.4.113) +
prevention. Containers idle-race root cause captured (fire() lacks lastTouch
guard; needs clock-injection seam). C1 CSP/bundle coupling BLOCKING non-localhost
deploy. §11.4.185 no ship until QA-team manual confirmation.

Co-Authored-By: Claude Opus 4.8 (1M context) <noreply@anthropic.com>
</commit_message>
<xml_diff>
--- a/docs/CONTINUATION.docx
+++ b/docs/CONTINUATION.docx
@@ -26,7 +26,7 @@
         <w:t xml:space="preserve"> </w:t>
       </w:r>
       <w:r>
-        <w:t xml:space="preserve">20</w:t>
+        <w:t xml:space="preserve">21</w:t>
       </w:r>
       <w:r>
         <w:t xml:space="preserve"> </w:t>
@@ -42,7 +42,7 @@
         <w:t xml:space="preserve"> </w:t>
       </w:r>
       <w:r>
-        <w:t xml:space="preserve">2026-07-10T21:00:00Z</w:t>
+        <w:t xml:space="preserve">2026-07-10T21:35:00Z</w:t>
       </w:r>
     </w:p>
     <w:p>
@@ -2244,23 +2244,23 @@
           <w:b/>
           <w:bCs/>
         </w:rPr>
-        <w:t xml:space="preserve">Parallel streams</w:t>
-      </w:r>
-      <w:r>
-        <w:t xml:space="preserve"> </w:t>
-      </w:r>
-      <w:r>
-        <w:t xml:space="preserve">(§11.4.103, disjoint scope, subagents never git — conductor reviews+commits §11.4.142):</w:t>
-      </w:r>
-      <w:r>
-        <w:t xml:space="preserve"> </w:t>
-      </w:r>
-      <w:r>
-        <w:rPr>
-          <w:b/>
-          <w:bCs/>
-        </w:rPr>
-        <w:t xml:space="preserve">DASH DONE</w:t>
+        <w:t xml:space="preserve">Parallel streams — ALL 4 DONE</w:t>
+      </w:r>
+      <w:r>
+        <w:t xml:space="preserve"> </w:t>
+      </w:r>
+      <w:r>
+        <w:t xml:space="preserve">(§11.4.103, disjoint scope, each conductor-independently verified before commit §11.4.142):</w:t>
+      </w:r>
+      <w:r>
+        <w:t xml:space="preserve"> </w:t>
+      </w:r>
+      <w:r>
+        <w:rPr>
+          <w:b/>
+          <w:bCs/>
+        </w:rPr>
+        <w:t xml:space="preserve">DASH</w:t>
       </w:r>
       <w:r>
         <w:t xml:space="preserve"> </w:t>
@@ -2278,23 +2278,178 @@
         <w:t xml:space="preserve"> </w:t>
       </w:r>
       <w:r>
-        <w:t xml:space="preserve">— dashboard regression on HEAD GREEN: tsc 0, vitest 107/107, Playwright host-render 117/117 across 26 screen×theme, conductor-reconfirmed).</w:t>
-      </w:r>
-      <w:r>
-        <w:t xml:space="preserve"> </w:t>
-      </w:r>
-      <w:r>
-        <w:rPr>
-          <w:b/>
-          <w:bCs/>
-        </w:rPr>
-        <w:t xml:space="preserve">In flight:</w:t>
-      </w:r>
-      <w:r>
-        <w:t xml:space="preserve"> </w:t>
-      </w:r>
-      <w:r>
-        <w:t xml:space="preserve">main +</w:t>
+        <w:t xml:space="preserve">— dashboard GREEN: tsc 0, vitest 107/107, host-render 117/117).</w:t>
+      </w:r>
+      <w:r>
+        <w:t xml:space="preserve"> </w:t>
+      </w:r>
+      <w:r>
+        <w:rPr>
+          <w:b/>
+          <w:bCs/>
+        </w:rPr>
+        <w:t xml:space="preserve">BT</w:t>
+      </w:r>
+      <w:r>
+        <w:t xml:space="preserve"> </w:t>
+      </w:r>
+      <w:r>
+        <w:t xml:space="preserve">(</w:t>
+      </w:r>
+      <w:r>
+        <w:rPr>
+          <w:rStyle w:val="VerbatimChar"/>
+        </w:rPr>
+        <w:t xml:space="preserve">a021a3ca</w:t>
+      </w:r>
+      <w:r>
+        <w:t xml:space="preserve"> </w:t>
+      </w:r>
+      <w:r>
+        <w:t xml:space="preserve">— 13 owned Go bricks: all build+vet clean, 11/13 gofmt+tests PASS; conductor-reconciled findings: containers</w:t>
+      </w:r>
+      <w:r>
+        <w:t xml:space="preserve"> </w:t>
+      </w:r>
+      <w:r>
+        <w:rPr>
+          <w:rStyle w:val="VerbatimChar"/>
+        </w:rPr>
+        <w:t xml:space="preserve">TestIdleShutdown_TouchResets</w:t>
+      </w:r>
+      <w:r>
+        <w:t xml:space="preserve"> </w:t>
+      </w:r>
+      <w:r>
+        <w:t xml:space="preserve">timing-flaky [ROOT CAUSE now FOUND —</w:t>
+      </w:r>
+      <w:r>
+        <w:t xml:space="preserve"> </w:t>
+      </w:r>
+      <w:r>
+        <w:rPr>
+          <w:rStyle w:val="VerbatimChar"/>
+        </w:rPr>
+        <w:t xml:space="preserve">fire()</w:t>
+      </w:r>
+      <w:r>
+        <w:t xml:space="preserve"> </w:t>
+      </w:r>
+      <w:r>
+        <w:t xml:space="preserve">lacks a</w:t>
+      </w:r>
+      <w:r>
+        <w:t xml:space="preserve"> </w:t>
+      </w:r>
+      <w:r>
+        <w:rPr>
+          <w:rStyle w:val="VerbatimChar"/>
+        </w:rPr>
+        <w:t xml:space="preserve">lastTouch</w:t>
+      </w:r>
+      <w:r>
+        <w:t xml:space="preserve"> </w:t>
+      </w:r>
+      <w:r>
+        <w:t xml:space="preserve">re-validation guard → Go</w:t>
+      </w:r>
+      <w:r>
+        <w:t xml:space="preserve"> </w:t>
+      </w:r>
+      <w:r>
+        <w:rPr>
+          <w:rStyle w:val="VerbatimChar"/>
+        </w:rPr>
+        <w:t xml:space="preserve">AfterFunc</w:t>
+      </w:r>
+      <w:r>
+        <w:t xml:space="preserve">+</w:t>
+      </w:r>
+      <w:r>
+        <w:rPr>
+          <w:rStyle w:val="VerbatimChar"/>
+        </w:rPr>
+        <w:t xml:space="preserve">Reset</w:t>
+      </w:r>
+      <w:r>
+        <w:t xml:space="preserve"> </w:t>
+      </w:r>
+      <w:r>
+        <w:t xml:space="preserve">stale-fire race; fix needs a clock-injection test seam, tracked; unproven inline fix reverted per §11.4.115]; llm_orchestrator 6 + vision_engine 17 gofmt = the known deferred-mirror pair).</w:t>
+      </w:r>
+      <w:r>
+        <w:t xml:space="preserve"> </w:t>
+      </w:r>
+      <w:r>
+        <w:rPr>
+          <w:b/>
+          <w:bCs/>
+        </w:rPr>
+        <w:t xml:space="preserve">SR</w:t>
+      </w:r>
+      <w:r>
+        <w:t xml:space="preserve"> </w:t>
+      </w:r>
+      <w:r>
+        <w:t xml:space="preserve">(</w:t>
+      </w:r>
+      <w:r>
+        <w:rPr>
+          <w:rStyle w:val="VerbatimChar"/>
+        </w:rPr>
+        <w:t xml:space="preserve">970fac0f</w:t>
+      </w:r>
+      <w:r>
+        <w:t xml:space="preserve"> </w:t>
+      </w:r>
+      <w:r>
+        <w:t xml:space="preserve">— adversarial security review of O-impl headers: GO-WITH-FIXES,</w:t>
+      </w:r>
+      <w:r>
+        <w:t xml:space="preserve"> </w:t>
+      </w:r>
+      <w:r>
+        <w:rPr>
+          <w:b/>
+          <w:bCs/>
+        </w:rPr>
+        <w:t xml:space="preserve">C1 Critical CONFIRMED</w:t>
+      </w:r>
+      <w:r>
+        <w:t xml:space="preserve"> </w:t>
+      </w:r>
+      <w:r>
+        <w:t xml:space="preserve">— api-client.ts default baseURL</w:t>
+      </w:r>
+      <w:r>
+        <w:t xml:space="preserve"> </w:t>
+      </w:r>
+      <w:r>
+        <w:rPr>
+          <w:rStyle w:val="VerbatimChar"/>
+        </w:rPr>
+        <w:t xml:space="preserve">http://localhost:8080</w:t>
+      </w:r>
+      <w:r>
+        <w:t xml:space="preserve"> </w:t>
+      </w:r>
+      <w:r>
+        <w:t xml:space="preserve">vs Tier-C</w:t>
+      </w:r>
+      <w:r>
+        <w:t xml:space="preserve"> </w:t>
+      </w:r>
+      <w:r>
+        <w:rPr>
+          <w:rStyle w:val="VerbatimChar"/>
+        </w:rPr>
+        <w:t xml:space="preserve">connect-src 'self'</w:t>
+      </w:r>
+      <w:r>
+        <w:t xml:space="preserve"> </w:t>
+      </w:r>
+      <w:r>
+        <w:t xml:space="preserve">breaks the Manager UI off-localhost; fix = relative default + re-embed [item K], BLOCKING non-localhost deploy, NOT loosening CSP; I1 HSTS-behind-proxy = operator trusted-proxy decision; I2/I3 minor/tracked).</w:t>
       </w:r>
       <w:r>
         <w:t xml:space="preserve"> </w:t>
@@ -2310,51 +2465,195 @@
         <w:t xml:space="preserve"> </w:t>
       </w:r>
       <w:r>
-        <w:t xml:space="preserve">(ota-manager: wire all v1 routes + fix 85 tsc errors) +</w:t>
-      </w:r>
-      <w:r>
-        <w:t xml:space="preserve"> </w:t>
-      </w:r>
-      <w:r>
-        <w:rPr>
-          <w:b/>
-          <w:bCs/>
-        </w:rPr>
-        <w:t xml:space="preserve">BT</w:t>
-      </w:r>
-      <w:r>
-        <w:t xml:space="preserve"> </w:t>
-      </w:r>
-      <w:r>
-        <w:t xml:space="preserve">(owned Go-brick build/vet/gofmt/test sweep, §11.4.169/§11.4.28) +</w:t>
-      </w:r>
-      <w:r>
-        <w:t xml:space="preserve"> </w:t>
-      </w:r>
-      <w:r>
-        <w:rPr>
-          <w:b/>
-          <w:bCs/>
-        </w:rPr>
-        <w:t xml:space="preserve">SR</w:t>
-      </w:r>
-      <w:r>
-        <w:t xml:space="preserve"> </w:t>
-      </w:r>
-      <w:r>
-        <w:t xml:space="preserve">(adversarial security review of the O-impl headers</w:t>
-      </w:r>
-      <w:r>
-        <w:t xml:space="preserve"> </w:t>
-      </w:r>
-      <w:r>
-        <w:rPr>
-          <w:rStyle w:val="VerbatimChar"/>
-        </w:rPr>
-        <w:t xml:space="preserve">992bd497</w:t>
-      </w:r>
-      <w:r>
-        <w:t xml:space="preserve">, §11.4.125/§11.4.134). Auto-backfilled SR when DASH freed a slot.</w:t>
+        <w:t xml:space="preserve">(</w:t>
+      </w:r>
+      <w:r>
+        <w:rPr>
+          <w:rStyle w:val="VerbatimChar"/>
+        </w:rPr>
+        <w:t xml:space="preserve">512df0eb</w:t>
+      </w:r>
+      <w:r>
+        <w:t xml:space="preserve"> </w:t>
+      </w:r>
+      <w:r>
+        <w:t xml:space="preserve">— ota-manager 9 v1 routes wired +</w:t>
+      </w:r>
+      <w:r>
+        <w:t xml:space="preserve"> </w:t>
+      </w:r>
+      <w:r>
+        <w:rPr>
+          <w:b/>
+          <w:bCs/>
+        </w:rPr>
+        <w:t xml:space="preserve">85→0 tsc</w:t>
+      </w:r>
+      <w:r>
+        <w:t xml:space="preserve">, vitest 36/36, conductor-verified; BUG-1 telemetry model-drift disclosed [pre-existing, contract decision]).</w:t>
+      </w:r>
+      <w:r>
+        <w:t xml:space="preserve"> </w:t>
+      </w:r>
+      <w:r>
+        <w:t xml:space="preserve">-</w:t>
+      </w:r>
+      <w:r>
+        <w:t xml:space="preserve"> </w:t>
+      </w:r>
+      <w:r>
+        <w:rPr>
+          <w:b/>
+          <w:bCs/>
+        </w:rPr>
+        <w:t xml:space="preserve">§11.4.84 INCIDENT (recovered forward, no loss)</w:t>
+      </w:r>
+      <w:r>
+        <w:t xml:space="preserve"> </w:t>
+      </w:r>
+      <w:r>
+        <w:t xml:space="preserve">— my docs-only</w:t>
+      </w:r>
+      <w:r>
+        <w:t xml:space="preserve"> </w:t>
+      </w:r>
+      <w:r>
+        <w:rPr>
+          <w:rStyle w:val="VerbatimChar"/>
+        </w:rPr>
+        <w:t xml:space="preserve">9d21dd6a</w:t>
+      </w:r>
+      <w:r>
+        <w:t xml:space="preserve"> </w:t>
+      </w:r>
+      <w:r>
+        <w:t xml:space="preserve">swept in 3</w:t>
+      </w:r>
+      <w:r>
+        <w:t xml:space="preserve"> </w:t>
+      </w:r>
+      <w:r>
+        <w:rPr>
+          <w:rStyle w:val="VerbatimChar"/>
+        </w:rPr>
+        <w:t xml:space="preserve">clients/</w:t>
+      </w:r>
+      <w:r>
+        <w:t xml:space="preserve"> </w:t>
+      </w:r>
+      <w:r>
+        <w:t xml:space="preserve">deletions C-impl had staged with</w:t>
+      </w:r>
+      <w:r>
+        <w:t xml:space="preserve"> </w:t>
+      </w:r>
+      <w:r>
+        <w:rPr>
+          <w:rStyle w:val="VerbatimChar"/>
+        </w:rPr>
+        <w:t xml:space="preserve">git rm</w:t>
+      </w:r>
+      <w:r>
+        <w:t xml:space="preserve"> </w:t>
+      </w:r>
+      <w:r>
+        <w:t xml:space="preserve">(subagent-git violation §11.4.20/§11.4.70) because</w:t>
+      </w:r>
+      <w:r>
+        <w:t xml:space="preserve"> </w:t>
+      </w:r>
+      <w:r>
+        <w:rPr>
+          <w:rStyle w:val="VerbatimChar"/>
+        </w:rPr>
+        <w:t xml:space="preserve">commit_all.sh --paths</w:t>
+      </w:r>
+      <w:r>
+        <w:t xml:space="preserve"> </w:t>
+      </w:r>
+      <w:r>
+        <w:t xml:space="preserve">does a bare</w:t>
+      </w:r>
+      <w:r>
+        <w:t xml:space="preserve"> </w:t>
+      </w:r>
+      <w:r>
+        <w:rPr>
+          <w:rStyle w:val="VerbatimChar"/>
+        </w:rPr>
+        <w:t xml:space="preserve">git commit</w:t>
+      </w:r>
+      <w:r>
+        <w:t xml:space="preserve"> </w:t>
+      </w:r>
+      <w:r>
+        <w:t xml:space="preserve">that snapshots the whole index (item E wrapper bug — now ELEVATED to important). Recovered by completing C-impl forward as</w:t>
+      </w:r>
+      <w:r>
+        <w:t xml:space="preserve"> </w:t>
+      </w:r>
+      <w:r>
+        <w:rPr>
+          <w:rStyle w:val="VerbatimChar"/>
+        </w:rPr>
+        <w:t xml:space="preserve">512df0eb</w:t>
+      </w:r>
+      <w:r>
+        <w:t xml:space="preserve"> </w:t>
+      </w:r>
+      <w:r>
+        <w:t xml:space="preserve">(§11.4.113 no-force-push; coherent tsc-0 tip restored, all mirrors 0/0). Full record:</w:t>
+      </w:r>
+      <w:r>
+        <w:t xml:space="preserve"> </w:t>
+      </w:r>
+      <w:r>
+        <w:rPr>
+          <w:rStyle w:val="VerbatimChar"/>
+        </w:rPr>
+        <w:t xml:space="preserve">docs/research/incident_1184_paths_leak_20260710/INCIDENT.md</w:t>
+      </w:r>
+      <w:r>
+        <w:t xml:space="preserve">. Prevention: fix item E to</w:t>
+      </w:r>
+      <w:r>
+        <w:t xml:space="preserve"> </w:t>
+      </w:r>
+      <w:r>
+        <w:rPr>
+          <w:rStyle w:val="VerbatimChar"/>
+        </w:rPr>
+        <w:t xml:space="preserve">git commit -- &lt;paths&gt;</w:t>
+      </w:r>
+      <w:r>
+        <w:t xml:space="preserve">; tighten subagent prompts to forbid</w:t>
+      </w:r>
+      <w:r>
+        <w:t xml:space="preserve"> </w:t>
+      </w:r>
+      <w:r>
+        <w:rPr>
+          <w:rStyle w:val="VerbatimChar"/>
+        </w:rPr>
+        <w:t xml:space="preserve">git rm</w:t>
+      </w:r>
+      <w:r>
+        <w:t xml:space="preserve">; index-clean precheck before every</w:t>
+      </w:r>
+      <w:r>
+        <w:t xml:space="preserve"> </w:t>
+      </w:r>
+      <w:r>
+        <w:rPr>
+          <w:rStyle w:val="VerbatimChar"/>
+        </w:rPr>
+        <w:t xml:space="preserve">--paths</w:t>
+      </w:r>
+      <w:r>
+        <w:t xml:space="preserve"> </w:t>
+      </w:r>
+      <w:r>
+        <w:t xml:space="preserve">commit (now habitual).</w:t>
       </w:r>
     </w:p>
     <w:bookmarkEnd w:id="10"/>

</xml_diff>

<commit_message>
docs: CONTINUATION Rev27 — cont-7 Wave-9/10/11 audit batch landed (6 defects fixed, all FF-pushed 4/4)
HEAD 1a2109e8. Wave-9 (ota-protocol + ota-telemetry-schema) CLEAN; Wave-10 containers
Discover-aliasing fix; Wave-11 five fixes (artifact-validator nil-reader, server per-project
RBAC ACL seed, bridge bind()-swallow silent-hang, android-agent verify-reason-mask + null-path
crash, docs_chain dump hash-collision). Each RED->GREEN + conductor polarity (11.4.115) +
independent review (11.4.142); Android Gradle gates ran real. All parent commits in sync on
origin/main, 4/4 FF (11.4.113). §11.4.65 HTML/PDF/DOCX regenerated.

Co-Authored-By: Claude Opus 4.8 (1M context) <noreply@anthropic.com>
</commit_message>
<xml_diff>
--- a/docs/CONTINUATION.docx
+++ b/docs/CONTINUATION.docx
@@ -26,7 +26,7 @@
         <w:t xml:space="preserve"> </w:t>
       </w:r>
       <w:r>
-        <w:t xml:space="preserve">26</w:t>
+        <w:t xml:space="preserve">27</w:t>
       </w:r>
       <w:r>
         <w:t xml:space="preserve"> </w:t>
@@ -42,7 +42,7 @@
         <w:t xml:space="preserve"> </w:t>
       </w:r>
       <w:r>
-        <w:t xml:space="preserve">2026-07-10T02:14:51Z</w:t>
+        <w:t xml:space="preserve">2026-07-10T03:15:26Z</w:t>
       </w:r>
     </w:p>
     <w:p>
@@ -125,13 +125,546 @@
               <w:rPr>
                 <w:rStyle w:val="VerbatimChar"/>
               </w:rPr>
-              <w:t xml:space="preserve">7b86a6da</w:t>
-            </w:r>
-            <w:r>
-              <w:t xml:space="preserve"> </w:t>
-            </w:r>
-            <w:r>
-              <w:t xml:space="preserve">(Wave-8 cont-6 batch — server</w:t>
+              <w:t xml:space="preserve">1a2109e8</w:t>
+            </w:r>
+            <w:r>
+              <w:t xml:space="preserve"> </w:t>
+            </w:r>
+            <w:r>
+              <w:t xml:space="preserve">(cont-7 Wave-9/10/11 audit batch, 2026-07-10 — 6 owned-brick/main-repo defects fixed, each RED→GREEN + conductor polarity §11.4.115 + independent review §11.4.142, all FF-pushed no-force §11.4.113:</w:t>
+            </w:r>
+            <w:r>
+              <w:t xml:space="preserve"> </w:t>
+            </w:r>
+            <w:r>
+              <w:rPr>
+                <w:b/>
+                <w:bCs/>
+              </w:rPr>
+              <w:t xml:space="preserve">W11a</w:t>
+            </w:r>
+            <w:r>
+              <w:t xml:space="preserve"> </w:t>
+            </w:r>
+            <w:r>
+              <w:t xml:space="preserve">ota-artifact-validator</w:t>
+            </w:r>
+            <w:r>
+              <w:t xml:space="preserve"> </w:t>
+            </w:r>
+            <w:r>
+              <w:rPr>
+                <w:rStyle w:val="VerbatimChar"/>
+              </w:rPr>
+              <w:t xml:space="preserve">707f876</w:t>
+            </w:r>
+            <w:r>
+              <w:t xml:space="preserve">/parent</w:t>
+            </w:r>
+            <w:r>
+              <w:t xml:space="preserve"> </w:t>
+            </w:r>
+            <w:r>
+              <w:rPr>
+                <w:rStyle w:val="VerbatimChar"/>
+              </w:rPr>
+              <w:t xml:space="preserve">1c75fd42</w:t>
+            </w:r>
+            <w:r>
+              <w:t xml:space="preserve"> </w:t>
+            </w:r>
+            <w:r>
+              <w:t xml:space="preserve">(ValidateHash nil-</w:t>
+            </w:r>
+            <w:r>
+              <w:rPr>
+                <w:rStyle w:val="VerbatimChar"/>
+              </w:rPr>
+              <w:t xml:space="preserve">io.Reader</w:t>
+            </w:r>
+            <w:r>
+              <w:t xml:space="preserve"> </w:t>
+            </w:r>
+            <w:r>
+              <w:t xml:space="preserve">panic → reject verdict, reachable via exported</w:t>
+            </w:r>
+            <w:r>
+              <w:t xml:space="preserve"> </w:t>
+            </w:r>
+            <w:r>
+              <w:rPr>
+                <w:rStyle w:val="VerbatimChar"/>
+              </w:rPr>
+              <w:t xml:space="preserve">Validate(Input{})</w:t>
+            </w:r>
+            <w:r>
+              <w:t xml:space="preserve">) ·</w:t>
+            </w:r>
+            <w:r>
+              <w:t xml:space="preserve"> </w:t>
+            </w:r>
+            <w:r>
+              <w:rPr>
+                <w:b/>
+                <w:bCs/>
+              </w:rPr>
+              <w:t xml:space="preserve">W11-server</w:t>
+            </w:r>
+            <w:r>
+              <w:t xml:space="preserve"> </w:t>
+            </w:r>
+            <w:r>
+              <w:rPr>
+                <w:rStyle w:val="VerbatimChar"/>
+              </w:rPr>
+              <w:t xml:space="preserve">7a68a8e5</w:t>
+            </w:r>
+            <w:r>
+              <w:t xml:space="preserve"> </w:t>
+            </w:r>
+            <w:r>
+              <w:t xml:space="preserve">(handleCreateProject now seeds creator</w:t>
+            </w:r>
+            <w:r>
+              <w:t xml:space="preserve"> </w:t>
+            </w:r>
+            <w:r>
+              <w:rPr>
+                <w:rStyle w:val="VerbatimChar"/>
+              </w:rPr>
+              <w:t xml:space="preserve">ProjectRoleAdmin</w:t>
+            </w:r>
+            <w:r>
+              <w:t xml:space="preserve"> </w:t>
+            </w:r>
+            <w:r>
+              <w:t xml:space="preserve">ACL — creator was 403-locked-out of own project, entire per-project RBAC was silently dead; no route-gate change, no escalation) ·</w:t>
+            </w:r>
+            <w:r>
+              <w:t xml:space="preserve"> </w:t>
+            </w:r>
+            <w:r>
+              <w:rPr>
+                <w:b/>
+                <w:bCs/>
+              </w:rPr>
+              <w:t xml:space="preserve">W11-bridge</w:t>
+            </w:r>
+            <w:r>
+              <w:t xml:space="preserve"> </w:t>
+            </w:r>
+            <w:r>
+              <w:t xml:space="preserve">ota-update-engine-bridge</w:t>
+            </w:r>
+            <w:r>
+              <w:t xml:space="preserve"> </w:t>
+            </w:r>
+            <w:r>
+              <w:rPr>
+                <w:rStyle w:val="VerbatimChar"/>
+              </w:rPr>
+              <w:t xml:space="preserve">33ab77d</w:t>
+            </w:r>
+            <w:r>
+              <w:t xml:space="preserve">/parent</w:t>
+            </w:r>
+            <w:r>
+              <w:t xml:space="preserve"> </w:t>
+            </w:r>
+            <w:r>
+              <w:rPr>
+                <w:rStyle w:val="VerbatimChar"/>
+              </w:rPr>
+              <w:t xml:space="preserve">3c6da835</w:t>
+            </w:r>
+            <w:r>
+              <w:t xml:space="preserve"> </w:t>
+            </w:r>
+            <w:r>
+              <w:t xml:space="preserve">(</w:t>
+            </w:r>
+            <w:r>
+              <w:rPr>
+                <w:rStyle w:val="VerbatimChar"/>
+              </w:rPr>
+              <w:t xml:space="preserve">UpdateEngine.bind()</w:t>
+            </w:r>
+            <w:r>
+              <w:t xml:space="preserve"> </w:t>
+            </w:r>
+            <w:r>
+              <w:t xml:space="preserve">boolean was swallowed →</w:t>
+            </w:r>
+            <w:r>
+              <w:t xml:space="preserve"> </w:t>
+            </w:r>
+            <w:r>
+              <w:rPr>
+                <w:rStyle w:val="VerbatimChar"/>
+              </w:rPr>
+              <w:t xml:space="preserve">observeStatus</w:t>
+            </w:r>
+            <w:r>
+              <w:t xml:space="preserve"> </w:t>
+            </w:r>
+            <w:r>
+              <w:t xml:space="preserve">cold Flow hung forever on bind-fail;</w:t>
+            </w:r>
+            <w:r>
+              <w:t xml:space="preserve"> </w:t>
+            </w:r>
+            <w:r>
+              <w:rPr>
+                <w:rStyle w:val="VerbatimChar"/>
+              </w:rPr>
+              <w:t xml:space="preserve">bind()</w:t>
+            </w:r>
+            <w:r>
+              <w:t xml:space="preserve"> </w:t>
+            </w:r>
+            <w:r>
+              <w:t xml:space="preserve">now returns Boolean + Flow</w:t>
+            </w:r>
+            <w:r>
+              <w:t xml:space="preserve"> </w:t>
+            </w:r>
+            <w:r>
+              <w:rPr>
+                <w:rStyle w:val="VerbatimChar"/>
+              </w:rPr>
+              <w:t xml:space="preserve">close(IllegalStateException)</w:t>
+            </w:r>
+            <w:r>
+              <w:t xml:space="preserve"> </w:t>
+            </w:r>
+            <w:r>
+              <w:t xml:space="preserve">fails fast) ·</w:t>
+            </w:r>
+            <w:r>
+              <w:t xml:space="preserve"> </w:t>
+            </w:r>
+            <w:r>
+              <w:rPr>
+                <w:b/>
+                <w:bCs/>
+              </w:rPr>
+              <w:t xml:space="preserve">W11-agent</w:t>
+            </w:r>
+            <w:r>
+              <w:t xml:space="preserve"> </w:t>
+            </w:r>
+            <w:r>
+              <w:t xml:space="preserve">ota-android-agent</w:t>
+            </w:r>
+            <w:r>
+              <w:t xml:space="preserve"> </w:t>
+            </w:r>
+            <w:r>
+              <w:rPr>
+                <w:rStyle w:val="VerbatimChar"/>
+              </w:rPr>
+              <w:t xml:space="preserve">de5d0e7</w:t>
+            </w:r>
+            <w:r>
+              <w:t xml:space="preserve">/parent</w:t>
+            </w:r>
+            <w:r>
+              <w:t xml:space="preserve"> </w:t>
+            </w:r>
+            <w:r>
+              <w:rPr>
+                <w:rStyle w:val="VerbatimChar"/>
+              </w:rPr>
+              <w:t xml:space="preserve">f99f35b2</w:t>
+            </w:r>
+            <w:r>
+              <w:t xml:space="preserve"> </w:t>
+            </w:r>
+            <w:r>
+              <w:t xml:space="preserve">(verify</w:t>
+            </w:r>
+            <w:r>
+              <w:t xml:space="preserve"> </w:t>
+            </w:r>
+            <w:r>
+              <w:rPr>
+                <w:rStyle w:val="VerbatimChar"/>
+              </w:rPr>
+              <w:t xml:space="preserve">RejectReason</w:t>
+            </w:r>
+            <w:r>
+              <w:t xml:space="preserve"> </w:t>
+            </w:r>
+            <w:r>
+              <w:t xml:space="preserve">hardcoded</w:t>
+            </w:r>
+            <w:r>
+              <w:t xml:space="preserve"> </w:t>
+            </w:r>
+            <w:r>
+              <w:rPr>
+                <w:rStyle w:val="VerbatimChar"/>
+              </w:rPr>
+              <w:t xml:space="preserve">HASH_MISMATCH</w:t>
+            </w:r>
+            <w:r>
+              <w:t xml:space="preserve"> </w:t>
+            </w:r>
+            <w:r>
+              <w:t xml:space="preserve">masked security-relevant</w:t>
+            </w:r>
+            <w:r>
+              <w:t xml:space="preserve"> </w:t>
+            </w:r>
+            <w:r>
+              <w:rPr>
+                <w:rStyle w:val="VerbatimChar"/>
+              </w:rPr>
+              <w:t xml:space="preserve">SIGNATURE_INVALID</w:t>
+            </w:r>
+            <w:r>
+              <w:t xml:space="preserve"> </w:t>
+            </w:r>
+            <w:r>
+              <w:t xml:space="preserve">+</w:t>
+            </w:r>
+            <w:r>
+              <w:t xml:space="preserve"> </w:t>
+            </w:r>
+            <w:r>
+              <w:rPr>
+                <w:rStyle w:val="VerbatimChar"/>
+              </w:rPr>
+              <w:t xml:space="preserve">download.localPath!!</w:t>
+            </w:r>
+            <w:r>
+              <w:t xml:space="preserve"> </w:t>
+            </w:r>
+            <w:r>
+              <w:t xml:space="preserve">crash → graceful Retry) ·</w:t>
+            </w:r>
+            <w:r>
+              <w:t xml:space="preserve"> </w:t>
+            </w:r>
+            <w:r>
+              <w:rPr>
+                <w:b/>
+                <w:bCs/>
+              </w:rPr>
+              <w:t xml:space="preserve">W11-docs_chain</w:t>
+            </w:r>
+            <w:r>
+              <w:t xml:space="preserve"> </w:t>
+            </w:r>
+            <w:r>
+              <w:rPr>
+                <w:rStyle w:val="VerbatimChar"/>
+              </w:rPr>
+              <w:t xml:space="preserve">9a5bd32</w:t>
+            </w:r>
+            <w:r>
+              <w:t xml:space="preserve">/parent</w:t>
+            </w:r>
+            <w:r>
+              <w:t xml:space="preserve"> </w:t>
+            </w:r>
+            <w:r>
+              <w:rPr>
+                <w:rStyle w:val="VerbatimChar"/>
+              </w:rPr>
+              <w:t xml:space="preserve">1a2109e8</w:t>
+            </w:r>
+            <w:r>
+              <w:t xml:space="preserve"> </w:t>
+            </w:r>
+            <w:r>
+              <w:t xml:space="preserve">(</w:t>
+            </w:r>
+            <w:r>
+              <w:rPr>
+                <w:rStyle w:val="VerbatimChar"/>
+              </w:rPr>
+              <w:t xml:space="preserve">SQLiteAdapter.Read</w:t>
+            </w:r>
+            <w:r>
+              <w:t xml:space="preserve"> </w:t>
+            </w:r>
+            <w:r>
+              <w:t xml:space="preserve">unescaped TAB/NEWLINE → distinct row states hash-collide → change-detection PASS-bluff; now</w:t>
+            </w:r>
+            <w:r>
+              <w:t xml:space="preserve"> </w:t>
+            </w:r>
+            <w:r>
+              <w:rPr>
+                <w:rStyle w:val="VerbatimChar"/>
+              </w:rPr>
+              <w:t xml:space="preserve">escapeDumpField</w:t>
+            </w:r>
+            <w:r>
+              <w:t xml:space="preserve">/</w:t>
+            </w:r>
+            <w:r>
+              <w:rPr>
+                <w:rStyle w:val="VerbatimChar"/>
+              </w:rPr>
+              <w:t xml:space="preserve">nullSentinel</w:t>
+            </w:r>
+            <w:r>
+              <w:t xml:space="preserve">; merged 2 upstream doc commits FF §11.4.113 + pre-existing gofmt cleanup) ·</w:t>
+            </w:r>
+            <w:r>
+              <w:t xml:space="preserve"> </w:t>
+            </w:r>
+            <w:r>
+              <w:rPr>
+                <w:b/>
+                <w:bCs/>
+              </w:rPr>
+              <w:t xml:space="preserve">W10</w:t>
+            </w:r>
+            <w:r>
+              <w:t xml:space="preserve"> </w:t>
+            </w:r>
+            <w:r>
+              <w:t xml:space="preserve">containers</w:t>
+            </w:r>
+            <w:r>
+              <w:t xml:space="preserve"> </w:t>
+            </w:r>
+            <w:r>
+              <w:rPr>
+                <w:rStyle w:val="VerbatimChar"/>
+              </w:rPr>
+              <w:t xml:space="preserve">ab146b4</w:t>
+            </w:r>
+            <w:r>
+              <w:t xml:space="preserve">/parent</w:t>
+            </w:r>
+            <w:r>
+              <w:t xml:space="preserve"> </w:t>
+            </w:r>
+            <w:r>
+              <w:rPr>
+                <w:rStyle w:val="VerbatimChar"/>
+              </w:rPr>
+              <w:t xml:space="preserve">78cd98a5</w:t>
+            </w:r>
+            <w:r>
+              <w:t xml:space="preserve"> </w:t>
+            </w:r>
+            <w:r>
+              <w:t xml:space="preserve">(</w:t>
+            </w:r>
+            <w:r>
+              <w:rPr>
+                <w:rStyle w:val="VerbatimChar"/>
+              </w:rPr>
+              <w:t xml:space="preserve">serviceregistry.Discover</w:t>
+            </w:r>
+            <w:r>
+              <w:t xml:space="preserve"> </w:t>
+            </w:r>
+            <w:r>
+              <w:t xml:space="preserve">fast-path returned the internal</w:t>
+            </w:r>
+            <w:r>
+              <w:t xml:space="preserve"> </w:t>
+            </w:r>
+            <w:r>
+              <w:rPr>
+                <w:rStyle w:val="VerbatimChar"/>
+              </w:rPr>
+              <w:t xml:space="preserve">*Service</w:t>
+            </w:r>
+            <w:r>
+              <w:t xml:space="preserve"> </w:t>
+            </w:r>
+            <w:r>
+              <w:t xml:space="preserve">pointer → registry corruption +</w:t>
+            </w:r>
+            <w:r>
+              <w:t xml:space="preserve"> </w:t>
+            </w:r>
+            <w:r>
+              <w:rPr>
+                <w:rStyle w:val="VerbatimChar"/>
+              </w:rPr>
+              <w:t xml:space="preserve">-race</w:t>
+            </w:r>
+            <w:r>
+              <w:t xml:space="preserve">; now copies under RLock) ·</w:t>
+            </w:r>
+            <w:r>
+              <w:t xml:space="preserve"> </w:t>
+            </w:r>
+            <w:r>
+              <w:rPr>
+                <w:b/>
+                <w:bCs/>
+              </w:rPr>
+              <w:t xml:space="preserve">W9</w:t>
+            </w:r>
+            <w:r>
+              <w:t xml:space="preserve"> </w:t>
+            </w:r>
+            <w:r>
+              <w:t xml:space="preserve">ota-protocol + ota-telemetry-schema audits CLEAN (enumerated coverage §11.4.118). Android Gradle gates ran real (system gradle 8.14.3 +</w:t>
+            </w:r>
+            <w:r>
+              <w:t xml:space="preserve"> </w:t>
+            </w:r>
+            <w:r>
+              <w:rPr>
+                <w:rStyle w:val="VerbatimChar"/>
+              </w:rPr>
+              <w:t xml:space="preserve">ANDROID_HOME</w:t>
+            </w:r>
+            <w:r>
+              <w:t xml:space="preserve">,</w:t>
+            </w:r>
+            <w:r>
+              <w:t xml:space="preserve"> </w:t>
+            </w:r>
+            <w:r>
+              <w:rPr>
+                <w:rStyle w:val="VerbatimChar"/>
+              </w:rPr>
+              <w:t xml:space="preserve">testDebugUnitTest</w:t>
+            </w:r>
+            <w:r>
+              <w:t xml:space="preserve"> </w:t>
+            </w:r>
+            <w:r>
+              <w:t xml:space="preserve">PASS). All parent commits IN SYNC — origin/main ==</w:t>
+            </w:r>
+            <w:r>
+              <w:t xml:space="preserve"> </w:t>
+            </w:r>
+            <w:r>
+              <w:rPr>
+                <w:rStyle w:val="VerbatimChar"/>
+              </w:rPr>
+              <w:t xml:space="preserve">1a2109e8</w:t>
+            </w:r>
+            <w:r>
+              <w:t xml:space="preserve">, every parent push 4/4 FF github+gitlab+gitflic+gitverse.</w:t>
+            </w:r>
+            <w:r>
+              <w:t xml:space="preserve"> </w:t>
+            </w:r>
+            <w:r>
+              <w:rPr>
+                <w:b/>
+                <w:bCs/>
+              </w:rPr>
+              <w:t xml:space="preserve">Prior</w:t>
+            </w:r>
+            <w:r>
+              <w:t xml:space="preserve"> </w:t>
+            </w:r>
+            <w:r>
+              <w:t xml:space="preserve">Wave-8 cont-6 batch — server</w:t>
             </w:r>
             <w:r>
               <w:t xml:space="preserve"> </w:t>

</xml_diff>